<commit_message>
completed: Machine Learning Fundamentals report and project
</commit_message>
<xml_diff>
--- a/Sem1/Introduction to Artificial Intelligence/essay/report.docx
+++ b/Sem1/Introduction to Artificial Intelligence/essay/report.docx
@@ -189,7 +189,6 @@
           <w:u w:val="single"/>
         </w:rPr>
       </w:pPr>
-      <w:proofErr w:type="spellStart"/>
       <w:r>
         <w:rPr>
           <w:b/>
@@ -197,17 +196,7 @@
           <w:szCs w:val="28"/>
           <w:u w:val="single"/>
         </w:rPr>
-        <w:t>Programme</w:t>
-      </w:r>
-      <w:proofErr w:type="spellEnd"/>
-      <w:r>
-        <w:rPr>
-          <w:b/>
-          <w:sz w:val="28"/>
-          <w:szCs w:val="28"/>
-          <w:u w:val="single"/>
-        </w:rPr>
-        <w:t xml:space="preserve"> title:</w:t>
+        <w:t>Programme title:</w:t>
       </w:r>
     </w:p>
     <w:p>
@@ -2222,7 +2211,7 @@
         <w:tabs>
           <w:tab w:val="right" w:leader="dot" w:pos="9016"/>
         </w:tabs>
-        <w:spacing w:before="240" w:line="360" w:lineRule="auto"/>
+        <w:spacing w:line="360" w:lineRule="auto"/>
         <w:rPr>
           <w:rFonts w:asciiTheme="minorHAnsi" w:eastAsiaTheme="minorEastAsia" w:hAnsiTheme="minorHAnsi"/>
           <w:noProof/>
@@ -2249,13 +2238,20 @@
         </w:rPr>
         <w:fldChar w:fldCharType="separate"/>
       </w:r>
-      <w:hyperlink w:anchor="_Toc231210937" w:history="1">
+      <w:hyperlink w:anchor="_Toc231240519" w:history="1">
         <w:r>
           <w:rPr>
             <w:rStyle w:val="Hyperlink"/>
             <w:noProof/>
           </w:rPr>
           <w:t>Table 1: Comparative Summary of Selected AI Models</w:t>
+        </w:r>
+        <w:r>
+          <w:rPr>
+            <w:rStyle w:val="Hyperlink"/>
+            <w:noProof/>
+          </w:rPr>
+          <w:t>.</w:t>
         </w:r>
         <w:r>
           <w:rPr>
@@ -2276,7 +2272,7 @@
             <w:noProof/>
             <w:webHidden/>
           </w:rPr>
-          <w:instrText xml:space="preserve"> PAGEREF _Toc231210937 \h </w:instrText>
+          <w:instrText xml:space="preserve"> PAGEREF _Toc231240519 \h </w:instrText>
         </w:r>
         <w:r>
           <w:rPr>
@@ -2319,13 +2315,13 @@
           <w:noProof/>
         </w:rPr>
       </w:pPr>
-      <w:hyperlink w:anchor="_Toc231210938" w:history="1">
+      <w:hyperlink w:anchor="_Toc231240520" w:history="1">
         <w:r>
           <w:rPr>
             <w:rStyle w:val="Hyperlink"/>
             <w:noProof/>
           </w:rPr>
-          <w:t>Table 2: Recommended Preprocessing Pipeline</w:t>
+          <w:t>Table 2: Recommended Preprocessing Pipeline.</w:t>
         </w:r>
         <w:r>
           <w:rPr>
@@ -2346,7 +2342,7 @@
             <w:noProof/>
             <w:webHidden/>
           </w:rPr>
-          <w:instrText xml:space="preserve"> PAGEREF _Toc231210938 \h </w:instrText>
+          <w:instrText xml:space="preserve"> PAGEREF _Toc231240520 \h </w:instrText>
         </w:r>
         <w:r>
           <w:rPr>
@@ -2385,17 +2381,17 @@
         </w:tabs>
         <w:spacing w:line="360" w:lineRule="auto"/>
         <w:rPr>
-          <w:b/>
-          <w:bCs/>
-        </w:rPr>
-      </w:pPr>
-      <w:hyperlink w:anchor="_Toc231210939" w:history="1">
+          <w:rFonts w:asciiTheme="minorHAnsi" w:eastAsiaTheme="minorEastAsia" w:hAnsiTheme="minorHAnsi"/>
+          <w:noProof/>
+        </w:rPr>
+      </w:pPr>
+      <w:hyperlink w:anchor="_Toc231240521" w:history="1">
         <w:r>
           <w:rPr>
             <w:rStyle w:val="Hyperlink"/>
             <w:noProof/>
           </w:rPr>
-          <w:t>Table 3: Experimental Design Summary</w:t>
+          <w:t>Table 3: Experimental Design Summary.</w:t>
         </w:r>
         <w:r>
           <w:rPr>
@@ -2416,7 +2412,7 @@
             <w:noProof/>
             <w:webHidden/>
           </w:rPr>
-          <w:instrText xml:space="preserve"> PAGEREF _Toc231210939 \h </w:instrText>
+          <w:instrText xml:space="preserve"> PAGEREF _Toc231240521 \h </w:instrText>
         </w:r>
         <w:r>
           <w:rPr>
@@ -2446,24 +2442,26 @@
           <w:fldChar w:fldCharType="end"/>
         </w:r>
       </w:hyperlink>
-      <w:r>
+    </w:p>
+    <w:p>
+      <w:pPr>
+        <w:pStyle w:val="TableofFigures"/>
+        <w:tabs>
+          <w:tab w:val="right" w:leader="dot" w:pos="9016"/>
+        </w:tabs>
+        <w:spacing w:line="360" w:lineRule="auto"/>
         <w:rPr>
           <w:b/>
           <w:bCs/>
         </w:rPr>
+      </w:pPr>
+      <w:r>
+        <w:rPr>
+          <w:b/>
+          <w:bCs/>
+        </w:rPr>
         <w:fldChar w:fldCharType="end"/>
       </w:r>
-    </w:p>
-    <w:p>
-      <w:pPr>
-        <w:spacing w:line="360" w:lineRule="auto"/>
-        <w:jc w:val="center"/>
-        <w:rPr>
-          <w:b/>
-          <w:sz w:val="28"/>
-          <w:szCs w:val="28"/>
-        </w:rPr>
-      </w:pPr>
     </w:p>
     <w:p>
       <w:pPr>
@@ -2666,15 +2664,7 @@
         <w:spacing w:before="240" w:line="360" w:lineRule="auto"/>
       </w:pPr>
       <w:r>
-        <w:t>This essay investigates AI-driven predictive maintenance (</w:t>
-      </w:r>
-      <w:proofErr w:type="spellStart"/>
-      <w:r>
-        <w:t>PdM</w:t>
-      </w:r>
-      <w:proofErr w:type="spellEnd"/>
-      <w:r>
-        <w:t>) for smart manufacturing, focusing on sensor-based fault detection and Remaining Useful Life (RUL) estimation. Drawing on twelve peer-reviewed sources (2021–2025), it evaluates dominant methodologies, benchmark datasets, and key research gaps.</w:t>
+        <w:t>This essay investigates AI-driven predictive maintenance (PdM) for smart manufacturing, focusing on sensor-based fault detection and Remaining Useful Life (RUL) estimation. Drawing on twelve peer-reviewed sources (2021–2025), it evaluates dominant methodologies, benchmark datasets, and key research gaps.</w:t>
       </w:r>
     </w:p>
     <w:p>
@@ -2713,23 +2703,7 @@
         <w:spacing w:before="240" w:line="360" w:lineRule="auto"/>
       </w:pPr>
       <w:r>
-        <w:t>Unplanned equipment downtime imposes significant production and repair costs on industrial manufacturers. Reactive and preventive maintenance strategies are increasingly inadequate in Industry 4.0 environments, where interconnected sensor networks generate continuous streams of vibration, temperature, pressure, and acoustic data. Predictive maintenance (</w:t>
-      </w:r>
-      <w:proofErr w:type="spellStart"/>
-      <w:r>
-        <w:t>PdM</w:t>
-      </w:r>
-      <w:proofErr w:type="spellEnd"/>
-      <w:r>
-        <w:t>) uses AI models to forecast failures before they occur, enabling proactive scheduling and cost reduction (</w:t>
-      </w:r>
-      <w:proofErr w:type="spellStart"/>
-      <w:r>
-        <w:t>Bampoula</w:t>
-      </w:r>
-      <w:proofErr w:type="spellEnd"/>
-      <w:r>
-        <w:t xml:space="preserve"> et al., 2024).</w:t>
+        <w:t>Unplanned equipment downtime imposes significant production and repair costs on industrial manufacturers. Reactive and preventive maintenance strategies are increasingly inadequate in Industry 4.0 environments, where interconnected sensor networks generate continuous streams of vibration, temperature, pressure, and acoustic data. Predictive maintenance (PdM) uses AI models to forecast failures before they occur, enabling proactive scheduling and cost reduction (Bampoula et al., 2024).</w:t>
       </w:r>
     </w:p>
     <w:p>
@@ -2793,49 +2767,7 @@
         <w:rPr>
           <w:rFonts w:cs="Times New Roman"/>
         </w:rPr>
-        <w:t xml:space="preserve">AI-driven </w:t>
-      </w:r>
-      <w:proofErr w:type="spellStart"/>
-      <w:r>
-        <w:rPr>
-          <w:rFonts w:cs="Times New Roman"/>
-        </w:rPr>
-        <w:t>PdM</w:t>
-      </w:r>
-      <w:proofErr w:type="spellEnd"/>
-      <w:r>
-        <w:rPr>
-          <w:rFonts w:cs="Times New Roman"/>
-        </w:rPr>
-        <w:t xml:space="preserve"> research has grown substantially since 2021, </w:t>
-      </w:r>
-      <w:proofErr w:type="spellStart"/>
-      <w:r>
-        <w:rPr>
-          <w:rFonts w:cs="Times New Roman"/>
-        </w:rPr>
-        <w:t>fuelled</w:t>
-      </w:r>
-      <w:proofErr w:type="spellEnd"/>
-      <w:r>
-        <w:rPr>
-          <w:rFonts w:cs="Times New Roman"/>
-        </w:rPr>
-        <w:t xml:space="preserve"> by affordable sensors and maturing deep learning toolchains. This section critically </w:t>
-      </w:r>
-      <w:proofErr w:type="spellStart"/>
-      <w:r>
-        <w:rPr>
-          <w:rFonts w:cs="Times New Roman"/>
-        </w:rPr>
-        <w:t>synthesises</w:t>
-      </w:r>
-      <w:proofErr w:type="spellEnd"/>
-      <w:r>
-        <w:rPr>
-          <w:rFonts w:cs="Times New Roman"/>
-        </w:rPr>
-        <w:t xml:space="preserve"> twelve peer-reviewed sources across methodologies, datasets, and gaps.</w:t>
+        <w:t>AI-driven PdM research has grown substantially since 2021, fuelled by affordable sensors and maturing deep learning toolchains. This section critically synthesises twelve peer-reviewed sources across methodologies, datasets, and gaps.</w:t>
       </w:r>
     </w:p>
     <w:p>
@@ -2874,49 +2806,7 @@
         <w:rPr>
           <w:rFonts w:cs="Times New Roman"/>
         </w:rPr>
-        <w:t xml:space="preserve">Recurrent deep learning dominates recent </w:t>
-      </w:r>
-      <w:proofErr w:type="spellStart"/>
-      <w:r>
-        <w:rPr>
-          <w:rFonts w:cs="Times New Roman"/>
-        </w:rPr>
-        <w:t>PdM</w:t>
-      </w:r>
-      <w:proofErr w:type="spellEnd"/>
-      <w:r>
-        <w:rPr>
-          <w:rFonts w:cs="Times New Roman"/>
-        </w:rPr>
-        <w:t xml:space="preserve"> literature. </w:t>
-      </w:r>
-      <w:proofErr w:type="spellStart"/>
-      <w:r>
-        <w:rPr>
-          <w:rFonts w:cs="Times New Roman"/>
-        </w:rPr>
-        <w:t>Bampoula</w:t>
-      </w:r>
-      <w:proofErr w:type="spellEnd"/>
-      <w:r>
-        <w:rPr>
-          <w:rFonts w:cs="Times New Roman"/>
-        </w:rPr>
-        <w:t xml:space="preserve"> et al. (2024) compare LSTM autoencoders with Transformer encoders on manufacturing time-series data, finding that Transformers better capture long-range temporal dependencies under non-stationary conditions. This extends their 2021 work (</w:t>
-      </w:r>
-      <w:proofErr w:type="spellStart"/>
-      <w:r>
-        <w:rPr>
-          <w:rFonts w:cs="Times New Roman"/>
-        </w:rPr>
-        <w:t>Bampoula</w:t>
-      </w:r>
-      <w:proofErr w:type="spellEnd"/>
-      <w:r>
-        <w:rPr>
-          <w:rFonts w:cs="Times New Roman"/>
-        </w:rPr>
-        <w:t xml:space="preserve"> et al., 2021), which showed LSTM autoencoders detecting anomalies in cyber-physical systems without domain expertise</w:t>
+        <w:t>Recurrent deep learning dominates recent PdM literature. Bampoula et al. (2024) compare LSTM autoencoders with Transformer encoders on manufacturing time-series data, finding that Transformers better capture long-range temporal dependencies under non-stationary conditions. This extends their 2021 work (Bampoula et al., 2021), which showed LSTM autoencoders detecting anomalies in cyber-physical systems without domain expertise</w:t>
       </w:r>
       <w:r>
         <w:rPr>
@@ -2942,21 +2832,7 @@
         <w:rPr>
           <w:rFonts w:cs="Times New Roman"/>
         </w:rPr>
-        <w:t>Temporal Convolutional Networks (TCNs) have gained substantial traction as an alternative. Fatahi et al. (2024) introduce a TCN–Autoencoder with Multi-Head Attention for gas turbine fault detection, outperforming LSTM-Autoencoder and GRU-Autoencoder baselines with MSE 1.447, RMSE 1.193, and MAE 0.712. TCNs use dilated causal convolutions enabling full parallelisation, a scalability advantage over sequential LSTM computation (</w:t>
-      </w:r>
-      <w:proofErr w:type="spellStart"/>
-      <w:r>
-        <w:rPr>
-          <w:rFonts w:cs="Times New Roman"/>
-        </w:rPr>
-        <w:t>Abdelhedi</w:t>
-      </w:r>
-      <w:proofErr w:type="spellEnd"/>
-      <w:r>
-        <w:rPr>
-          <w:rFonts w:cs="Times New Roman"/>
-        </w:rPr>
-        <w:t xml:space="preserve"> and Bouri, 2025).</w:t>
+        <w:t>Temporal Convolutional Networks (TCNs) have gained substantial traction as an alternative. Fatahi et al. (2024) introduce a TCN–Autoencoder with Multi-Head Attention for gas turbine fault detection, outperforming LSTM-Autoencoder and GRU-Autoencoder baselines with MSE 1.447, RMSE 1.193, and MAE 0.712. TCNs use dilated causal convolutions enabling full parallelisation, a scalability advantage over sequential LSTM computation (Abdelhedi and Bouri, 2025).</w:t>
       </w:r>
     </w:p>
     <w:p>
@@ -2970,21 +2846,7 @@
         <w:rPr>
           <w:rFonts w:cs="Times New Roman"/>
         </w:rPr>
-        <w:t xml:space="preserve">Ensemble methods represent a third strand. Rezk et al. (2024) combine Deep Reinforcement Learning (DRL), Random Forest (RF), and Gradient Boosting Machines (GBM), demonstrating that hybrid ensembles reduce false-positive alerts in imbalanced </w:t>
-      </w:r>
-      <w:proofErr w:type="spellStart"/>
-      <w:r>
-        <w:rPr>
-          <w:rFonts w:cs="Times New Roman"/>
-        </w:rPr>
-        <w:t>IIoT</w:t>
-      </w:r>
-      <w:proofErr w:type="spellEnd"/>
-      <w:r>
-        <w:rPr>
-          <w:rFonts w:cs="Times New Roman"/>
-        </w:rPr>
-        <w:t xml:space="preserve"> datasets. Separately, Elsherif et al. (2025) propose a CNN-LSTM hybrid (CAELSTM) achieving RMSE 14.44 and 13.40 on NASA C-MAPSS FD001 and FD003, highlighting how piecewise degradation modelling addresses missing ground-truth labels.</w:t>
+        <w:t>Ensemble methods represent a third strand. Rezk et al. (2024) combine Deep Reinforcement Learning (DRL), Random Forest (RF), and Gradient Boosting Machines (GBM), demonstrating that hybrid ensembles reduce false-positive alerts in imbalanced IIoT datasets. Separately, Elsherif et al. (2025) propose a CNN-LSTM hybrid (CAELSTM) achieving RMSE 14.44 and 13.40 on NASA C-MAPSS FD001 and FD003, highlighting how piecewise degradation modelling addresses missing ground-truth labels.</w:t>
       </w:r>
     </w:p>
     <w:p>
@@ -3041,21 +2903,7 @@
           <w:rFonts w:cs="Times New Roman"/>
         </w:rPr>
         <w:lastRenderedPageBreak/>
-        <w:t xml:space="preserve">data for rolling element bearings under three load conditions. Pandya et al. (2021) achieve over 90% accuracy on PRONOSTIA using an Autoencoder-LSTM, making it the more relevant primary benchmark for the present manufacturing context. </w:t>
-      </w:r>
-      <w:proofErr w:type="spellStart"/>
-      <w:r>
-        <w:rPr>
-          <w:rFonts w:cs="Times New Roman"/>
-        </w:rPr>
-        <w:t>Elkateb</w:t>
-      </w:r>
-      <w:proofErr w:type="spellEnd"/>
-      <w:r>
-        <w:rPr>
-          <w:rFonts w:cs="Times New Roman"/>
-        </w:rPr>
-        <w:t xml:space="preserve"> et al. (2024) caution that both datasets omit the sensor drift, noise, and irregular sampling typical of live production environments.</w:t>
+        <w:t>data for rolling element bearings under three load conditions. Pandya et al. (2021) achieve over 90% accuracy on PRONOSTIA using an Autoencoder-LSTM, making it the more relevant primary benchmark for the present manufacturing context. Elkateb et al. (2024) caution that both datasets omit the sensor drift, noise, and irregular sampling typical of live production environments.</w:t>
       </w:r>
     </w:p>
     <w:p>
@@ -3081,21 +2929,7 @@
         <w:rPr>
           <w:rFonts w:cs="Times New Roman"/>
         </w:rPr>
-        <w:t xml:space="preserve">Three gaps are consistently acknowledged. First, labelled failure data are scarce: machines are engineered not to fail, so run-to-failure records are costly and rare, yielding severely imbalanced datasets (Rezk et al., 2024; </w:t>
-      </w:r>
-      <w:proofErr w:type="spellStart"/>
-      <w:r>
-        <w:rPr>
-          <w:rFonts w:cs="Times New Roman"/>
-        </w:rPr>
-        <w:t>Elkateb</w:t>
-      </w:r>
-      <w:proofErr w:type="spellEnd"/>
-      <w:r>
-        <w:rPr>
-          <w:rFonts w:cs="Times New Roman"/>
-        </w:rPr>
-        <w:t xml:space="preserve"> et al., 2024). Second, cross-machine generalisation is poor</w:t>
+        <w:t>Three gaps are consistently acknowledged. First, labelled failure data are scarce: machines are engineered not to fail, so run-to-failure records are costly and rare, yielding severely imbalanced datasets (Rezk et al., 2024; Elkateb et al., 2024). Second, cross-machine generalisation is poor</w:t>
       </w:r>
       <w:r>
         <w:rPr>
@@ -3107,35 +2941,7 @@
         <w:rPr>
           <w:rFonts w:cs="Times New Roman"/>
         </w:rPr>
-        <w:t>ost models are validated on a single equipment type, and domain transfer (e.g., turbofan-to-pump) remains largely unsolved (</w:t>
-      </w:r>
-      <w:proofErr w:type="spellStart"/>
-      <w:r>
-        <w:rPr>
-          <w:rFonts w:cs="Times New Roman"/>
-        </w:rPr>
-        <w:t>Bampoula</w:t>
-      </w:r>
-      <w:proofErr w:type="spellEnd"/>
-      <w:r>
-        <w:rPr>
-          <w:rFonts w:cs="Times New Roman"/>
-        </w:rPr>
-        <w:t xml:space="preserve"> et al., 2024). Third, real-time edge deployment is under-studied; deep learning models are computationally heavy for embedded micro-controllers (Alotaibi and Aly, 2025; </w:t>
-      </w:r>
-      <w:proofErr w:type="spellStart"/>
-      <w:r>
-        <w:rPr>
-          <w:rFonts w:cs="Times New Roman"/>
-        </w:rPr>
-        <w:t>Aboshosha</w:t>
-      </w:r>
-      <w:proofErr w:type="spellEnd"/>
-      <w:r>
-        <w:rPr>
-          <w:rFonts w:cs="Times New Roman"/>
-        </w:rPr>
-        <w:t xml:space="preserve"> et al., 2023). This essay addresses gaps one and three through model choice and the deployment analysis in Section 6.</w:t>
+        <w:t>ost models are validated on a single equipment type, and domain transfer (e.g., turbofan-to-pump) remains largely unsolved (Bampoula et al., 2024). Third, real-time edge deployment is under-studied; deep learning models are computationally heavy for embedded micro-controllers (Alotaibi and Aly, 2025; Aboshosha et al., 2023). This essay addresses gaps one and three through model choice and the deployment analysis in Section 6.</w:t>
       </w:r>
     </w:p>
     <w:p>
@@ -3233,21 +3039,7 @@
         <w:rPr>
           <w:rFonts w:cs="Times New Roman"/>
         </w:rPr>
-        <w:t>LSTMs are a specialised RNN class that overcome the vanishing gradient problem via input, forget, and output gates, controlling information flow across time steps (</w:t>
-      </w:r>
-      <w:proofErr w:type="spellStart"/>
-      <w:r>
-        <w:rPr>
-          <w:rFonts w:cs="Times New Roman"/>
-        </w:rPr>
-        <w:t>Bampoula</w:t>
-      </w:r>
-      <w:proofErr w:type="spellEnd"/>
-      <w:r>
-        <w:rPr>
-          <w:rFonts w:cs="Times New Roman"/>
-        </w:rPr>
-        <w:t xml:space="preserve"> et al., 2021). This makes them well-suited to sequential sensor data where temporal ordering carries diagnostic value</w:t>
+        <w:t>LSTMs are a specialised RNN class that overcome the vanishing gradient problem via input, forget, and output gates, controlling information flow across time steps (Bampoula et al., 2021). This makes them well-suited to sequential sensor data where temporal ordering carries diagnostic value</w:t>
       </w:r>
       <w:r>
         <w:rPr>
@@ -3259,35 +3051,7 @@
         <w:rPr>
           <w:rFonts w:cs="Times New Roman"/>
         </w:rPr>
-        <w:t xml:space="preserve">such as a rising vibration trend preceding bearing failure. Elsherif et al. (2025) and Pandya et al. (2021) confirm strong LSTM performance on C-MAPSS and PRONOSTIA respectively, establishing it as the most validated </w:t>
-      </w:r>
-      <w:proofErr w:type="spellStart"/>
-      <w:r>
-        <w:rPr>
-          <w:rFonts w:cs="Times New Roman"/>
-        </w:rPr>
-        <w:t>PdM</w:t>
-      </w:r>
-      <w:proofErr w:type="spellEnd"/>
-      <w:r>
-        <w:rPr>
-          <w:rFonts w:cs="Times New Roman"/>
-        </w:rPr>
-        <w:t xml:space="preserve"> baseline. Its key limitation is sequential computation: inference latency and training cost scale </w:t>
-      </w:r>
-      <w:proofErr w:type="spellStart"/>
-      <w:r>
-        <w:rPr>
-          <w:rFonts w:cs="Times New Roman"/>
-        </w:rPr>
-        <w:t>unfavourably</w:t>
-      </w:r>
-      <w:proofErr w:type="spellEnd"/>
-      <w:r>
-        <w:rPr>
-          <w:rFonts w:cs="Times New Roman"/>
-        </w:rPr>
-        <w:t xml:space="preserve"> with window length, and internal gating states offer no intuitive mapping to physical fault mechanisms.</w:t>
+        <w:t>such as a rising vibration trend preceding bearing failure. Elsherif et al. (2025) and Pandya et al. (2021) confirm strong LSTM performance on C-MAPSS and PRONOSTIA respectively, establishing it as the most validated PdM baseline. Its key limitation is sequential computation: inference latency and training cost scale unfavourably with window length, and internal gating states offer no intuitive mapping to physical fault mechanisms.</w:t>
       </w:r>
     </w:p>
     <w:p>
@@ -3313,28 +3077,14 @@
         <w:rPr>
           <w:rFonts w:cs="Times New Roman"/>
         </w:rPr>
-        <w:t xml:space="preserve">TCNs replace recurrence with dilated causal convolutions at exponentially increasing dilation rates, capturing long-range dependencies while processing all time steps in parallel (Fatahi et al., 2024). Fatahi et al. (2024) and </w:t>
-      </w:r>
-      <w:proofErr w:type="spellStart"/>
-      <w:r>
-        <w:rPr>
-          <w:rFonts w:cs="Times New Roman"/>
-        </w:rPr>
-        <w:t>Abdelhedi</w:t>
-      </w:r>
-      <w:proofErr w:type="spellEnd"/>
-      <w:r>
-        <w:rPr>
-          <w:rFonts w:cs="Times New Roman"/>
-        </w:rPr>
-        <w:t xml:space="preserve"> and Bouri (2025) demonstrate superior or competitive accuracy versus LSTM variants, with the added benefits of faster training and CNN-native hardware acceleration on edge devices. The principal limitation is a bounded receptive field: capturing very long degradation horizons requires many convolutional layers, increasing memory usage. TCN tooling is also less mature than LSTM across major frameworks.</w:t>
+        <w:t>TCNs replace recurrence with dilated causal convolutions at exponentially increasing dilation rates, capturing long-range dependencies while processing all time steps in parallel (Fatahi et al., 2024). Fatahi et al. (2024) and Abdelhedi and Bouri (2025) demonstrate superior or competitive accuracy versus LSTM variants, with the added benefits of faster training and CNN-native hardware acceleration on edge devices. The principal limitation is a bounded receptive field: capturing very long degradation horizons requires many convolutional layers, increasing memory usage. TCN tooling is also less mature than LSTM across major frameworks.</w:t>
       </w:r>
     </w:p>
     <w:p>
       <w:pPr>
         <w:pStyle w:val="Caption"/>
       </w:pPr>
-      <w:bookmarkStart w:id="16" w:name="_Toc231210937"/>
+      <w:bookmarkStart w:id="16" w:name="_Toc231240519"/>
       <w:r>
         <w:t xml:space="preserve">Table </w:t>
       </w:r>
@@ -3350,6 +3100,9 @@
         <w:t>: Comparative Summary of Selected AI Models</w:t>
       </w:r>
       <w:bookmarkEnd w:id="16"/>
+      <w:r>
+        <w:t>.</w:t>
+      </w:r>
     </w:p>
     <w:tbl>
       <w:tblPr>
@@ -3799,21 +3552,7 @@
               <w:rPr>
                 <w:rFonts w:cs="Times New Roman"/>
               </w:rPr>
-              <w:t>Faster (</w:t>
-            </w:r>
-            <w:proofErr w:type="spellStart"/>
-            <w:r>
-              <w:rPr>
-                <w:rFonts w:cs="Times New Roman"/>
-              </w:rPr>
-              <w:t>parallelised</w:t>
-            </w:r>
-            <w:proofErr w:type="spellEnd"/>
-            <w:r>
-              <w:rPr>
-                <w:rFonts w:cs="Times New Roman"/>
-              </w:rPr>
-              <w:t>)</w:t>
+              <w:t>Faster (parallelised)</w:t>
             </w:r>
           </w:p>
         </w:tc>
@@ -4189,21 +3928,7 @@
         <w:rPr>
           <w:rFonts w:cs="Times New Roman"/>
         </w:rPr>
-        <w:t>Each machine class requires multivariate sensor streams: vibration (vertical and horizontal accelerometers), temperature, pressure (piezoelectric), and acoustic emission. Vibration sampling must reach at least 10–25.6 kHz to resolve bearing fault frequencies (</w:t>
-      </w:r>
-      <w:proofErr w:type="spellStart"/>
-      <w:r>
-        <w:rPr>
-          <w:rFonts w:cs="Times New Roman"/>
-        </w:rPr>
-        <w:t>Elkateb</w:t>
-      </w:r>
-      <w:proofErr w:type="spellEnd"/>
-      <w:r>
-        <w:rPr>
-          <w:rFonts w:cs="Times New Roman"/>
-        </w:rPr>
-        <w:t xml:space="preserve"> et al., 2024). Metadata including machine ID, load/speed settings, and maintenance logs are needed for supervised labelling. Where run-to-failure data are unavailable, PRONOSTIA and C-MAPSS serve as validated surrogates.</w:t>
+        <w:t>Each machine class requires multivariate sensor streams: vibration (vertical and horizontal accelerometers), temperature, pressure (piezoelectric), and acoustic emission. Vibration sampling must reach at least 10–25.6 kHz to resolve bearing fault frequencies (Elkateb et al., 2024). Metadata including machine ID, load/speed settings, and maintenance logs are needed for supervised labelling. Where run-to-failure data are unavailable, PRONOSTIA and C-MAPSS serve as validated surrogates.</w:t>
       </w:r>
     </w:p>
     <w:p>
@@ -4229,21 +3954,7 @@
         <w:rPr>
           <w:rFonts w:cs="Times New Roman"/>
         </w:rPr>
-        <w:t xml:space="preserve">Healthy observations vastly outnumber failure precursors in industrial streams, causing standard cross-entropy loss to default to the majority class. </w:t>
-      </w:r>
-      <w:proofErr w:type="spellStart"/>
-      <w:r>
-        <w:rPr>
-          <w:rFonts w:cs="Times New Roman"/>
-        </w:rPr>
-        <w:t>Elkateb</w:t>
-      </w:r>
-      <w:proofErr w:type="spellEnd"/>
-      <w:r>
-        <w:rPr>
-          <w:rFonts w:cs="Times New Roman"/>
-        </w:rPr>
-        <w:t xml:space="preserve"> et al. (2024) apply Borderline-SMOTE to synthesise minority-class samples in feature space. Cost-sensitive learning and Balanced Random Forests offer complementary strategies by penalising misclassification of the minority class or resampling mini-batches at training time (Rezk et al., 2024).</w:t>
+        <w:t>Healthy observations vastly outnumber failure precursors in industrial streams, causing standard cross-entropy loss to default to the majority class. Elkateb et al. (2024) apply Borderline-SMOTE to synthesise minority-class samples in feature space. Cost-sensitive learning and Balanced Random Forests offer complementary strategies by penalising misclassification of the minority class or resampling mini-batches at training time (Rezk et al., 2024).</w:t>
       </w:r>
     </w:p>
     <w:p>
@@ -4326,7 +4037,7 @@
       <w:pPr>
         <w:pStyle w:val="Caption"/>
       </w:pPr>
-      <w:bookmarkStart w:id="27" w:name="_Toc231210938"/>
+      <w:bookmarkStart w:id="27" w:name="_Toc231240520"/>
       <w:r>
         <w:lastRenderedPageBreak/>
         <w:t xml:space="preserve">Table </w:t>
@@ -4338,6 +4049,9 @@
       </w:fldSimple>
       <w:r>
         <w:t>: Recommended Preprocessing Pipeline</w:t>
+      </w:r>
+      <w:r>
+        <w:t>.</w:t>
       </w:r>
       <w:bookmarkEnd w:id="27"/>
     </w:p>
@@ -5377,7 +5091,7 @@
       <w:pPr>
         <w:pStyle w:val="Caption"/>
       </w:pPr>
-      <w:bookmarkStart w:id="36" w:name="_Toc231210939"/>
+      <w:bookmarkStart w:id="36" w:name="_Toc231240521"/>
       <w:r>
         <w:t xml:space="preserve">Table </w:t>
       </w:r>
@@ -5388,6 +5102,9 @@
       </w:fldSimple>
       <w:r>
         <w:t>: Experimental Design Summary</w:t>
+      </w:r>
+      <w:r>
+        <w:t>.</w:t>
       </w:r>
       <w:bookmarkEnd w:id="36"/>
     </w:p>
@@ -6334,35 +6051,7 @@
         <w:rPr>
           <w:rFonts w:cs="Times New Roman"/>
         </w:rPr>
-        <w:t>Post-hoc tools partially close this gap. SHAP (</w:t>
-      </w:r>
-      <w:proofErr w:type="spellStart"/>
-      <w:r>
-        <w:rPr>
-          <w:rFonts w:cs="Times New Roman"/>
-        </w:rPr>
-        <w:t>SHapley</w:t>
-      </w:r>
-      <w:proofErr w:type="spellEnd"/>
-      <w:r>
-        <w:rPr>
-          <w:rFonts w:cs="Times New Roman"/>
-        </w:rPr>
-        <w:t xml:space="preserve"> Additive </w:t>
-      </w:r>
-      <w:proofErr w:type="spellStart"/>
-      <w:r>
-        <w:rPr>
-          <w:rFonts w:cs="Times New Roman"/>
-        </w:rPr>
-        <w:t>exPlanations</w:t>
-      </w:r>
-      <w:proofErr w:type="spellEnd"/>
-      <w:r>
-        <w:rPr>
-          <w:rFonts w:cs="Times New Roman"/>
-        </w:rPr>
-        <w:t>) attributes each model prediction to individual input features. Alotaibi and Aly (2025) show that SHAP-explained transformer-boosting outputs allow operators to trace anomaly alerts to specific sensor channels. LIME fits locally linear surrogates around individual predictions as an alternative. Both methods apply to LSTM and TCN models, though their approximations may not fully reflect true model reasoning</w:t>
+        <w:t>Post-hoc tools partially close this gap. SHAP (SHapley Additive exPlanations) attributes each model prediction to individual input features. Alotaibi and Aly (2025) show that SHAP-explained transformer-boosting outputs allow operators to trace anomaly alerts to specific sensor channels. LIME fits locally linear surrogates around individual predictions as an alternative. Both methods apply to LSTM and TCN models, though their approximations may not fully reflect true model reasoning</w:t>
       </w:r>
       <w:r>
         <w:rPr>
@@ -6451,21 +6140,7 @@
           <w:rFonts w:cs="Times New Roman"/>
         </w:rPr>
         <w:lastRenderedPageBreak/>
-        <w:t xml:space="preserve">Live deployment requires sub-100ms inference latency for real-time pump and motor anomaly detection. TCN models export cleanly to ONNX and run efficiently on edge accelerators (NVIDIA Jetson, Intel </w:t>
-      </w:r>
-      <w:proofErr w:type="spellStart"/>
-      <w:r>
-        <w:rPr>
-          <w:rFonts w:cs="Times New Roman"/>
-        </w:rPr>
-        <w:t>Movidius</w:t>
-      </w:r>
-      <w:proofErr w:type="spellEnd"/>
-      <w:r>
-        <w:rPr>
-          <w:rFonts w:cs="Times New Roman"/>
-        </w:rPr>
-        <w:t>), whereas LSTM’s stateful computation complicates on-device execution and typically requires INT8 quantisation at the cost of minor accuracy loss (Sai and Madhavi, 2024). SCADA and MES systems were not designed for probabilistic AI outputs; middleware translating predictions into maintenance work orders</w:t>
+        <w:t>Live deployment requires sub-100ms inference latency for real-time pump and motor anomaly detection. TCN models export cleanly to ONNX and run efficiently on edge accelerators (NVIDIA Jetson, Intel Movidius), whereas LSTM’s stateful computation complicates on-device execution and typically requires INT8 quantisation at the cost of minor accuracy loss (Sai and Madhavi, 2024). SCADA and MES systems were not designed for probabilistic AI outputs; middleware translating predictions into maintenance work orders</w:t>
       </w:r>
       <w:r>
         <w:rPr>
@@ -6489,21 +6164,7 @@
         <w:rPr>
           <w:rFonts w:cs="Times New Roman"/>
         </w:rPr>
-        <w:t xml:space="preserve">must be custom-built and validated per vendor. Model drift, arising from sensor calibration changes, machine refurbishments, or load shifts, demands a ground-truth feedback loop logging actual failures against predictions. </w:t>
-      </w:r>
-      <w:proofErr w:type="spellStart"/>
-      <w:r>
-        <w:rPr>
-          <w:rFonts w:cs="Times New Roman"/>
-        </w:rPr>
-        <w:t>Kullback</w:t>
-      </w:r>
-      <w:proofErr w:type="spellEnd"/>
-      <w:r>
-        <w:rPr>
-          <w:rFonts w:cs="Times New Roman"/>
-        </w:rPr>
-        <w:t>–Leibler divergence can serve as an unsupervised drift detector; incremental fine-tuning on recent data preserves historical representations and mitigates catastrophic forgetting (Sai and Madhavi, 2024).</w:t>
+        <w:t>must be custom-built and validated per vendor. Model drift, arising from sensor calibration changes, machine refurbishments, or load shifts, demands a ground-truth feedback loop logging actual failures against predictions. Kullback–Leibler divergence can serve as an unsupervised drift detector; incremental fine-tuning on recent data preserves historical representations and mitigates catastrophic forgetting (Sai and Madhavi, 2024).</w:t>
       </w:r>
     </w:p>
     <w:p>
@@ -6544,21 +6205,7 @@
         <w:rPr>
           <w:rFonts w:cs="Times New Roman"/>
         </w:rPr>
-        <w:t xml:space="preserve">This essay has critically examined AI-based </w:t>
-      </w:r>
-      <w:proofErr w:type="spellStart"/>
-      <w:r>
-        <w:rPr>
-          <w:rFonts w:cs="Times New Roman"/>
-        </w:rPr>
-        <w:t>PdM</w:t>
-      </w:r>
-      <w:proofErr w:type="spellEnd"/>
-      <w:r>
-        <w:rPr>
-          <w:rFonts w:cs="Times New Roman"/>
-        </w:rPr>
-        <w:t xml:space="preserve"> for smart manufacturing, synthesising twelve sources from 2021–2025. Deep learning</w:t>
+        <w:t>This essay has critically examined AI-based PdM for smart manufacturing, synthesising twelve sources from 2021–2025. Deep learning</w:t>
       </w:r>
       <w:r>
         <w:rPr>
@@ -6596,21 +6243,7 @@
         <w:rPr>
           <w:rFonts w:cs="Times New Roman"/>
         </w:rPr>
-        <w:t xml:space="preserve">LSTM and TCN were selected and justified for the case study context. LSTM provides a well-validated baseline; TCN offers parallelism and edge-friendliness. The proposed experimental design employs walk-forward cross-validation, LOMO evaluation, and a multi-metric framework spanning both classification and regression. Critical analysis shows that interpretability is a shared limitation, partially addressed by SHAP and LIME; scalability </w:t>
-      </w:r>
-      <w:proofErr w:type="spellStart"/>
-      <w:r>
-        <w:rPr>
-          <w:rFonts w:cs="Times New Roman"/>
-        </w:rPr>
-        <w:t>favours</w:t>
-      </w:r>
-      <w:proofErr w:type="spellEnd"/>
-      <w:r>
-        <w:rPr>
-          <w:rFonts w:cs="Times New Roman"/>
-        </w:rPr>
-        <w:t xml:space="preserve"> TCNs; and deployment demands edge-cloud trade-off decisions, SCADA integration, and drift monitoring. A hybrid TCN–tree-based architecture represents the most pragmatic industrial solution. Future work should pursue domain adaptation for cross-machine transfer and federated learning for privacy-preserving multi-site deployment.</w:t>
+        <w:t>LSTM and TCN were selected and justified for the case study context. LSTM provides a well-validated baseline; TCN offers parallelism and edge-friendliness. The proposed experimental design employs walk-forward cross-validation, LOMO evaluation, and a multi-metric framework spanning both classification and regression. Critical analysis shows that interpretability is a shared limitation, partially addressed by SHAP and LIME; scalability favours TCNs; and deployment demands edge-cloud trade-off decisions, SCADA integration, and drift monitoring. A hybrid TCN–tree-based architecture represents the most pragmatic industrial solution. Future work should pursue domain adaptation for cross-machine transfer and federated learning for privacy-preserving multi-site deployment.</w:t>
       </w:r>
     </w:p>
     <w:p>
@@ -6647,19 +6280,11 @@
           <w:rFonts w:cs="Times New Roman"/>
         </w:rPr>
       </w:pPr>
-      <w:proofErr w:type="spellStart"/>
-      <w:r>
-        <w:rPr>
-          <w:rFonts w:cs="Times New Roman"/>
-        </w:rPr>
-        <w:t>Aboshosha</w:t>
-      </w:r>
-      <w:proofErr w:type="spellEnd"/>
-      <w:r>
-        <w:rPr>
-          <w:rFonts w:cs="Times New Roman"/>
-        </w:rPr>
-        <w:t xml:space="preserve">, A., Haggag, A., George, N., Alotaibi, F., Amin, M. and Hamed, A. (2023) IoT-based data-driven predictive maintenance relying on fuzzy system and artificial neural networks. Scientific Reports, 13, 12186. Available at: </w:t>
+      <w:r>
+        <w:rPr>
+          <w:rFonts w:cs="Times New Roman"/>
+        </w:rPr>
+        <w:t xml:space="preserve">Aboshosha, A., Haggag, A., George, N., Alotaibi, F., Amin, M. and Hamed, A. (2023) IoT-based data-driven predictive maintenance relying on fuzzy system and artificial neural networks. Scientific Reports, 13, 12186. Available at: </w:t>
       </w:r>
       <w:hyperlink r:id="rId11" w:history="1">
         <w:r>
@@ -6729,21 +6354,7 @@
         <w:rPr>
           <w:rFonts w:cs="Times New Roman"/>
         </w:rPr>
-        <w:t xml:space="preserve">Alotaibi, N.M. and Aly, M. (2025) SHAP enhanced transformer GWO boosting model for transparent and robust anomaly detection in </w:t>
-      </w:r>
-      <w:proofErr w:type="spellStart"/>
-      <w:r>
-        <w:rPr>
-          <w:rFonts w:cs="Times New Roman"/>
-        </w:rPr>
-        <w:t>IIoT</w:t>
-      </w:r>
-      <w:proofErr w:type="spellEnd"/>
-      <w:r>
-        <w:rPr>
-          <w:rFonts w:cs="Times New Roman"/>
-        </w:rPr>
-        <w:t xml:space="preserve"> environments. Scientific Reports. Available at: </w:t>
+        <w:t xml:space="preserve">Alotaibi, N.M. and Aly, M. (2025) SHAP enhanced transformer GWO boosting model for transparent and robust anomaly detection in IIoT environments. Scientific Reports. Available at: </w:t>
       </w:r>
       <w:hyperlink r:id="rId13" w:history="1">
         <w:r>
@@ -6774,19 +6385,11 @@
           <w:rFonts w:cs="Times New Roman"/>
         </w:rPr>
       </w:pPr>
-      <w:proofErr w:type="spellStart"/>
-      <w:r>
-        <w:rPr>
-          <w:rFonts w:cs="Times New Roman"/>
-        </w:rPr>
-        <w:t>Bampoula</w:t>
-      </w:r>
-      <w:proofErr w:type="spellEnd"/>
-      <w:r>
-        <w:rPr>
-          <w:rFonts w:cs="Times New Roman"/>
-        </w:rPr>
-        <w:t xml:space="preserve">, X., Nikolakis, N. and Alexopoulos, K. (2024) Condition monitoring and predictive maintenance of assets in manufacturing using LSTM-autoencoders and transformer encoders. Sensors, 24(10), 3215. Available at: </w:t>
+      <w:r>
+        <w:rPr>
+          <w:rFonts w:cs="Times New Roman"/>
+        </w:rPr>
+        <w:t xml:space="preserve">Bampoula, X., Nikolakis, N. and Alexopoulos, K. (2024) Condition monitoring and predictive maintenance of assets in manufacturing using LSTM-autoencoders and transformer encoders. Sensors, 24(10), 3215. Available at: </w:t>
       </w:r>
       <w:hyperlink r:id="rId14" w:history="1">
         <w:r>
@@ -6817,19 +6420,11 @@
           <w:rFonts w:cs="Times New Roman"/>
         </w:rPr>
       </w:pPr>
-      <w:proofErr w:type="spellStart"/>
-      <w:r>
-        <w:rPr>
-          <w:rFonts w:cs="Times New Roman"/>
-        </w:rPr>
-        <w:t>Bampoula</w:t>
-      </w:r>
-      <w:proofErr w:type="spellEnd"/>
-      <w:r>
-        <w:rPr>
-          <w:rFonts w:cs="Times New Roman"/>
-        </w:rPr>
-        <w:t xml:space="preserve">, X., Siaterlis, G., Nikolakis, N. and Alexopoulos, K. (2021) A deep learning model for predictive maintenance in cyber-physical production systems using LSTM autoencoders. Sensors, 21(3), 972. Available at: </w:t>
+      <w:r>
+        <w:rPr>
+          <w:rFonts w:cs="Times New Roman"/>
+        </w:rPr>
+        <w:t xml:space="preserve">Bampoula, X., Siaterlis, G., Nikolakis, N. and Alexopoulos, K. (2021) A deep learning model for predictive maintenance in cyber-physical production systems using LSTM autoencoders. Sensors, 21(3), 972. Available at: </w:t>
       </w:r>
       <w:hyperlink r:id="rId15" w:history="1">
         <w:r>
@@ -6860,47 +6455,11 @@
           <w:rFonts w:cs="Times New Roman"/>
         </w:rPr>
       </w:pPr>
-      <w:proofErr w:type="spellStart"/>
-      <w:r>
-        <w:rPr>
-          <w:rFonts w:cs="Times New Roman"/>
-        </w:rPr>
-        <w:t>Elkateb</w:t>
-      </w:r>
-      <w:proofErr w:type="spellEnd"/>
-      <w:r>
-        <w:rPr>
-          <w:rFonts w:cs="Times New Roman"/>
-        </w:rPr>
-        <w:t xml:space="preserve">, S., </w:t>
-      </w:r>
-      <w:proofErr w:type="spellStart"/>
-      <w:r>
-        <w:rPr>
-          <w:rFonts w:cs="Times New Roman"/>
-        </w:rPr>
-        <w:t>Métwalli</w:t>
-      </w:r>
-      <w:proofErr w:type="spellEnd"/>
-      <w:r>
-        <w:rPr>
-          <w:rFonts w:cs="Times New Roman"/>
-        </w:rPr>
-        <w:t xml:space="preserve">, A., </w:t>
-      </w:r>
-      <w:proofErr w:type="spellStart"/>
-      <w:r>
-        <w:rPr>
-          <w:rFonts w:cs="Times New Roman"/>
-        </w:rPr>
-        <w:t>Shendy</w:t>
-      </w:r>
-      <w:proofErr w:type="spellEnd"/>
-      <w:r>
-        <w:rPr>
-          <w:rFonts w:cs="Times New Roman"/>
-        </w:rPr>
-        <w:t xml:space="preserve">, A. and Abu-Elanien, A.E.B. (2024) Machine learning and IoT-based predictive maintenance approach for industrial applications. Alexandria Engineering Journal, 88, pp.298–309. Available at: </w:t>
+      <w:r>
+        <w:rPr>
+          <w:rFonts w:cs="Times New Roman"/>
+        </w:rPr>
+        <w:t xml:space="preserve">Elkateb, S., Métwalli, A., Shendy, A. and Abu-Elanien, A.E.B. (2024) Machine learning and IoT-based predictive maintenance approach for industrial applications. Alexandria Engineering Journal, 88, pp.298–309. Available at: </w:t>
       </w:r>
       <w:hyperlink r:id="rId16" w:history="1">
         <w:r>
@@ -6970,21 +6529,7 @@
         <w:rPr>
           <w:rFonts w:cs="Times New Roman"/>
         </w:rPr>
-        <w:t xml:space="preserve">Fatahi, A.T.W.K., </w:t>
-      </w:r>
-      <w:proofErr w:type="spellStart"/>
-      <w:r>
-        <w:rPr>
-          <w:rFonts w:cs="Times New Roman"/>
-        </w:rPr>
-        <w:t>Kashyzadeh</w:t>
-      </w:r>
-      <w:proofErr w:type="spellEnd"/>
-      <w:r>
-        <w:rPr>
-          <w:rFonts w:cs="Times New Roman"/>
-        </w:rPr>
-        <w:t>, K.R. and Ghorbani, S. (2024) Advancements in gas turbine fault detection: a machine learning approach based on the temporal convolutional network–</w:t>
+        <w:t>Fatahi, A.T.W.K., Kashyzadeh, K.R. and Ghorbani, S. (2024) Advancements in gas turbine fault detection: a machine learning approach based on the temporal convolutional network–</w:t>
       </w:r>
       <w:r>
         <w:rPr>
@@ -7032,21 +6577,7 @@
         <w:rPr>
           <w:rFonts w:cs="Times New Roman"/>
         </w:rPr>
-        <w:t xml:space="preserve">Pandya, D., Upadhyay, S.H. and Harsha, S.P. (2021) Deep learning-based anomaly-onset aware remaining useful life estimation of bearings. </w:t>
-      </w:r>
-      <w:proofErr w:type="spellStart"/>
-      <w:r>
-        <w:rPr>
-          <w:rFonts w:cs="Times New Roman"/>
-        </w:rPr>
-        <w:t>PeerJ</w:t>
-      </w:r>
-      <w:proofErr w:type="spellEnd"/>
-      <w:r>
-        <w:rPr>
-          <w:rFonts w:cs="Times New Roman"/>
-        </w:rPr>
-        <w:t xml:space="preserve"> Computer Science, 7, e782. Available at: </w:t>
+        <w:t xml:space="preserve">Pandya, D., Upadhyay, S.H. and Harsha, S.P. (2021) Deep learning-based anomaly-onset aware remaining useful life estimation of bearings. PeerJ Computer Science, 7, e782. Available at: </w:t>
       </w:r>
       <w:hyperlink r:id="rId19" w:history="1">
         <w:r>
@@ -7081,21 +6612,7 @@
         <w:rPr>
           <w:rFonts w:cs="Times New Roman"/>
         </w:rPr>
-        <w:t xml:space="preserve">Rezk, H., </w:t>
-      </w:r>
-      <w:proofErr w:type="spellStart"/>
-      <w:r>
-        <w:rPr>
-          <w:rFonts w:cs="Times New Roman"/>
-        </w:rPr>
-        <w:t>Osheba</w:t>
-      </w:r>
-      <w:proofErr w:type="spellEnd"/>
-      <w:r>
-        <w:rPr>
-          <w:rFonts w:cs="Times New Roman"/>
-        </w:rPr>
-        <w:t xml:space="preserve">, I.H.M. and Abdelkader, M. (2024) Optimised predictive maintenance for streaming data in industrial IoT networks using deep reinforcement learning and ensemble techniques. Scientific Reports, 14, 17492. Available at: </w:t>
+        <w:t xml:space="preserve">Rezk, H., Osheba, I.H.M. and Abdelkader, M. (2024) Optimised predictive maintenance for streaming data in industrial IoT networks using deep reinforcement learning and ensemble techniques. Scientific Reports, 14, 17492. Available at: </w:t>
       </w:r>
       <w:hyperlink r:id="rId20" w:history="1">
         <w:r>
@@ -7171,21 +6688,7 @@
         <w:rPr>
           <w:rFonts w:cs="Times New Roman"/>
         </w:rPr>
-        <w:t xml:space="preserve">Sharma, K. (2024) Uncertainty-aware deep learning framework for remaining useful life prediction in turbofan engines with learned aleatoric uncertainty. </w:t>
-      </w:r>
-      <w:proofErr w:type="spellStart"/>
-      <w:r>
-        <w:rPr>
-          <w:rFonts w:cs="Times New Roman"/>
-        </w:rPr>
-        <w:t>arXiv</w:t>
-      </w:r>
-      <w:proofErr w:type="spellEnd"/>
-      <w:r>
-        <w:rPr>
-          <w:rFonts w:cs="Times New Roman"/>
-        </w:rPr>
-        <w:t xml:space="preserve"> preprint arXiv:2511.19124. Available at: </w:t>
+        <w:t xml:space="preserve">Sharma, K. (2024) Uncertainty-aware deep learning framework for remaining useful life prediction in turbofan engines with learned aleatoric uncertainty. arXiv preprint arXiv:2511.19124. Available at: </w:t>
       </w:r>
       <w:hyperlink r:id="rId22" w:history="1">
         <w:r>

</xml_diff>

<commit_message>
chore: add word limit notes for essays and project assignments
</commit_message>
<xml_diff>
--- a/Sem1/Introduction to Artificial Intelligence/essay/report.docx
+++ b/Sem1/Introduction to Artificial Intelligence/essay/report.docx
@@ -2718,9 +2718,8 @@
     <w:p>
       <w:pPr>
         <w:pStyle w:val="Heading1"/>
-        <w:spacing w:before="240"/>
-        <w:rPr>
-          <w:rFonts w:eastAsiaTheme="minorHAnsi" w:cs="Times New Roman"/>
+        <w:rPr>
+          <w:rFonts w:eastAsiaTheme="minorHAnsi"/>
         </w:rPr>
       </w:pPr>
       <w:r>
@@ -2729,28 +2728,25 @@
       <w:bookmarkStart w:id="2" w:name="_Toc231210624"/>
       <w:r>
         <w:rPr>
-          <w:rFonts w:eastAsiaTheme="minorHAnsi" w:cs="Times New Roman"/>
+          <w:rFonts w:eastAsiaTheme="minorHAnsi"/>
         </w:rPr>
         <w:lastRenderedPageBreak/>
         <w:t>2.</w:t>
       </w:r>
       <w:r>
         <w:rPr>
-          <w:rFonts w:eastAsiaTheme="minorHAnsi" w:cs="Times New Roman"/>
+          <w:rFonts w:eastAsiaTheme="minorHAnsi"/>
         </w:rPr>
         <w:t xml:space="preserve"> </w:t>
       </w:r>
       <w:bookmarkStart w:id="3" w:name="_Toc231156489"/>
       <w:r>
         <w:rPr>
-          <w:rFonts w:eastAsiaTheme="minorHAnsi" w:cs="Times New Roman"/>
+          <w:rFonts w:eastAsiaTheme="minorHAnsi"/>
         </w:rPr>
         <w:t xml:space="preserve"> </w:t>
       </w:r>
       <w:r>
-        <w:rPr>
-          <w:rFonts w:cs="Times New Roman"/>
-        </w:rPr>
         <w:t>Literature Review (2021–2025)</w:t>
       </w:r>
       <w:bookmarkEnd w:id="2"/>
@@ -2806,19 +2802,13 @@
         <w:rPr>
           <w:rFonts w:cs="Times New Roman"/>
         </w:rPr>
-        <w:t>Recurrent deep learning dominates recent PdM literature. Bampoula et al. (2024) compare LSTM autoencoders with Transformer encoders on manufacturing time-series data, finding that Transformers better capture long-range temporal dependencies under non-stationary conditions. This extends their 2021 work (Bampoula et al., 2021), which showed LSTM autoencoders detecting anomalies in cyber-physical systems without domain expertise</w:t>
-      </w:r>
-      <w:r>
-        <w:rPr>
-          <w:rFonts w:cs="Times New Roman"/>
-        </w:rPr>
-        <w:t xml:space="preserve"> </w:t>
-      </w:r>
-      <w:r>
-        <w:rPr>
-          <w:rFonts w:cs="Times New Roman"/>
-        </w:rPr>
-        <w:t>reflecting a broader shift of NLP architectures into industrial sensor analytics.</w:t>
+        <w:t>Recurrent deep learning dominates recent PdM literature. Bampoula et al. (2024) compare LSTM autoencoders with Transformer encoders on manufacturing time-series data, finding that Transformers better capture long-range temporal dependencies under non-stationary conditions</w:t>
+      </w:r>
+      <w:r>
+        <w:rPr>
+          <w:rFonts w:cs="Times New Roman"/>
+        </w:rPr>
+        <w:t>.</w:t>
       </w:r>
     </w:p>
     <w:p>
@@ -2846,7 +2836,19 @@
         <w:rPr>
           <w:rFonts w:cs="Times New Roman"/>
         </w:rPr>
-        <w:t>Ensemble methods represent a third strand. Rezk et al. (2024) combine Deep Reinforcement Learning (DRL), Random Forest (RF), and Gradient Boosting Machines (GBM), demonstrating that hybrid ensembles reduce false-positive alerts in imbalanced IIoT datasets. Separately, Elsherif et al. (2025) propose a CNN-LSTM hybrid (CAELSTM) achieving RMSE 14.44 and 13.40 on NASA C-MAPSS FD001 and FD003, highlighting how piecewise degradation modelling addresses missing ground-truth labels.</w:t>
+        <w:t>Elsherif et al. (2025) propose a CNN-LSTM hybrid achieving RMSE 14.44 on C-MAPSS FD001, while Rezk et al. (202</w:t>
+      </w:r>
+      <w:r>
+        <w:rPr>
+          <w:rFonts w:cs="Times New Roman"/>
+        </w:rPr>
+        <w:t>5</w:t>
+      </w:r>
+      <w:r>
+        <w:rPr>
+          <w:rFonts w:cs="Times New Roman"/>
+        </w:rPr>
+        <w:t>) show that hybrid ensembles reduce false-positive alerts in imbalanced IIoT datasets.</w:t>
       </w:r>
     </w:p>
     <w:p>
@@ -2872,39 +2874,34 @@
         <w:rPr>
           <w:rFonts w:cs="Times New Roman"/>
         </w:rPr>
-        <w:t>The NASA C-MAPSS dataset</w:t>
-      </w:r>
-      <w:r>
-        <w:rPr>
-          <w:rFonts w:cs="Times New Roman"/>
-        </w:rPr>
-        <w:t xml:space="preserve"> has </w:t>
-      </w:r>
-      <w:r>
-        <w:rPr>
-          <w:rFonts w:cs="Times New Roman"/>
-        </w:rPr>
-        <w:t>four sub-datasets (FD001–FD004) with 21 sensor signals for turbofan engine degradation</w:t>
-      </w:r>
-      <w:r>
-        <w:rPr>
-          <w:rFonts w:cs="Times New Roman"/>
-        </w:rPr>
-        <w:t xml:space="preserve"> </w:t>
-      </w:r>
-      <w:r>
-        <w:rPr>
-          <w:rFonts w:cs="Times New Roman"/>
-        </w:rPr>
-        <w:t xml:space="preserve">remains the dominant RUL benchmark (Sharma, 2024). Its ubiquity enables cross-study comparisons but risks benchmark overfitting; architectural choices tuned for turbofan patterns may not transfer to pumps or conveyor systems. The PRONOSTIA bearing dataset, from the IEEE PHM 2012 Challenge, provides run-to-failure </w:t>
-      </w:r>
-      <w:r>
-        <w:rPr>
-          <w:rFonts w:cs="Times New Roman"/>
-        </w:rPr>
-        <w:lastRenderedPageBreak/>
-        <w:t>data for rolling element bearings under three load conditions. Pandya et al. (2021) achieve over 90% accuracy on PRONOSTIA using an Autoencoder-LSTM, making it the more relevant primary benchmark for the present manufacturing context. Elkateb et al. (2024) caution that both datasets omit the sensor drift, noise, and irregular sampling typical of live production environments.</w:t>
-      </w:r>
+        <w:t>The NASA C-MAPSS dataset remains the dominant RUL benchmark (Sharma, 202</w:t>
+      </w:r>
+      <w:r>
+        <w:rPr>
+          <w:rFonts w:cs="Times New Roman"/>
+        </w:rPr>
+        <w:t>5</w:t>
+      </w:r>
+      <w:r>
+        <w:rPr>
+          <w:rFonts w:cs="Times New Roman"/>
+        </w:rPr>
+        <w:t>), though its ubiquity risks overfitting to turbofan patterns that may not transfer to pumps or conveyors.</w:t>
+      </w:r>
+      <w:r>
+        <w:rPr>
+          <w:rFonts w:cs="Times New Roman"/>
+        </w:rPr>
+        <w:t xml:space="preserve"> The PRONOSTIA bearing dataset, from the IEEE PHM 2012 Challenge, provides run-to-failure data for rolling element bearings under three load conditions. Pandya et al. (2021) achieve over 90% accuracy on PRONOSTIA using an Autoencoder-LSTM, making it the more relevant primary benchmark for the present manufacturing context. Elkateb et al. (2024) caution that both datasets omit the sensor drift, noise, and irregular sampling typical of live production environments.</w:t>
+      </w:r>
+    </w:p>
+    <w:p>
+      <w:pPr>
+        <w:spacing w:before="240" w:line="360" w:lineRule="auto"/>
+        <w:rPr>
+          <w:rFonts w:cs="Times New Roman"/>
+        </w:rPr>
+      </w:pPr>
     </w:p>
     <w:p>
       <w:pPr>
@@ -2913,6 +2910,7 @@
       <w:bookmarkStart w:id="8" w:name="_Toc231156492"/>
       <w:bookmarkStart w:id="9" w:name="_Toc231210627"/>
       <w:r>
+        <w:lastRenderedPageBreak/>
         <w:t>2.3 Research Gaps</w:t>
       </w:r>
       <w:bookmarkEnd w:id="8"/>
@@ -2929,7 +2927,19 @@
         <w:rPr>
           <w:rFonts w:cs="Times New Roman"/>
         </w:rPr>
-        <w:t>Three gaps are consistently acknowledged. First, labelled failure data are scarce: machines are engineered not to fail, so run-to-failure records are costly and rare, yielding severely imbalanced datasets (Rezk et al., 2024; Elkateb et al., 2024). Second, cross-machine generalisation is poor</w:t>
+        <w:t>Three gaps are consistently acknowledged. First, labelled failure data are scarce: machines are engineered not to fail, so run-to-failure records are costly and rare, yielding severely imbalanced datasets (Rezk et al., 202</w:t>
+      </w:r>
+      <w:r>
+        <w:rPr>
+          <w:rFonts w:cs="Times New Roman"/>
+        </w:rPr>
+        <w:t>5</w:t>
+      </w:r>
+      <w:r>
+        <w:rPr>
+          <w:rFonts w:cs="Times New Roman"/>
+        </w:rPr>
+        <w:t>; Elkateb et al., 2024). Second, cross-machine generalisation is poor</w:t>
       </w:r>
       <w:r>
         <w:rPr>
@@ -2961,17 +2971,10 @@
     <w:p>
       <w:pPr>
         <w:pStyle w:val="Heading1"/>
-        <w:spacing w:before="240"/>
-        <w:rPr>
-          <w:rFonts w:cs="Times New Roman"/>
-        </w:rPr>
       </w:pPr>
       <w:bookmarkStart w:id="10" w:name="_Toc231156493"/>
       <w:bookmarkStart w:id="11" w:name="_Toc231210628"/>
       <w:r>
-        <w:rPr>
-          <w:rFonts w:cs="Times New Roman"/>
-        </w:rPr>
         <w:lastRenderedPageBreak/>
         <w:t>3. AI Model Selection and Justification</w:t>
       </w:r>
@@ -3039,19 +3042,13 @@
         <w:rPr>
           <w:rFonts w:cs="Times New Roman"/>
         </w:rPr>
-        <w:t>LSTMs are a specialised RNN class that overcome the vanishing gradient problem via input, forget, and output gates, controlling information flow across time steps (Bampoula et al., 2021). This makes them well-suited to sequential sensor data where temporal ordering carries diagnostic value</w:t>
-      </w:r>
-      <w:r>
-        <w:rPr>
-          <w:rFonts w:cs="Times New Roman"/>
-        </w:rPr>
-        <w:t xml:space="preserve"> </w:t>
-      </w:r>
-      <w:r>
-        <w:rPr>
-          <w:rFonts w:cs="Times New Roman"/>
-        </w:rPr>
-        <w:t>such as a rising vibration trend preceding bearing failure. Elsherif et al. (2025) and Pandya et al. (2021) confirm strong LSTM performance on C-MAPSS and PRONOSTIA respectively, establishing it as the most validated PdM baseline. Its key limitation is sequential computation: inference latency and training cost scale unfavourably with window length, and internal gating states offer no intuitive mapping to physical fault mechanisms.</w:t>
+        <w:t>LSTMs overcome the vanishing gradient problem via gating mechanisms, making them well-suited to sequential sensor data where temporal ordering carries diagnostic value (Bampoula et al., 2021).</w:t>
+      </w:r>
+      <w:r>
+        <w:rPr>
+          <w:rFonts w:cs="Times New Roman"/>
+        </w:rPr>
+        <w:t xml:space="preserve"> Its key limitation is sequential computation: inference latency and training cost scale unfavourably with window length, and internal gating states offer no intuitive mapping to physical fault mechanisms.</w:t>
       </w:r>
     </w:p>
     <w:p>
@@ -3077,7 +3074,7 @@
         <w:rPr>
           <w:rFonts w:cs="Times New Roman"/>
         </w:rPr>
-        <w:t>TCNs replace recurrence with dilated causal convolutions at exponentially increasing dilation rates, capturing long-range dependencies while processing all time steps in parallel (Fatahi et al., 2024). Fatahi et al. (2024) and Abdelhedi and Bouri (2025) demonstrate superior or competitive accuracy versus LSTM variants, with the added benefits of faster training and CNN-native hardware acceleration on edge devices. The principal limitation is a bounded receptive field: capturing very long degradation horizons requires many convolutional layers, increasing memory usage. TCN tooling is also less mature than LSTM across major frameworks.</w:t>
+        <w:t xml:space="preserve">TCNs replace recurrence with dilated causal convolutions at exponentially increasing dilation rates, capturing long-range dependencies while processing all time steps in parallel (Fatahi et al., 2024). Fatahi et al. (2024) and Abdelhedi and Bouri (2025) demonstrate superior or competitive accuracy versus LSTM variants, with the added benefits of faster training and CNN-native hardware acceleration on edge devices. </w:t>
       </w:r>
     </w:p>
     <w:p>
@@ -3485,7 +3482,6 @@
               <w:rPr>
                 <w:rFonts w:cs="Times New Roman"/>
               </w:rPr>
-              <w:lastRenderedPageBreak/>
               <w:t>Training speed</w:t>
             </w:r>
           </w:p>
@@ -3872,28 +3868,6 @@
     </w:tbl>
     <w:p>
       <w:pPr>
-        <w:spacing w:before="240" w:line="360" w:lineRule="auto"/>
-        <w:rPr>
-          <w:rFonts w:cs="Times New Roman"/>
-        </w:rPr>
-      </w:pPr>
-    </w:p>
-    <w:p>
-      <w:pPr>
-        <w:spacing w:before="240" w:line="360" w:lineRule="auto"/>
-        <w:rPr>
-          <w:rFonts w:cs="Times New Roman"/>
-        </w:rPr>
-      </w:pPr>
-      <w:r>
-        <w:rPr>
-          <w:rFonts w:cs="Times New Roman"/>
-        </w:rPr>
-        <w:br w:type="page"/>
-      </w:r>
-    </w:p>
-    <w:p>
-      <w:pPr>
         <w:pStyle w:val="Heading1"/>
       </w:pPr>
       <w:bookmarkStart w:id="17" w:name="_Toc231156496"/>
@@ -3928,7 +3902,19 @@
         <w:rPr>
           <w:rFonts w:cs="Times New Roman"/>
         </w:rPr>
-        <w:t>Each machine class requires multivariate sensor streams: vibration (vertical and horizontal accelerometers), temperature, pressure (piezoelectric), and acoustic emission. Vibration sampling must reach at least 10–25.6 kHz to resolve bearing fault frequencies (Elkateb et al., 2024). Metadata including machine ID, load/speed settings, and maintenance logs are needed for supervised labelling. Where run-to-failure data are unavailable, PRONOSTIA and C-MAPSS serve as validated surrogates.</w:t>
+        <w:t xml:space="preserve">Each machine class requires multivariate sensor streams: vibration (vertical and horizontal accelerometers), temperature, pressure (piezoelectric), and acoustic emission. Vibration sampling must reach at least 10–25.6 kHz to resolve bearing fault frequencies (Elkateb et al., 2024). </w:t>
+      </w:r>
+      <w:r>
+        <w:rPr>
+          <w:rFonts w:cs="Times New Roman"/>
+        </w:rPr>
+        <w:t>Where run-to-failure data are unavailable, PRONOSTIA and C-MAPSS serve as validated surrogates</w:t>
+      </w:r>
+      <w:r>
+        <w:rPr>
+          <w:rFonts w:cs="Times New Roman"/>
+        </w:rPr>
+        <w:t>.</w:t>
       </w:r>
     </w:p>
     <w:p>
@@ -3954,7 +3940,19 @@
         <w:rPr>
           <w:rFonts w:cs="Times New Roman"/>
         </w:rPr>
-        <w:t>Healthy observations vastly outnumber failure precursors in industrial streams, causing standard cross-entropy loss to default to the majority class. Elkateb et al. (2024) apply Borderline-SMOTE to synthesise minority-class samples in feature space. Cost-sensitive learning and Balanced Random Forests offer complementary strategies by penalising misclassification of the minority class or resampling mini-batches at training time (Rezk et al., 2024).</w:t>
+        <w:t>Healthy observations vastly outnumber failure precursors in industrial streams, causing standard cross-entropy loss to default to the majority class. Elkateb et al. (2024) apply Borderline-SMOTE to synthesise minority-class samples in feature space. Cost-sensitive learning and Balanced Random Forests offer complementary strategies by penalising misclassification of the minority class or resampling mini-batches at training time (Rezk et al., 202</w:t>
+      </w:r>
+      <w:r>
+        <w:rPr>
+          <w:rFonts w:cs="Times New Roman"/>
+        </w:rPr>
+        <w:t>5</w:t>
+      </w:r>
+      <w:r>
+        <w:rPr>
+          <w:rFonts w:cs="Times New Roman"/>
+        </w:rPr>
+        <w:t>).</w:t>
       </w:r>
     </w:p>
     <w:p>
@@ -3980,7 +3978,13 @@
         <w:rPr>
           <w:rFonts w:cs="Times New Roman"/>
         </w:rPr>
-        <w:t>Features are extracted across three domains. Time-domain statistics (RMS, kurtosis, crest factor, peak-to-peak) are sensitive to incipient bearing defects. FFT-derived frequency features expose characteristic fault frequencies such as inner and outer ball-pass rates. Wavelet packet decomposition and STFT provide time-frequency representations suited to variable-speed machinery. For sequence models, a 30-step sliding window with 50% overlap generates training samples; the window length is tuned as a hyperparameter. Elsherif et al. (2025) use piecewise linear degradation labels per window when only total run-to-failure length is available.</w:t>
+        <w:t>Features span three domains: time-domain statistics (RMS, kurtosis), FFT-derived fault frequencies, and wavelet/STFT time-frequency representations for variable-speed machinery</w:t>
+      </w:r>
+      <w:r>
+        <w:rPr>
+          <w:rFonts w:cs="Times New Roman"/>
+        </w:rPr>
+        <w:t xml:space="preserve">. For sequence models, a 30-step sliding window with 50% overlap generates training samples; the window length is tuned as a hyperparameter. </w:t>
       </w:r>
     </w:p>
     <w:p>
@@ -4032,6 +4036,30 @@
         </w:rPr>
         <w:t>better represents deployment on unseen equipment than random splitting.</w:t>
       </w:r>
+    </w:p>
+    <w:p>
+      <w:pPr>
+        <w:spacing w:before="240" w:line="360" w:lineRule="auto"/>
+        <w:rPr>
+          <w:rFonts w:cs="Times New Roman"/>
+        </w:rPr>
+      </w:pPr>
+    </w:p>
+    <w:p>
+      <w:pPr>
+        <w:spacing w:before="240" w:line="360" w:lineRule="auto"/>
+        <w:rPr>
+          <w:rFonts w:cs="Times New Roman"/>
+        </w:rPr>
+      </w:pPr>
+    </w:p>
+    <w:p>
+      <w:pPr>
+        <w:spacing w:before="240" w:line="360" w:lineRule="auto"/>
+        <w:rPr>
+          <w:rFonts w:cs="Times New Roman"/>
+        </w:rPr>
+      </w:pPr>
     </w:p>
     <w:p>
       <w:pPr>
@@ -5020,7 +5048,19 @@
         <w:rPr>
           <w:rFonts w:cs="Times New Roman"/>
         </w:rPr>
-        <w:t>as the domain-relevant metric (Elsherif et al., 2025). RMSE below 20 cycles on C-MAPSS FD001 is the state-of-the-art threshold. Confusion matrices and Wilcoxon signed-rank tests are used for statistical validation.</w:t>
+        <w:t>as the domain-relevant metric (Elsherif et al., 2025)</w:t>
+      </w:r>
+      <w:r>
+        <w:rPr>
+          <w:rFonts w:cs="Times New Roman"/>
+        </w:rPr>
+        <w:t xml:space="preserve">. </w:t>
+      </w:r>
+      <w:r>
+        <w:rPr>
+          <w:rFonts w:cs="Times New Roman"/>
+        </w:rPr>
+        <w:t>Confusion matrices and Wilcoxon signed-rank tests provide statistical validation.</w:t>
       </w:r>
     </w:p>
     <w:p>
@@ -5052,13 +5092,7 @@
         <w:rPr>
           <w:rFonts w:cs="Times New Roman"/>
         </w:rPr>
-        <w:t>. A</w:t>
-      </w:r>
-      <w:r>
-        <w:rPr>
-          <w:rFonts w:cs="Times New Roman"/>
-        </w:rPr>
-        <w:t xml:space="preserve"> direct proxy for industrial deployability.</w:t>
+        <w:t>.</w:t>
       </w:r>
     </w:p>
     <w:p>
@@ -5084,7 +5118,13 @@
         <w:rPr>
           <w:rFonts w:cs="Times New Roman"/>
         </w:rPr>
-        <w:t>Both models share identical preprocessing pipelines and data splits. Hyperparameters are tuned independently via Bayesian optimisation (50 trials) on the validation fold, using the Adam optimiser with early stopping (max 200 epochs). All runs are replicated five times with different seeds; mean and standard deviation are reported. Ablation studies compare LSTM versus Bidirectional LSTM, and TCN-Attention versus TCN without attention.</w:t>
+        <w:t xml:space="preserve">Both models share identical preprocessing pipelines and data splits. Hyperparameters are tuned independently via Bayesian optimisation (50 trials) on the validation fold, using the Adam optimiser with early stopping (max 200 epochs). </w:t>
+      </w:r>
+      <w:r>
+        <w:rPr>
+          <w:rFonts w:cs="Times New Roman"/>
+        </w:rPr>
+        <w:t>Runs are replicated five times (mean ± SD reported).</w:t>
       </w:r>
     </w:p>
     <w:p>
@@ -5478,7 +5518,6 @@
               <w:rPr>
                 <w:rFonts w:cs="Times New Roman"/>
               </w:rPr>
-              <w:lastRenderedPageBreak/>
               <w:t>Cross-validation</w:t>
             </w:r>
           </w:p>
@@ -5580,6 +5619,7 @@
               <w:rPr>
                 <w:rFonts w:cs="Times New Roman"/>
               </w:rPr>
+              <w:lastRenderedPageBreak/>
               <w:t>Metrics</w:t>
             </w:r>
           </w:p>
@@ -6013,7 +6053,19 @@
         <w:rPr>
           <w:rFonts w:cs="Times New Roman"/>
         </w:rPr>
-        <w:t>Interpretability is critical in safety-sensitive manufacturing, where engineers must act on model outputs with confidence. Tree-based ensembles (Random Forest, Gradient Boosting) offer inherent transparency through feature importance scores mappable to engineering variables such as bearing temperature or vibration RMS (Rezk et al., 2024). LSTM and TCN internal representations</w:t>
+        <w:t>Interpretability is critical in safety-sensitive manufacturing, where engineers must act on model outputs with confidence. Tree-based ensembles (Random Forest, Gradient Boosting) offer inherent transparency through feature importance scores mappable to engineering variables such as bearing temperature or vibration RMS (Rezk et al., 202</w:t>
+      </w:r>
+      <w:r>
+        <w:rPr>
+          <w:rFonts w:cs="Times New Roman"/>
+        </w:rPr>
+        <w:t>5</w:t>
+      </w:r>
+      <w:r>
+        <w:rPr>
+          <w:rFonts w:cs="Times New Roman"/>
+        </w:rPr>
+        <w:t>). LSTM and TCN internal representations</w:t>
       </w:r>
       <w:r>
         <w:rPr>
@@ -6038,32 +6090,6 @@
           <w:rFonts w:cs="Times New Roman"/>
         </w:rPr>
         <w:t>have no direct physical interpretation, embodying the classical deep learning black-box problem.</w:t>
-      </w:r>
-    </w:p>
-    <w:p>
-      <w:pPr>
-        <w:spacing w:before="240" w:line="360" w:lineRule="auto"/>
-        <w:rPr>
-          <w:rFonts w:cs="Times New Roman"/>
-        </w:rPr>
-      </w:pPr>
-      <w:r>
-        <w:rPr>
-          <w:rFonts w:cs="Times New Roman"/>
-        </w:rPr>
-        <w:t>Post-hoc tools partially close this gap. SHAP (SHapley Additive exPlanations) attributes each model prediction to individual input features. Alotaibi and Aly (2025) show that SHAP-explained transformer-boosting outputs allow operators to trace anomaly alerts to specific sensor channels. LIME fits locally linear surrogates around individual predictions as an alternative. Both methods apply to LSTM and TCN models, though their approximations may not fully reflect true model reasoning</w:t>
-      </w:r>
-      <w:r>
-        <w:rPr>
-          <w:rFonts w:cs="Times New Roman"/>
-        </w:rPr>
-        <w:t>. A</w:t>
-      </w:r>
-      <w:r>
-        <w:rPr>
-          <w:rFonts w:cs="Times New Roman"/>
-        </w:rPr>
-        <w:t xml:space="preserve"> concern for shutdown-critical decisions. A practical hybrid uses deep learning for detection and RUL estimation, with a tree-based model providing auditable justification for shutdown recommendations.</w:t>
       </w:r>
     </w:p>
     <w:p>
@@ -6089,31 +6115,31 @@
         <w:rPr>
           <w:rFonts w:cs="Times New Roman"/>
         </w:rPr>
-        <w:t>LSTM’s sequential computation scales poorly with fleet size: training time grows super-linearly as more machines are instrumented, demanding dedicated GPU infrastructure for periodic retraining. TCNs benefit from full parallelisation; their fixed receptive field also means memory does not grow with sequence length as LSTM hidden states do. However, TCN dilation factors must be reconfigured as sensor counts grow to maintain adequate temporal coverage. Both architectures support federated learning</w:t>
-      </w:r>
-      <w:r>
-        <w:rPr>
-          <w:rFonts w:cs="Times New Roman"/>
-        </w:rPr>
-        <w:t xml:space="preserve"> </w:t>
-      </w:r>
-      <w:r>
-        <w:rPr>
-          <w:rFonts w:cs="Times New Roman"/>
-        </w:rPr>
-        <w:t>distributing training across edge devices without centralising raw data</w:t>
-      </w:r>
-      <w:r>
-        <w:rPr>
-          <w:rFonts w:cs="Times New Roman"/>
-        </w:rPr>
-        <w:t xml:space="preserve"> </w:t>
-      </w:r>
-      <w:r>
-        <w:rPr>
-          <w:rFonts w:cs="Times New Roman"/>
-        </w:rPr>
-        <w:t>which is essential for multi-site deployments with bandwidth or privacy constraints (Alotaibi and Aly, 2025). Model versioning pipelines must include distribution-drift monitoring to detect silent degradation as operating conditions evolve (Sai and Madhavi, 2024).</w:t>
+        <w:t>LSTM’s sequential computation scales poorly with fleet size: training time grows super-linearly as more machines are instrumented, demanding dedicated GPU infrastructure for periodic retraining. TCNs benefit from full parallelisation; their fixed receptive field also means memory does not grow with sequence length as LSTM hidden states do</w:t>
+      </w:r>
+      <w:r>
+        <w:rPr>
+          <w:rFonts w:cs="Times New Roman"/>
+        </w:rPr>
+        <w:t xml:space="preserve">. </w:t>
+      </w:r>
+      <w:r>
+        <w:rPr>
+          <w:rFonts w:cs="Times New Roman"/>
+        </w:rPr>
+        <w:t>Both architectures support federated learning across edge devices, essential for multi-site deployments with bandwidth or privacy constraints (Alotaibi and Aly, 2025)</w:t>
+      </w:r>
+      <w:r>
+        <w:rPr>
+          <w:rFonts w:cs="Times New Roman"/>
+        </w:rPr>
+        <w:t xml:space="preserve">. </w:t>
+      </w:r>
+      <w:r>
+        <w:rPr>
+          <w:rFonts w:cs="Times New Roman"/>
+        </w:rPr>
+        <w:t>Model versioning pipelines must include distribution-drift monitoring to detect silent degradation as operating conditions evolve (Sai and Madhavi, 2024).</w:t>
       </w:r>
     </w:p>
     <w:p>
@@ -6139,46 +6165,25 @@
         <w:rPr>
           <w:rFonts w:cs="Times New Roman"/>
         </w:rPr>
-        <w:lastRenderedPageBreak/>
-        <w:t>Live deployment requires sub-100ms inference latency for real-time pump and motor anomaly detection. TCN models export cleanly to ONNX and run efficiently on edge accelerators (NVIDIA Jetson, Intel Movidius), whereas LSTM’s stateful computation complicates on-device execution and typically requires INT8 quantisation at the cost of minor accuracy loss (Sai and Madhavi, 2024). SCADA and MES systems were not designed for probabilistic AI outputs; middleware translating predictions into maintenance work orders</w:t>
-      </w:r>
-      <w:r>
-        <w:rPr>
-          <w:rFonts w:cs="Times New Roman"/>
-        </w:rPr>
-        <w:t xml:space="preserve"> </w:t>
-      </w:r>
-      <w:r>
-        <w:rPr>
-          <w:rFonts w:cs="Times New Roman"/>
-        </w:rPr>
-        <w:t>aligned with OPC-UA communication standards</w:t>
-      </w:r>
-      <w:r>
-        <w:rPr>
-          <w:rFonts w:cs="Times New Roman"/>
-        </w:rPr>
-        <w:t xml:space="preserve"> </w:t>
-      </w:r>
-      <w:r>
-        <w:rPr>
-          <w:rFonts w:cs="Times New Roman"/>
-        </w:rPr>
-        <w:t>must be custom-built and validated per vendor. Model drift, arising from sensor calibration changes, machine refurbishments, or load shifts, demands a ground-truth feedback loop logging actual failures against predictions. Kullback–Leibler divergence can serve as an unsupervised drift detector; incremental fine-tuning on recent data preserves historical representations and mitigates catastrophic forgetting (Sai and Madhavi, 2024).</w:t>
-      </w:r>
-    </w:p>
-    <w:p>
-      <w:pPr>
-        <w:spacing w:before="240" w:line="360" w:lineRule="auto"/>
-        <w:rPr>
-          <w:rFonts w:cs="Times New Roman"/>
-        </w:rPr>
-      </w:pPr>
-      <w:r>
-        <w:rPr>
-          <w:rFonts w:cs="Times New Roman"/>
-        </w:rPr>
-        <w:br w:type="page"/>
+        <w:t xml:space="preserve">Live deployment requires sub-100ms inference latency for real-time pump and motor anomaly detection. TCN models export cleanly to ONNX and run efficiently on edge accelerators (NVIDIA Jetson, Intel Movidius), whereas LSTM’s stateful computation complicates on-device execution and typically requires INT8 quantisation at the cost of minor accuracy loss (Sai and Madhavi, 2024). </w:t>
+      </w:r>
+      <w:r>
+        <w:rPr>
+          <w:rFonts w:cs="Times New Roman"/>
+        </w:rPr>
+        <w:t>Middleware translating AI predictions into maintenance work orders aligned with OPC-UA standards must be custom-built per vendor.</w:t>
+      </w:r>
+      <w:r>
+        <w:rPr>
+          <w:rFonts w:cs="Times New Roman"/>
+        </w:rPr>
+        <w:t xml:space="preserve"> Model drift, arising from sensor calibration changes, machine refurbishments, or load shifts, demands a ground-truth feedback loop logging actual failures against predictions. Kullback–Leibler </w:t>
+      </w:r>
+      <w:r>
+        <w:rPr>
+          <w:rFonts w:cs="Times New Roman"/>
+        </w:rPr>
+        <w:t>divergence drift detection with incremental fine-tuning mitigates catastrophic forgetting (Sai and Madhavi, 2024).</w:t>
       </w:r>
     </w:p>
     <w:p>
@@ -6243,7 +6248,19 @@
         <w:rPr>
           <w:rFonts w:cs="Times New Roman"/>
         </w:rPr>
-        <w:t>LSTM and TCN were selected and justified for the case study context. LSTM provides a well-validated baseline; TCN offers parallelism and edge-friendliness. The proposed experimental design employs walk-forward cross-validation, LOMO evaluation, and a multi-metric framework spanning both classification and regression. Critical analysis shows that interpretability is a shared limitation, partially addressed by SHAP and LIME; scalability favours TCNs; and deployment demands edge-cloud trade-off decisions, SCADA integration, and drift monitoring. A hybrid TCN–tree-based architecture represents the most pragmatic industrial solution. Future work should pursue domain adaptation for cross-machine transfer and federated learning for privacy-preserving multi-site deployment.</w:t>
+        <w:t>LSTM provides a well-validated baseline; TCN offers parallelism and edge-friendliness. Scalability favours TCNs; interpretability is a shared limitation addressed through SHAP and LIME; deployment demands drift monitoring and SCADA integration.</w:t>
+      </w:r>
+      <w:r>
+        <w:rPr>
+          <w:rFonts w:cs="Times New Roman"/>
+        </w:rPr>
+        <w:t xml:space="preserve"> </w:t>
+      </w:r>
+      <w:r>
+        <w:rPr>
+          <w:rFonts w:cs="Times New Roman"/>
+        </w:rPr>
+        <w:t>A hybrid TCN–tree-based architecture represents the most pragmatic industrial solution. Future work should pursue domain adaptation for cross-machine transfer and federated learning for privacy-preserving multi-site deployment.</w:t>
       </w:r>
     </w:p>
     <w:p>
@@ -6612,7 +6629,19 @@
         <w:rPr>
           <w:rFonts w:cs="Times New Roman"/>
         </w:rPr>
-        <w:t xml:space="preserve">Rezk, H., Osheba, I.H.M. and Abdelkader, M. (2024) Optimised predictive maintenance for streaming data in industrial IoT networks using deep reinforcement learning and ensemble techniques. Scientific Reports, 14, 17492. Available at: </w:t>
+        <w:t>Rezk, H., Osheba, I.H.M. and Abdelkader, M. (202</w:t>
+      </w:r>
+      <w:r>
+        <w:rPr>
+          <w:rFonts w:cs="Times New Roman"/>
+        </w:rPr>
+        <w:t>5</w:t>
+      </w:r>
+      <w:r>
+        <w:rPr>
+          <w:rFonts w:cs="Times New Roman"/>
+        </w:rPr>
+        <w:t xml:space="preserve">) Optimised predictive maintenance for streaming data in industrial IoT networks using deep reinforcement learning and ensemble techniques. Scientific Reports, 14, 17492. Available at: </w:t>
       </w:r>
       <w:hyperlink r:id="rId20" w:history="1">
         <w:r>
@@ -6688,7 +6717,19 @@
         <w:rPr>
           <w:rFonts w:cs="Times New Roman"/>
         </w:rPr>
-        <w:t xml:space="preserve">Sharma, K. (2024) Uncertainty-aware deep learning framework for remaining useful life prediction in turbofan engines with learned aleatoric uncertainty. arXiv preprint arXiv:2511.19124. Available at: </w:t>
+        <w:t>Sharma, K. (202</w:t>
+      </w:r>
+      <w:r>
+        <w:rPr>
+          <w:rFonts w:cs="Times New Roman"/>
+        </w:rPr>
+        <w:t>5</w:t>
+      </w:r>
+      <w:r>
+        <w:rPr>
+          <w:rFonts w:cs="Times New Roman"/>
+        </w:rPr>
+        <w:t xml:space="preserve">) Uncertainty-aware deep learning framework for remaining useful life prediction in turbofan engines with learned aleatoric uncertainty. arXiv preprint arXiv:2511.19124. Available at: </w:t>
       </w:r>
       <w:hyperlink r:id="rId22" w:history="1">
         <w:r>
@@ -7447,11 +7488,11 @@
     <w:autoRedefine/>
     <w:uiPriority w:val="9"/>
     <w:qFormat/>
-    <w:rsid w:val="004341E3"/>
+    <w:rsid w:val="009A3BB5"/>
     <w:pPr>
       <w:keepNext/>
       <w:keepLines/>
-      <w:spacing w:line="360" w:lineRule="auto"/>
+      <w:spacing w:before="240" w:line="360" w:lineRule="auto"/>
       <w:outlineLvl w:val="0"/>
     </w:pPr>
     <w:rPr>
@@ -7637,7 +7678,6 @@
   <w:style w:type="character" w:default="1" w:styleId="DefaultParagraphFont">
     <w:name w:val="Default Paragraph Font"/>
     <w:uiPriority w:val="1"/>
-    <w:semiHidden/>
     <w:unhideWhenUsed/>
   </w:style>
   <w:style w:type="table" w:default="1" w:styleId="TableNormal">
@@ -7666,7 +7706,7 @@
     <w:basedOn w:val="DefaultParagraphFont"/>
     <w:link w:val="Heading1"/>
     <w:uiPriority w:val="9"/>
-    <w:rsid w:val="004341E3"/>
+    <w:rsid w:val="009A3BB5"/>
     <w:rPr>
       <w:rFonts w:ascii="Times New Roman" w:eastAsiaTheme="majorEastAsia" w:hAnsi="Times New Roman" w:cstheme="majorBidi"/>
       <w:b/>
@@ -8024,7 +8064,7 @@
     <w:qFormat/>
     <w:rsid w:val="00C13554"/>
     <w:pPr>
-      <w:spacing w:before="240" w:line="259" w:lineRule="auto"/>
+      <w:spacing w:line="259" w:lineRule="auto"/>
       <w:jc w:val="left"/>
       <w:outlineLvl w:val="9"/>
     </w:pPr>
@@ -8095,6 +8135,18 @@
     <w:rPr>
       <w:color w:val="605E5C"/>
       <w:shd w:val="clear" w:color="auto" w:fill="E1DFDD"/>
+    </w:rPr>
+  </w:style>
+  <w:style w:type="character" w:styleId="FollowedHyperlink">
+    <w:name w:val="FollowedHyperlink"/>
+    <w:basedOn w:val="DefaultParagraphFont"/>
+    <w:uiPriority w:val="99"/>
+    <w:semiHidden/>
+    <w:unhideWhenUsed/>
+    <w:rsid w:val="008C267A"/>
+    <w:rPr>
+      <w:color w:val="954F72" w:themeColor="followedHyperlink"/>
+      <w:u w:val="single"/>
     </w:rPr>
   </w:style>
 </w:styles>

</xml_diff>

<commit_message>
Submitted: Predictive  Maintenance  in  Smart  Manufacturing:  Evaluating AI  Models  for Equipment Failure Prediction
</commit_message>
<xml_diff>
--- a/Sem1/Introduction to Artificial Intelligence/essay/report.docx
+++ b/Sem1/Introduction to Artificial Intelligence/essay/report.docx
@@ -189,6 +189,7 @@
           <w:u w:val="single"/>
         </w:rPr>
       </w:pPr>
+      <w:proofErr w:type="spellStart"/>
       <w:r>
         <w:rPr>
           <w:b/>
@@ -196,7 +197,17 @@
           <w:szCs w:val="28"/>
           <w:u w:val="single"/>
         </w:rPr>
-        <w:t>Programme title:</w:t>
+        <w:t>Programme</w:t>
+      </w:r>
+      <w:proofErr w:type="spellEnd"/>
+      <w:r>
+        <w:rPr>
+          <w:b/>
+          <w:sz w:val="28"/>
+          <w:szCs w:val="28"/>
+          <w:u w:val="single"/>
+        </w:rPr>
+        <w:t xml:space="preserve"> title:</w:t>
       </w:r>
     </w:p>
     <w:p>
@@ -493,6 +504,833 @@
     </w:p>
     <w:p>
       <w:pPr>
+        <w:spacing w:after="160"/>
+        <w:jc w:val="left"/>
+        <w:rPr>
+          <w:rFonts w:eastAsiaTheme="majorEastAsia" w:cstheme="majorBidi"/>
+          <w:b/>
+          <w:color w:val="000000" w:themeColor="text1"/>
+          <w:sz w:val="32"/>
+          <w:szCs w:val="40"/>
+        </w:rPr>
+      </w:pPr>
+      <w:r>
+        <w:rPr>
+          <w:rFonts w:eastAsiaTheme="majorEastAsia" w:cstheme="majorBidi"/>
+          <w:b/>
+          <w:color w:val="000000" w:themeColor="text1"/>
+          <w:sz w:val="28"/>
+          <w:szCs w:val="36"/>
+        </w:rPr>
+        <w:lastRenderedPageBreak/>
+        <w:t>Learner declaration</w:t>
+      </w:r>
+    </w:p>
+    <w:tbl>
+      <w:tblPr>
+        <w:tblW w:w="5000" w:type="pct"/>
+        <w:tblCellMar>
+          <w:top w:w="15" w:type="dxa"/>
+          <w:left w:w="15" w:type="dxa"/>
+          <w:bottom w:w="15" w:type="dxa"/>
+          <w:right w:w="15" w:type="dxa"/>
+        </w:tblCellMar>
+        <w:tblLook w:val="04A0" w:firstRow="1" w:lastRow="0" w:firstColumn="1" w:lastColumn="0" w:noHBand="0" w:noVBand="1"/>
+      </w:tblPr>
+      <w:tblGrid>
+        <w:gridCol w:w="7809"/>
+        <w:gridCol w:w="1201"/>
+      </w:tblGrid>
+      <w:tr>
+        <w:trPr>
+          <w:tblHeader/>
+        </w:trPr>
+        <w:tc>
+          <w:tcPr>
+            <w:tcW w:w="0" w:type="auto"/>
+            <w:tcBorders>
+              <w:top w:val="single" w:sz="6" w:space="0" w:color="DDDDDD"/>
+              <w:left w:val="single" w:sz="6" w:space="0" w:color="DDDDDD"/>
+              <w:bottom w:val="single" w:sz="6" w:space="0" w:color="DDDDDD"/>
+              <w:right w:val="single" w:sz="6" w:space="0" w:color="DDDDDD"/>
+            </w:tcBorders>
+            <w:shd w:val="clear" w:color="auto" w:fill="F2F2F2"/>
+            <w:tcMar>
+              <w:top w:w="120" w:type="dxa"/>
+              <w:left w:w="120" w:type="dxa"/>
+              <w:bottom w:w="120" w:type="dxa"/>
+              <w:right w:w="120" w:type="dxa"/>
+            </w:tcMar>
+            <w:vAlign w:val="center"/>
+            <w:hideMark/>
+          </w:tcPr>
+          <w:p>
+            <w:pPr>
+              <w:jc w:val="left"/>
+              <w:rPr>
+                <w:rFonts w:eastAsiaTheme="majorEastAsia" w:cstheme="majorBidi"/>
+                <w:b/>
+                <w:bCs/>
+                <w:color w:val="000000" w:themeColor="text1"/>
+              </w:rPr>
+            </w:pPr>
+            <w:r>
+              <w:rPr>
+                <w:rFonts w:eastAsiaTheme="majorEastAsia" w:cstheme="majorBidi"/>
+                <w:b/>
+                <w:bCs/>
+                <w:color w:val="000000" w:themeColor="text1"/>
+              </w:rPr>
+              <w:t>Item</w:t>
+            </w:r>
+          </w:p>
+        </w:tc>
+        <w:tc>
+          <w:tcPr>
+            <w:tcW w:w="0" w:type="auto"/>
+            <w:tcBorders>
+              <w:top w:val="single" w:sz="6" w:space="0" w:color="DDDDDD"/>
+              <w:left w:val="single" w:sz="6" w:space="0" w:color="DDDDDD"/>
+              <w:bottom w:val="single" w:sz="6" w:space="0" w:color="DDDDDD"/>
+              <w:right w:val="single" w:sz="6" w:space="0" w:color="DDDDDD"/>
+            </w:tcBorders>
+            <w:shd w:val="clear" w:color="auto" w:fill="F2F2F2"/>
+            <w:tcMar>
+              <w:top w:w="120" w:type="dxa"/>
+              <w:left w:w="120" w:type="dxa"/>
+              <w:bottom w:w="120" w:type="dxa"/>
+              <w:right w:w="120" w:type="dxa"/>
+            </w:tcMar>
+            <w:vAlign w:val="center"/>
+            <w:hideMark/>
+          </w:tcPr>
+          <w:p>
+            <w:pPr>
+              <w:jc w:val="left"/>
+              <w:rPr>
+                <w:rFonts w:eastAsiaTheme="majorEastAsia" w:cstheme="majorBidi"/>
+                <w:b/>
+                <w:bCs/>
+                <w:color w:val="000000" w:themeColor="text1"/>
+              </w:rPr>
+            </w:pPr>
+            <w:r>
+              <w:rPr>
+                <w:rFonts w:eastAsiaTheme="majorEastAsia" w:cstheme="majorBidi"/>
+                <w:b/>
+                <w:bCs/>
+                <w:color w:val="000000" w:themeColor="text1"/>
+              </w:rPr>
+              <w:t>Response</w:t>
+            </w:r>
+          </w:p>
+        </w:tc>
+      </w:tr>
+      <w:tr>
+        <w:tc>
+          <w:tcPr>
+            <w:tcW w:w="0" w:type="auto"/>
+            <w:tcBorders>
+              <w:top w:val="single" w:sz="6" w:space="0" w:color="DDDDDD"/>
+              <w:left w:val="single" w:sz="6" w:space="0" w:color="DDDDDD"/>
+              <w:bottom w:val="single" w:sz="6" w:space="0" w:color="DDDDDD"/>
+              <w:right w:val="single" w:sz="6" w:space="0" w:color="DDDDDD"/>
+            </w:tcBorders>
+            <w:tcMar>
+              <w:top w:w="120" w:type="dxa"/>
+              <w:left w:w="120" w:type="dxa"/>
+              <w:bottom w:w="120" w:type="dxa"/>
+              <w:right w:w="120" w:type="dxa"/>
+            </w:tcMar>
+            <w:vAlign w:val="center"/>
+            <w:hideMark/>
+          </w:tcPr>
+          <w:p>
+            <w:pPr>
+              <w:jc w:val="left"/>
+              <w:rPr>
+                <w:rFonts w:eastAsiaTheme="majorEastAsia" w:cstheme="majorBidi"/>
+                <w:color w:val="000000" w:themeColor="text1"/>
+              </w:rPr>
+            </w:pPr>
+            <w:r>
+              <w:rPr>
+                <w:rFonts w:eastAsiaTheme="majorEastAsia" w:cstheme="majorBidi"/>
+                <w:color w:val="000000" w:themeColor="text1"/>
+              </w:rPr>
+              <w:t>Word count</w:t>
+            </w:r>
+          </w:p>
+        </w:tc>
+        <w:tc>
+          <w:tcPr>
+            <w:tcW w:w="0" w:type="auto"/>
+            <w:tcBorders>
+              <w:top w:val="single" w:sz="6" w:space="0" w:color="DDDDDD"/>
+              <w:left w:val="single" w:sz="6" w:space="0" w:color="DDDDDD"/>
+              <w:bottom w:val="single" w:sz="6" w:space="0" w:color="DDDDDD"/>
+              <w:right w:val="single" w:sz="6" w:space="0" w:color="DDDDDD"/>
+            </w:tcBorders>
+            <w:tcMar>
+              <w:top w:w="120" w:type="dxa"/>
+              <w:left w:w="120" w:type="dxa"/>
+              <w:bottom w:w="120" w:type="dxa"/>
+              <w:right w:w="120" w:type="dxa"/>
+            </w:tcMar>
+            <w:vAlign w:val="center"/>
+            <w:hideMark/>
+          </w:tcPr>
+          <w:p>
+            <w:pPr>
+              <w:jc w:val="left"/>
+              <w:rPr>
+                <w:rFonts w:eastAsiaTheme="majorEastAsia" w:cstheme="majorBidi"/>
+                <w:color w:val="000000" w:themeColor="text1"/>
+              </w:rPr>
+            </w:pPr>
+            <w:r>
+              <w:rPr>
+                <w:rFonts w:eastAsiaTheme="majorEastAsia" w:cstheme="majorBidi"/>
+                <w:color w:val="000000" w:themeColor="text1"/>
+              </w:rPr>
+              <w:t>1478</w:t>
+            </w:r>
+          </w:p>
+        </w:tc>
+      </w:tr>
+      <w:tr>
+        <w:tc>
+          <w:tcPr>
+            <w:tcW w:w="0" w:type="auto"/>
+            <w:tcBorders>
+              <w:top w:val="single" w:sz="6" w:space="0" w:color="DDDDDD"/>
+              <w:left w:val="single" w:sz="6" w:space="0" w:color="DDDDDD"/>
+              <w:bottom w:val="single" w:sz="6" w:space="0" w:color="DDDDDD"/>
+              <w:right w:val="single" w:sz="6" w:space="0" w:color="DDDDDD"/>
+            </w:tcBorders>
+            <w:tcMar>
+              <w:top w:w="120" w:type="dxa"/>
+              <w:left w:w="120" w:type="dxa"/>
+              <w:bottom w:w="120" w:type="dxa"/>
+              <w:right w:w="120" w:type="dxa"/>
+            </w:tcMar>
+            <w:vAlign w:val="center"/>
+            <w:hideMark/>
+          </w:tcPr>
+          <w:p>
+            <w:pPr>
+              <w:jc w:val="left"/>
+              <w:rPr>
+                <w:rFonts w:eastAsiaTheme="majorEastAsia" w:cstheme="majorBidi"/>
+                <w:color w:val="000000" w:themeColor="text1"/>
+              </w:rPr>
+            </w:pPr>
+            <w:r>
+              <w:rPr>
+                <w:rFonts w:eastAsiaTheme="majorEastAsia" w:cstheme="majorBidi"/>
+                <w:color w:val="000000" w:themeColor="text1"/>
+              </w:rPr>
+              <w:t>Use of proof-reader/proof-reading service</w:t>
+            </w:r>
+          </w:p>
+        </w:tc>
+        <w:tc>
+          <w:tcPr>
+            <w:tcW w:w="0" w:type="auto"/>
+            <w:tcBorders>
+              <w:top w:val="single" w:sz="6" w:space="0" w:color="DDDDDD"/>
+              <w:left w:val="single" w:sz="6" w:space="0" w:color="DDDDDD"/>
+              <w:bottom w:val="single" w:sz="6" w:space="0" w:color="DDDDDD"/>
+              <w:right w:val="single" w:sz="6" w:space="0" w:color="DDDDDD"/>
+            </w:tcBorders>
+            <w:tcMar>
+              <w:top w:w="120" w:type="dxa"/>
+              <w:left w:w="120" w:type="dxa"/>
+              <w:bottom w:w="120" w:type="dxa"/>
+              <w:right w:w="120" w:type="dxa"/>
+            </w:tcMar>
+            <w:vAlign w:val="center"/>
+            <w:hideMark/>
+          </w:tcPr>
+          <w:p>
+            <w:pPr>
+              <w:jc w:val="left"/>
+              <w:rPr>
+                <w:rFonts w:eastAsiaTheme="majorEastAsia" w:cstheme="majorBidi"/>
+                <w:color w:val="000000" w:themeColor="text1"/>
+              </w:rPr>
+            </w:pPr>
+            <w:r>
+              <w:rPr>
+                <w:rFonts w:eastAsiaTheme="majorEastAsia" w:cstheme="majorBidi"/>
+                <w:color w:val="000000" w:themeColor="text1"/>
+              </w:rPr>
+              <w:t>NO</w:t>
+            </w:r>
+          </w:p>
+        </w:tc>
+      </w:tr>
+      <w:tr>
+        <w:tc>
+          <w:tcPr>
+            <w:tcW w:w="0" w:type="auto"/>
+            <w:tcBorders>
+              <w:top w:val="single" w:sz="6" w:space="0" w:color="DDDDDD"/>
+              <w:left w:val="single" w:sz="6" w:space="0" w:color="DDDDDD"/>
+              <w:bottom w:val="single" w:sz="6" w:space="0" w:color="DDDDDD"/>
+              <w:right w:val="single" w:sz="6" w:space="0" w:color="DDDDDD"/>
+            </w:tcBorders>
+            <w:tcMar>
+              <w:top w:w="120" w:type="dxa"/>
+              <w:left w:w="120" w:type="dxa"/>
+              <w:bottom w:w="120" w:type="dxa"/>
+              <w:right w:w="120" w:type="dxa"/>
+            </w:tcMar>
+            <w:vAlign w:val="center"/>
+            <w:hideMark/>
+          </w:tcPr>
+          <w:p>
+            <w:pPr>
+              <w:jc w:val="left"/>
+              <w:rPr>
+                <w:rFonts w:eastAsiaTheme="majorEastAsia" w:cstheme="majorBidi"/>
+                <w:color w:val="000000" w:themeColor="text1"/>
+              </w:rPr>
+            </w:pPr>
+            <w:r>
+              <w:rPr>
+                <w:rFonts w:eastAsiaTheme="majorEastAsia" w:cstheme="majorBidi"/>
+                <w:color w:val="000000" w:themeColor="text1"/>
+              </w:rPr>
+              <w:t>If yes, specify which service</w:t>
+            </w:r>
+          </w:p>
+        </w:tc>
+        <w:tc>
+          <w:tcPr>
+            <w:tcW w:w="0" w:type="auto"/>
+            <w:tcBorders>
+              <w:top w:val="single" w:sz="6" w:space="0" w:color="DDDDDD"/>
+              <w:left w:val="single" w:sz="6" w:space="0" w:color="DDDDDD"/>
+              <w:bottom w:val="single" w:sz="6" w:space="0" w:color="DDDDDD"/>
+              <w:right w:val="single" w:sz="6" w:space="0" w:color="DDDDDD"/>
+            </w:tcBorders>
+            <w:tcMar>
+              <w:top w:w="120" w:type="dxa"/>
+              <w:left w:w="120" w:type="dxa"/>
+              <w:bottom w:w="120" w:type="dxa"/>
+              <w:right w:w="120" w:type="dxa"/>
+            </w:tcMar>
+            <w:vAlign w:val="center"/>
+            <w:hideMark/>
+          </w:tcPr>
+          <w:p>
+            <w:pPr>
+              <w:jc w:val="left"/>
+              <w:rPr>
+                <w:rFonts w:eastAsiaTheme="majorEastAsia" w:cstheme="majorBidi"/>
+                <w:color w:val="000000" w:themeColor="text1"/>
+              </w:rPr>
+            </w:pPr>
+            <w:r>
+              <w:rPr>
+                <w:rFonts w:eastAsiaTheme="majorEastAsia" w:cstheme="majorBidi"/>
+                <w:color w:val="000000" w:themeColor="text1"/>
+              </w:rPr>
+              <w:t>N/A</w:t>
+            </w:r>
+          </w:p>
+        </w:tc>
+      </w:tr>
+      <w:tr>
+        <w:tc>
+          <w:tcPr>
+            <w:tcW w:w="0" w:type="auto"/>
+            <w:tcBorders>
+              <w:top w:val="single" w:sz="6" w:space="0" w:color="DDDDDD"/>
+              <w:left w:val="single" w:sz="6" w:space="0" w:color="DDDDDD"/>
+              <w:bottom w:val="single" w:sz="6" w:space="0" w:color="DDDDDD"/>
+              <w:right w:val="single" w:sz="6" w:space="0" w:color="DDDDDD"/>
+            </w:tcBorders>
+            <w:tcMar>
+              <w:top w:w="120" w:type="dxa"/>
+              <w:left w:w="120" w:type="dxa"/>
+              <w:bottom w:w="120" w:type="dxa"/>
+              <w:right w:w="120" w:type="dxa"/>
+            </w:tcMar>
+            <w:vAlign w:val="center"/>
+            <w:hideMark/>
+          </w:tcPr>
+          <w:p>
+            <w:pPr>
+              <w:jc w:val="left"/>
+              <w:rPr>
+                <w:rFonts w:eastAsiaTheme="majorEastAsia" w:cstheme="majorBidi"/>
+                <w:color w:val="000000" w:themeColor="text1"/>
+              </w:rPr>
+            </w:pPr>
+            <w:r>
+              <w:rPr>
+                <w:rFonts w:eastAsiaTheme="majorEastAsia" w:cstheme="majorBidi"/>
+                <w:color w:val="000000" w:themeColor="text1"/>
+              </w:rPr>
+              <w:t>I confirm that I submit this work as my own work and have cited all sources used</w:t>
+            </w:r>
+          </w:p>
+        </w:tc>
+        <w:tc>
+          <w:tcPr>
+            <w:tcW w:w="0" w:type="auto"/>
+            <w:tcBorders>
+              <w:top w:val="single" w:sz="6" w:space="0" w:color="DDDDDD"/>
+              <w:left w:val="single" w:sz="6" w:space="0" w:color="DDDDDD"/>
+              <w:bottom w:val="single" w:sz="6" w:space="0" w:color="DDDDDD"/>
+              <w:right w:val="single" w:sz="6" w:space="0" w:color="DDDDDD"/>
+            </w:tcBorders>
+            <w:tcMar>
+              <w:top w:w="120" w:type="dxa"/>
+              <w:left w:w="120" w:type="dxa"/>
+              <w:bottom w:w="120" w:type="dxa"/>
+              <w:right w:w="120" w:type="dxa"/>
+            </w:tcMar>
+            <w:vAlign w:val="center"/>
+            <w:hideMark/>
+          </w:tcPr>
+          <w:p>
+            <w:pPr>
+              <w:jc w:val="left"/>
+              <w:rPr>
+                <w:rFonts w:eastAsiaTheme="majorEastAsia" w:cstheme="majorBidi"/>
+                <w:color w:val="000000" w:themeColor="text1"/>
+              </w:rPr>
+            </w:pPr>
+            <w:r>
+              <w:rPr>
+                <w:rFonts w:eastAsiaTheme="majorEastAsia" w:cstheme="majorBidi"/>
+                <w:color w:val="000000" w:themeColor="text1"/>
+              </w:rPr>
+              <w:t>YES</w:t>
+            </w:r>
+          </w:p>
+        </w:tc>
+      </w:tr>
+      <w:tr>
+        <w:tc>
+          <w:tcPr>
+            <w:tcW w:w="0" w:type="auto"/>
+            <w:tcBorders>
+              <w:top w:val="single" w:sz="6" w:space="0" w:color="DDDDDD"/>
+              <w:left w:val="single" w:sz="6" w:space="0" w:color="DDDDDD"/>
+              <w:bottom w:val="single" w:sz="6" w:space="0" w:color="DDDDDD"/>
+              <w:right w:val="single" w:sz="6" w:space="0" w:color="DDDDDD"/>
+            </w:tcBorders>
+            <w:tcMar>
+              <w:top w:w="120" w:type="dxa"/>
+              <w:left w:w="120" w:type="dxa"/>
+              <w:bottom w:w="120" w:type="dxa"/>
+              <w:right w:w="120" w:type="dxa"/>
+            </w:tcMar>
+            <w:vAlign w:val="center"/>
+            <w:hideMark/>
+          </w:tcPr>
+          <w:p>
+            <w:pPr>
+              <w:jc w:val="left"/>
+              <w:rPr>
+                <w:rFonts w:eastAsiaTheme="majorEastAsia" w:cstheme="majorBidi"/>
+                <w:color w:val="000000" w:themeColor="text1"/>
+              </w:rPr>
+            </w:pPr>
+            <w:r>
+              <w:rPr>
+                <w:rFonts w:eastAsiaTheme="majorEastAsia" w:cstheme="majorBidi"/>
+                <w:color w:val="000000" w:themeColor="text1"/>
+              </w:rPr>
+              <w:t>I confirm that I have followed guidance on the acceptable use of AI tools for this assignment</w:t>
+            </w:r>
+          </w:p>
+        </w:tc>
+        <w:tc>
+          <w:tcPr>
+            <w:tcW w:w="0" w:type="auto"/>
+            <w:tcBorders>
+              <w:top w:val="single" w:sz="6" w:space="0" w:color="DDDDDD"/>
+              <w:left w:val="single" w:sz="6" w:space="0" w:color="DDDDDD"/>
+              <w:bottom w:val="single" w:sz="6" w:space="0" w:color="DDDDDD"/>
+              <w:right w:val="single" w:sz="6" w:space="0" w:color="DDDDDD"/>
+            </w:tcBorders>
+            <w:tcMar>
+              <w:top w:w="120" w:type="dxa"/>
+              <w:left w:w="120" w:type="dxa"/>
+              <w:bottom w:w="120" w:type="dxa"/>
+              <w:right w:w="120" w:type="dxa"/>
+            </w:tcMar>
+            <w:vAlign w:val="center"/>
+            <w:hideMark/>
+          </w:tcPr>
+          <w:p>
+            <w:pPr>
+              <w:jc w:val="left"/>
+              <w:rPr>
+                <w:rFonts w:eastAsiaTheme="majorEastAsia" w:cstheme="majorBidi"/>
+                <w:color w:val="000000" w:themeColor="text1"/>
+              </w:rPr>
+            </w:pPr>
+            <w:r>
+              <w:rPr>
+                <w:rFonts w:eastAsiaTheme="majorEastAsia" w:cstheme="majorBidi"/>
+                <w:color w:val="000000" w:themeColor="text1"/>
+              </w:rPr>
+              <w:t>YES</w:t>
+            </w:r>
+          </w:p>
+        </w:tc>
+      </w:tr>
+      <w:tr>
+        <w:tc>
+          <w:tcPr>
+            <w:tcW w:w="0" w:type="auto"/>
+            <w:tcBorders>
+              <w:top w:val="single" w:sz="6" w:space="0" w:color="DDDDDD"/>
+              <w:left w:val="single" w:sz="6" w:space="0" w:color="DDDDDD"/>
+              <w:bottom w:val="single" w:sz="6" w:space="0" w:color="DDDDDD"/>
+              <w:right w:val="single" w:sz="6" w:space="0" w:color="DDDDDD"/>
+            </w:tcBorders>
+            <w:tcMar>
+              <w:top w:w="120" w:type="dxa"/>
+              <w:left w:w="120" w:type="dxa"/>
+              <w:bottom w:w="120" w:type="dxa"/>
+              <w:right w:w="120" w:type="dxa"/>
+            </w:tcMar>
+            <w:vAlign w:val="center"/>
+            <w:hideMark/>
+          </w:tcPr>
+          <w:p>
+            <w:pPr>
+              <w:jc w:val="left"/>
+              <w:rPr>
+                <w:rFonts w:eastAsiaTheme="majorEastAsia" w:cstheme="majorBidi"/>
+                <w:color w:val="000000" w:themeColor="text1"/>
+              </w:rPr>
+            </w:pPr>
+            <w:r>
+              <w:rPr>
+                <w:rFonts w:eastAsiaTheme="majorEastAsia" w:cstheme="majorBidi"/>
+                <w:color w:val="000000" w:themeColor="text1"/>
+              </w:rPr>
+              <w:t>Where use of appropriately cited AI tools is permitted, I confirm that I have cited in accordance with the UCA Harvard Referencing Standard</w:t>
+            </w:r>
+          </w:p>
+        </w:tc>
+        <w:tc>
+          <w:tcPr>
+            <w:tcW w:w="0" w:type="auto"/>
+            <w:tcBorders>
+              <w:top w:val="single" w:sz="6" w:space="0" w:color="DDDDDD"/>
+              <w:left w:val="single" w:sz="6" w:space="0" w:color="DDDDDD"/>
+              <w:bottom w:val="single" w:sz="6" w:space="0" w:color="DDDDDD"/>
+              <w:right w:val="single" w:sz="6" w:space="0" w:color="DDDDDD"/>
+            </w:tcBorders>
+            <w:tcMar>
+              <w:top w:w="120" w:type="dxa"/>
+              <w:left w:w="120" w:type="dxa"/>
+              <w:bottom w:w="120" w:type="dxa"/>
+              <w:right w:w="120" w:type="dxa"/>
+            </w:tcMar>
+            <w:vAlign w:val="center"/>
+            <w:hideMark/>
+          </w:tcPr>
+          <w:p>
+            <w:pPr>
+              <w:jc w:val="left"/>
+              <w:rPr>
+                <w:rFonts w:eastAsiaTheme="majorEastAsia" w:cstheme="majorBidi"/>
+                <w:color w:val="000000" w:themeColor="text1"/>
+              </w:rPr>
+            </w:pPr>
+            <w:r>
+              <w:rPr>
+                <w:rFonts w:eastAsiaTheme="majorEastAsia" w:cstheme="majorBidi"/>
+                <w:color w:val="000000" w:themeColor="text1"/>
+              </w:rPr>
+              <w:t>YES</w:t>
+            </w:r>
+          </w:p>
+        </w:tc>
+      </w:tr>
+    </w:tbl>
+    <w:p>
+      <w:pPr>
+        <w:spacing w:after="160"/>
+        <w:jc w:val="left"/>
+        <w:rPr>
+          <w:rFonts w:eastAsiaTheme="majorEastAsia" w:cstheme="majorBidi"/>
+          <w:b/>
+          <w:color w:val="000000" w:themeColor="text1"/>
+          <w:sz w:val="32"/>
+          <w:szCs w:val="40"/>
+        </w:rPr>
+      </w:pPr>
+    </w:p>
+    <w:tbl>
+      <w:tblPr>
+        <w:tblW w:w="5000" w:type="pct"/>
+        <w:tblCellMar>
+          <w:top w:w="15" w:type="dxa"/>
+          <w:left w:w="15" w:type="dxa"/>
+          <w:bottom w:w="15" w:type="dxa"/>
+          <w:right w:w="15" w:type="dxa"/>
+        </w:tblCellMar>
+        <w:tblLook w:val="04A0" w:firstRow="1" w:lastRow="0" w:firstColumn="1" w:lastColumn="0" w:noHBand="0" w:noVBand="1"/>
+      </w:tblPr>
+      <w:tblGrid>
+        <w:gridCol w:w="5329"/>
+        <w:gridCol w:w="3681"/>
+      </w:tblGrid>
+      <w:tr>
+        <w:trPr>
+          <w:tblHeader/>
+        </w:trPr>
+        <w:tc>
+          <w:tcPr>
+            <w:tcW w:w="0" w:type="auto"/>
+            <w:tcBorders>
+              <w:top w:val="single" w:sz="6" w:space="0" w:color="DDDDDD"/>
+              <w:left w:val="single" w:sz="6" w:space="0" w:color="DDDDDD"/>
+              <w:bottom w:val="single" w:sz="6" w:space="0" w:color="DDDDDD"/>
+              <w:right w:val="single" w:sz="6" w:space="0" w:color="DDDDDD"/>
+            </w:tcBorders>
+            <w:shd w:val="clear" w:color="auto" w:fill="F2F2F2"/>
+            <w:tcMar>
+              <w:top w:w="120" w:type="dxa"/>
+              <w:left w:w="120" w:type="dxa"/>
+              <w:bottom w:w="120" w:type="dxa"/>
+              <w:right w:w="120" w:type="dxa"/>
+            </w:tcMar>
+            <w:vAlign w:val="center"/>
+            <w:hideMark/>
+          </w:tcPr>
+          <w:p>
+            <w:pPr>
+              <w:spacing w:after="160"/>
+              <w:jc w:val="left"/>
+              <w:rPr>
+                <w:rFonts w:eastAsiaTheme="majorEastAsia" w:cstheme="majorBidi"/>
+                <w:b/>
+                <w:bCs/>
+                <w:color w:val="000000" w:themeColor="text1"/>
+                <w:szCs w:val="32"/>
+              </w:rPr>
+            </w:pPr>
+            <w:r>
+              <w:rPr>
+                <w:rFonts w:eastAsiaTheme="majorEastAsia" w:cstheme="majorBidi"/>
+                <w:b/>
+                <w:bCs/>
+                <w:color w:val="000000" w:themeColor="text1"/>
+                <w:szCs w:val="32"/>
+              </w:rPr>
+              <w:t>Student signature</w:t>
+            </w:r>
+          </w:p>
+        </w:tc>
+        <w:tc>
+          <w:tcPr>
+            <w:tcW w:w="0" w:type="auto"/>
+            <w:tcBorders>
+              <w:top w:val="single" w:sz="6" w:space="0" w:color="DDDDDD"/>
+              <w:left w:val="single" w:sz="6" w:space="0" w:color="DDDDDD"/>
+              <w:bottom w:val="single" w:sz="6" w:space="0" w:color="DDDDDD"/>
+              <w:right w:val="single" w:sz="6" w:space="0" w:color="DDDDDD"/>
+            </w:tcBorders>
+            <w:shd w:val="clear" w:color="auto" w:fill="F2F2F2"/>
+            <w:tcMar>
+              <w:top w:w="120" w:type="dxa"/>
+              <w:left w:w="120" w:type="dxa"/>
+              <w:bottom w:w="120" w:type="dxa"/>
+              <w:right w:w="120" w:type="dxa"/>
+            </w:tcMar>
+            <w:vAlign w:val="center"/>
+            <w:hideMark/>
+          </w:tcPr>
+          <w:p>
+            <w:pPr>
+              <w:spacing w:after="160"/>
+              <w:jc w:val="left"/>
+              <w:rPr>
+                <w:rFonts w:eastAsiaTheme="majorEastAsia" w:cstheme="majorBidi"/>
+                <w:b/>
+                <w:bCs/>
+                <w:color w:val="000000" w:themeColor="text1"/>
+                <w:szCs w:val="32"/>
+              </w:rPr>
+            </w:pPr>
+            <w:r>
+              <w:rPr>
+                <w:rFonts w:eastAsiaTheme="majorEastAsia" w:cstheme="majorBidi"/>
+                <w:b/>
+                <w:bCs/>
+                <w:color w:val="000000" w:themeColor="text1"/>
+                <w:szCs w:val="32"/>
+              </w:rPr>
+              <w:t>Date</w:t>
+            </w:r>
+          </w:p>
+        </w:tc>
+      </w:tr>
+      <w:tr>
+        <w:tc>
+          <w:tcPr>
+            <w:tcW w:w="0" w:type="auto"/>
+            <w:tcBorders>
+              <w:top w:val="single" w:sz="6" w:space="0" w:color="DDDDDD"/>
+              <w:left w:val="single" w:sz="6" w:space="0" w:color="DDDDDD"/>
+              <w:bottom w:val="single" w:sz="6" w:space="0" w:color="DDDDDD"/>
+              <w:right w:val="single" w:sz="6" w:space="0" w:color="DDDDDD"/>
+            </w:tcBorders>
+            <w:tcMar>
+              <w:top w:w="120" w:type="dxa"/>
+              <w:left w:w="120" w:type="dxa"/>
+              <w:bottom w:w="120" w:type="dxa"/>
+              <w:right w:w="120" w:type="dxa"/>
+            </w:tcMar>
+            <w:vAlign w:val="center"/>
+            <w:hideMark/>
+          </w:tcPr>
+          <w:p>
+            <w:pPr>
+              <w:jc w:val="left"/>
+              <w:rPr>
+                <w:rFonts w:eastAsiaTheme="majorEastAsia" w:cstheme="majorBidi"/>
+                <w:b/>
+                <w:bCs/>
+                <w:color w:val="000000" w:themeColor="text1"/>
+              </w:rPr>
+            </w:pPr>
+            <w:r>
+              <w:rPr>
+                <w:noProof/>
+              </w:rPr>
+              <w:drawing>
+                <wp:inline distT="0" distB="0" distL="0" distR="0" wp14:anchorId="07C86EF1" wp14:editId="2F54B63E">
+                  <wp:extent cx="1295138" cy="495300"/>
+                  <wp:effectExtent l="0" t="0" r="0" b="0"/>
+                  <wp:docPr id="1079849710" name="Picture 4"/>
+                  <wp:cNvGraphicFramePr>
+                    <a:graphicFrameLocks xmlns:a="http://schemas.openxmlformats.org/drawingml/2006/main" noChangeAspect="1"/>
+                  </wp:cNvGraphicFramePr>
+                  <a:graphic xmlns:a="http://schemas.openxmlformats.org/drawingml/2006/main">
+                    <a:graphicData uri="http://schemas.openxmlformats.org/drawingml/2006/picture">
+                      <pic:pic xmlns:pic="http://schemas.openxmlformats.org/drawingml/2006/picture">
+                        <pic:nvPicPr>
+                          <pic:cNvPr id="542859284" name="Picture 542859284"/>
+                          <pic:cNvPicPr/>
+                        </pic:nvPicPr>
+                        <pic:blipFill rotWithShape="1">
+                          <a:blip r:embed="rId10" cstate="print">
+                            <a:extLst>
+                              <a:ext uri="{28A0092B-C50C-407E-A947-70E740481C1C}">
+                                <a14:useLocalDpi xmlns:a14="http://schemas.microsoft.com/office/drawing/2010/main" val="0"/>
+                              </a:ext>
+                            </a:extLst>
+                          </a:blip>
+                          <a:srcRect t="16857" b="16493"/>
+                          <a:stretch>
+                            <a:fillRect/>
+                          </a:stretch>
+                        </pic:blipFill>
+                        <pic:spPr bwMode="auto">
+                          <a:xfrm>
+                            <a:off x="0" y="0"/>
+                            <a:ext cx="1318583" cy="504266"/>
+                          </a:xfrm>
+                          <a:prstGeom prst="rect">
+                            <a:avLst/>
+                          </a:prstGeom>
+                          <a:ln>
+                            <a:noFill/>
+                          </a:ln>
+                          <a:extLst>
+                            <a:ext uri="{53640926-AAD7-44D8-BBD7-CCE9431645EC}">
+                              <a14:shadowObscured xmlns:a14="http://schemas.microsoft.com/office/drawing/2010/main"/>
+                            </a:ext>
+                          </a:extLst>
+                        </pic:spPr>
+                      </pic:pic>
+                    </a:graphicData>
+                  </a:graphic>
+                </wp:inline>
+              </w:drawing>
+            </w:r>
+          </w:p>
+        </w:tc>
+        <w:tc>
+          <w:tcPr>
+            <w:tcW w:w="0" w:type="auto"/>
+            <w:tcBorders>
+              <w:top w:val="single" w:sz="6" w:space="0" w:color="DDDDDD"/>
+              <w:left w:val="single" w:sz="6" w:space="0" w:color="DDDDDD"/>
+              <w:bottom w:val="single" w:sz="6" w:space="0" w:color="DDDDDD"/>
+              <w:right w:val="single" w:sz="6" w:space="0" w:color="DDDDDD"/>
+            </w:tcBorders>
+            <w:tcMar>
+              <w:top w:w="120" w:type="dxa"/>
+              <w:left w:w="120" w:type="dxa"/>
+              <w:bottom w:w="120" w:type="dxa"/>
+              <w:right w:w="120" w:type="dxa"/>
+            </w:tcMar>
+            <w:vAlign w:val="center"/>
+            <w:hideMark/>
+          </w:tcPr>
+          <w:p>
+            <w:pPr>
+              <w:spacing w:line="360" w:lineRule="auto"/>
+              <w:jc w:val="left"/>
+              <w:rPr>
+                <w:bCs/>
+              </w:rPr>
+            </w:pPr>
+            <w:r>
+              <w:rPr>
+                <w:bCs/>
+              </w:rPr>
+              <w:t>1</w:t>
+            </w:r>
+            <w:r>
+              <w:rPr>
+                <w:bCs/>
+              </w:rPr>
+              <w:t>7</w:t>
+            </w:r>
+            <w:r>
+              <w:rPr>
+                <w:bCs/>
+              </w:rPr>
+              <w:t xml:space="preserve"> / </w:t>
+            </w:r>
+            <w:r>
+              <w:rPr>
+                <w:bCs/>
+              </w:rPr>
+              <w:t>06</w:t>
+            </w:r>
+            <w:r>
+              <w:rPr>
+                <w:bCs/>
+              </w:rPr>
+              <w:t xml:space="preserve"> / 2026</w:t>
+            </w:r>
+          </w:p>
+        </w:tc>
+      </w:tr>
+    </w:tbl>
+    <w:p>
+      <w:r>
+        <w:br w:type="page"/>
+      </w:r>
+    </w:p>
+    <w:p>
+      <w:pPr>
         <w:rPr>
           <w:b/>
           <w:bCs/>
@@ -500,9 +1338,6 @@
           <w:szCs w:val="28"/>
         </w:rPr>
       </w:pPr>
-      <w:r>
-        <w:br w:type="page"/>
-      </w:r>
       <w:r>
         <w:rPr>
           <w:b/>
@@ -533,6 +1368,7 @@
         <w:p>
           <w:pPr>
             <w:pStyle w:val="TOC1"/>
+            <w:spacing w:line="240" w:lineRule="auto"/>
             <w:rPr>
               <w:rFonts w:asciiTheme="minorHAnsi" w:eastAsiaTheme="minorEastAsia" w:hAnsiTheme="minorHAnsi"/>
               <w:noProof/>
@@ -547,7 +1383,7 @@
           <w:r>
             <w:fldChar w:fldCharType="separate"/>
           </w:r>
-          <w:hyperlink w:anchor="_Toc231210622" w:history="1">
+          <w:hyperlink w:anchor="_Toc232626481" w:history="1">
             <w:r>
               <w:rPr>
                 <w:rStyle w:val="Hyperlink"/>
@@ -574,7 +1410,7 @@
                 <w:noProof/>
                 <w:webHidden/>
               </w:rPr>
-              <w:instrText xml:space="preserve"> PAGEREF _Toc231210622 \h </w:instrText>
+              <w:instrText xml:space="preserve"> PAGEREF _Toc232626481 \h </w:instrText>
             </w:r>
             <w:r>
               <w:rPr>
@@ -594,7 +1430,7 @@
                 <w:noProof/>
                 <w:webHidden/>
               </w:rPr>
-              <w:t>4</w:t>
+              <w:t>5</w:t>
             </w:r>
             <w:r>
               <w:rPr>
@@ -608,13 +1444,13 @@
         <w:p>
           <w:pPr>
             <w:pStyle w:val="TOC1"/>
-            <w:spacing w:before="0"/>
+            <w:spacing w:line="240" w:lineRule="auto"/>
             <w:rPr>
               <w:rFonts w:asciiTheme="minorHAnsi" w:eastAsiaTheme="minorEastAsia" w:hAnsiTheme="minorHAnsi"/>
               <w:noProof/>
             </w:rPr>
           </w:pPr>
-          <w:hyperlink w:anchor="_Toc231210623" w:history="1">
+          <w:hyperlink w:anchor="_Toc232626482" w:history="1">
             <w:r>
               <w:rPr>
                 <w:rStyle w:val="Hyperlink"/>
@@ -641,7 +1477,7 @@
                 <w:noProof/>
                 <w:webHidden/>
               </w:rPr>
-              <w:instrText xml:space="preserve"> PAGEREF _Toc231210623 \h </w:instrText>
+              <w:instrText xml:space="preserve"> PAGEREF _Toc232626482 \h </w:instrText>
             </w:r>
             <w:r>
               <w:rPr>
@@ -661,7 +1497,7 @@
                 <w:noProof/>
                 <w:webHidden/>
               </w:rPr>
-              <w:t>5</w:t>
+              <w:t>6</w:t>
             </w:r>
             <w:r>
               <w:rPr>
@@ -675,17 +1511,16 @@
         <w:p>
           <w:pPr>
             <w:pStyle w:val="TOC1"/>
-            <w:spacing w:before="0"/>
+            <w:spacing w:line="240" w:lineRule="auto"/>
             <w:rPr>
               <w:rFonts w:asciiTheme="minorHAnsi" w:eastAsiaTheme="minorEastAsia" w:hAnsiTheme="minorHAnsi"/>
               <w:noProof/>
             </w:rPr>
           </w:pPr>
-          <w:hyperlink w:anchor="_Toc231210624" w:history="1">
+          <w:hyperlink w:anchor="_Toc232626483" w:history="1">
             <w:r>
               <w:rPr>
                 <w:rStyle w:val="Hyperlink"/>
-                <w:rFonts w:cs="Times New Roman"/>
                 <w:noProof/>
               </w:rPr>
               <w:t>2.  Literature Review (2021–2025)</w:t>
@@ -709,7 +1544,7 @@
                 <w:noProof/>
                 <w:webHidden/>
               </w:rPr>
-              <w:instrText xml:space="preserve"> PAGEREF _Toc231210624 \h </w:instrText>
+              <w:instrText xml:space="preserve"> PAGEREF _Toc232626483 \h </w:instrText>
             </w:r>
             <w:r>
               <w:rPr>
@@ -729,7 +1564,7 @@
                 <w:noProof/>
                 <w:webHidden/>
               </w:rPr>
-              <w:t>6</w:t>
+              <w:t>7</w:t>
             </w:r>
             <w:r>
               <w:rPr>
@@ -746,12 +1581,13 @@
             <w:tabs>
               <w:tab w:val="right" w:leader="dot" w:pos="9016"/>
             </w:tabs>
+            <w:spacing w:line="240" w:lineRule="auto"/>
             <w:rPr>
               <w:rFonts w:asciiTheme="minorHAnsi" w:eastAsiaTheme="minorEastAsia" w:hAnsiTheme="minorHAnsi"/>
               <w:noProof/>
             </w:rPr>
           </w:pPr>
-          <w:hyperlink w:anchor="_Toc231210625" w:history="1">
+          <w:hyperlink w:anchor="_Toc232626484" w:history="1">
             <w:r>
               <w:rPr>
                 <w:rStyle w:val="Hyperlink"/>
@@ -778,7 +1614,7 @@
                 <w:noProof/>
                 <w:webHidden/>
               </w:rPr>
-              <w:instrText xml:space="preserve"> PAGEREF _Toc231210625 \h </w:instrText>
+              <w:instrText xml:space="preserve"> PAGEREF _Toc232626484 \h </w:instrText>
             </w:r>
             <w:r>
               <w:rPr>
@@ -798,7 +1634,7 @@
                 <w:noProof/>
                 <w:webHidden/>
               </w:rPr>
-              <w:t>6</w:t>
+              <w:t>7</w:t>
             </w:r>
             <w:r>
               <w:rPr>
@@ -815,12 +1651,13 @@
             <w:tabs>
               <w:tab w:val="right" w:leader="dot" w:pos="9016"/>
             </w:tabs>
+            <w:spacing w:line="240" w:lineRule="auto"/>
             <w:rPr>
               <w:rFonts w:asciiTheme="minorHAnsi" w:eastAsiaTheme="minorEastAsia" w:hAnsiTheme="minorHAnsi"/>
               <w:noProof/>
             </w:rPr>
           </w:pPr>
-          <w:hyperlink w:anchor="_Toc231210626" w:history="1">
+          <w:hyperlink w:anchor="_Toc232626485" w:history="1">
             <w:r>
               <w:rPr>
                 <w:rStyle w:val="Hyperlink"/>
@@ -847,7 +1684,7 @@
                 <w:noProof/>
                 <w:webHidden/>
               </w:rPr>
-              <w:instrText xml:space="preserve"> PAGEREF _Toc231210626 \h </w:instrText>
+              <w:instrText xml:space="preserve"> PAGEREF _Toc232626485 \h </w:instrText>
             </w:r>
             <w:r>
               <w:rPr>
@@ -867,7 +1704,7 @@
                 <w:noProof/>
                 <w:webHidden/>
               </w:rPr>
-              <w:t>6</w:t>
+              <w:t>7</w:t>
             </w:r>
             <w:r>
               <w:rPr>
@@ -884,12 +1721,13 @@
             <w:tabs>
               <w:tab w:val="right" w:leader="dot" w:pos="9016"/>
             </w:tabs>
+            <w:spacing w:line="240" w:lineRule="auto"/>
             <w:rPr>
               <w:rFonts w:asciiTheme="minorHAnsi" w:eastAsiaTheme="minorEastAsia" w:hAnsiTheme="minorHAnsi"/>
               <w:noProof/>
             </w:rPr>
           </w:pPr>
-          <w:hyperlink w:anchor="_Toc231210627" w:history="1">
+          <w:hyperlink w:anchor="_Toc232626486" w:history="1">
             <w:r>
               <w:rPr>
                 <w:rStyle w:val="Hyperlink"/>
@@ -916,7 +1754,7 @@
                 <w:noProof/>
                 <w:webHidden/>
               </w:rPr>
-              <w:instrText xml:space="preserve"> PAGEREF _Toc231210627 \h </w:instrText>
+              <w:instrText xml:space="preserve"> PAGEREF _Toc232626486 \h </w:instrText>
             </w:r>
             <w:r>
               <w:rPr>
@@ -950,17 +1788,16 @@
         <w:p>
           <w:pPr>
             <w:pStyle w:val="TOC1"/>
-            <w:spacing w:before="0"/>
+            <w:spacing w:line="240" w:lineRule="auto"/>
             <w:rPr>
               <w:rFonts w:asciiTheme="minorHAnsi" w:eastAsiaTheme="minorEastAsia" w:hAnsiTheme="minorHAnsi"/>
               <w:noProof/>
             </w:rPr>
           </w:pPr>
-          <w:hyperlink w:anchor="_Toc231210628" w:history="1">
+          <w:hyperlink w:anchor="_Toc232626487" w:history="1">
             <w:r>
               <w:rPr>
                 <w:rStyle w:val="Hyperlink"/>
-                <w:rFonts w:cs="Times New Roman"/>
                 <w:noProof/>
               </w:rPr>
               <w:t>3. AI Model Selection and Justification</w:t>
@@ -984,7 +1821,7 @@
                 <w:noProof/>
                 <w:webHidden/>
               </w:rPr>
-              <w:instrText xml:space="preserve"> PAGEREF _Toc231210628 \h </w:instrText>
+              <w:instrText xml:space="preserve"> PAGEREF _Toc232626487 \h </w:instrText>
             </w:r>
             <w:r>
               <w:rPr>
@@ -1021,12 +1858,13 @@
             <w:tabs>
               <w:tab w:val="right" w:leader="dot" w:pos="9016"/>
             </w:tabs>
+            <w:spacing w:line="240" w:lineRule="auto"/>
             <w:rPr>
               <w:rFonts w:asciiTheme="minorHAnsi" w:eastAsiaTheme="minorEastAsia" w:hAnsiTheme="minorHAnsi"/>
               <w:noProof/>
             </w:rPr>
           </w:pPr>
-          <w:hyperlink w:anchor="_Toc231210629" w:history="1">
+          <w:hyperlink w:anchor="_Toc232626488" w:history="1">
             <w:r>
               <w:rPr>
                 <w:rStyle w:val="Hyperlink"/>
@@ -1053,7 +1891,7 @@
                 <w:noProof/>
                 <w:webHidden/>
               </w:rPr>
-              <w:instrText xml:space="preserve"> PAGEREF _Toc231210629 \h </w:instrText>
+              <w:instrText xml:space="preserve"> PAGEREF _Toc232626488 \h </w:instrText>
             </w:r>
             <w:r>
               <w:rPr>
@@ -1090,12 +1928,13 @@
             <w:tabs>
               <w:tab w:val="right" w:leader="dot" w:pos="9016"/>
             </w:tabs>
+            <w:spacing w:line="240" w:lineRule="auto"/>
             <w:rPr>
               <w:rFonts w:asciiTheme="minorHAnsi" w:eastAsiaTheme="minorEastAsia" w:hAnsiTheme="minorHAnsi"/>
               <w:noProof/>
             </w:rPr>
           </w:pPr>
-          <w:hyperlink w:anchor="_Toc231210630" w:history="1">
+          <w:hyperlink w:anchor="_Toc232626489" w:history="1">
             <w:r>
               <w:rPr>
                 <w:rStyle w:val="Hyperlink"/>
@@ -1122,7 +1961,7 @@
                 <w:noProof/>
                 <w:webHidden/>
               </w:rPr>
-              <w:instrText xml:space="preserve"> PAGEREF _Toc231210630 \h </w:instrText>
+              <w:instrText xml:space="preserve"> PAGEREF _Toc232626489 \h </w:instrText>
             </w:r>
             <w:r>
               <w:rPr>
@@ -1156,13 +1995,13 @@
         <w:p>
           <w:pPr>
             <w:pStyle w:val="TOC1"/>
-            <w:spacing w:before="0"/>
+            <w:spacing w:line="240" w:lineRule="auto"/>
             <w:rPr>
               <w:rFonts w:asciiTheme="minorHAnsi" w:eastAsiaTheme="minorEastAsia" w:hAnsiTheme="minorHAnsi"/>
               <w:noProof/>
             </w:rPr>
           </w:pPr>
-          <w:hyperlink w:anchor="_Toc231210631" w:history="1">
+          <w:hyperlink w:anchor="_Toc232626490" w:history="1">
             <w:r>
               <w:rPr>
                 <w:rStyle w:val="Hyperlink"/>
@@ -1189,7 +2028,7 @@
                 <w:noProof/>
                 <w:webHidden/>
               </w:rPr>
-              <w:instrText xml:space="preserve"> PAGEREF _Toc231210631 \h </w:instrText>
+              <w:instrText xml:space="preserve"> PAGEREF _Toc232626490 \h </w:instrText>
             </w:r>
             <w:r>
               <w:rPr>
@@ -1209,7 +2048,7 @@
                 <w:noProof/>
                 <w:webHidden/>
               </w:rPr>
-              <w:t>10</w:t>
+              <w:t>9</w:t>
             </w:r>
             <w:r>
               <w:rPr>
@@ -1226,12 +2065,13 @@
             <w:tabs>
               <w:tab w:val="right" w:leader="dot" w:pos="9016"/>
             </w:tabs>
+            <w:spacing w:line="240" w:lineRule="auto"/>
             <w:rPr>
               <w:rFonts w:asciiTheme="minorHAnsi" w:eastAsiaTheme="minorEastAsia" w:hAnsiTheme="minorHAnsi"/>
               <w:noProof/>
             </w:rPr>
           </w:pPr>
-          <w:hyperlink w:anchor="_Toc231210632" w:history="1">
+          <w:hyperlink w:anchor="_Toc232626491" w:history="1">
             <w:r>
               <w:rPr>
                 <w:rStyle w:val="Hyperlink"/>
@@ -1258,7 +2098,7 @@
                 <w:noProof/>
                 <w:webHidden/>
               </w:rPr>
-              <w:instrText xml:space="preserve"> PAGEREF _Toc231210632 \h </w:instrText>
+              <w:instrText xml:space="preserve"> PAGEREF _Toc232626491 \h </w:instrText>
             </w:r>
             <w:r>
               <w:rPr>
@@ -1278,7 +2118,7 @@
                 <w:noProof/>
                 <w:webHidden/>
               </w:rPr>
-              <w:t>10</w:t>
+              <w:t>9</w:t>
             </w:r>
             <w:r>
               <w:rPr>
@@ -1295,12 +2135,13 @@
             <w:tabs>
               <w:tab w:val="right" w:leader="dot" w:pos="9016"/>
             </w:tabs>
+            <w:spacing w:line="240" w:lineRule="auto"/>
             <w:rPr>
               <w:rFonts w:asciiTheme="minorHAnsi" w:eastAsiaTheme="minorEastAsia" w:hAnsiTheme="minorHAnsi"/>
               <w:noProof/>
             </w:rPr>
           </w:pPr>
-          <w:hyperlink w:anchor="_Toc231210633" w:history="1">
+          <w:hyperlink w:anchor="_Toc232626492" w:history="1">
             <w:r>
               <w:rPr>
                 <w:rStyle w:val="Hyperlink"/>
@@ -1327,7 +2168,7 @@
                 <w:noProof/>
                 <w:webHidden/>
               </w:rPr>
-              <w:instrText xml:space="preserve"> PAGEREF _Toc231210633 \h </w:instrText>
+              <w:instrText xml:space="preserve"> PAGEREF _Toc232626492 \h </w:instrText>
             </w:r>
             <w:r>
               <w:rPr>
@@ -1347,7 +2188,7 @@
                 <w:noProof/>
                 <w:webHidden/>
               </w:rPr>
-              <w:t>10</w:t>
+              <w:t>9</w:t>
             </w:r>
             <w:r>
               <w:rPr>
@@ -1364,12 +2205,13 @@
             <w:tabs>
               <w:tab w:val="right" w:leader="dot" w:pos="9016"/>
             </w:tabs>
+            <w:spacing w:line="240" w:lineRule="auto"/>
             <w:rPr>
               <w:rFonts w:asciiTheme="minorHAnsi" w:eastAsiaTheme="minorEastAsia" w:hAnsiTheme="minorHAnsi"/>
               <w:noProof/>
             </w:rPr>
           </w:pPr>
-          <w:hyperlink w:anchor="_Toc231210634" w:history="1">
+          <w:hyperlink w:anchor="_Toc232626493" w:history="1">
             <w:r>
               <w:rPr>
                 <w:rStyle w:val="Hyperlink"/>
@@ -1396,7 +2238,7 @@
                 <w:noProof/>
                 <w:webHidden/>
               </w:rPr>
-              <w:instrText xml:space="preserve"> PAGEREF _Toc231210634 \h </w:instrText>
+              <w:instrText xml:space="preserve"> PAGEREF _Toc232626493 \h </w:instrText>
             </w:r>
             <w:r>
               <w:rPr>
@@ -1416,7 +2258,7 @@
                 <w:noProof/>
                 <w:webHidden/>
               </w:rPr>
-              <w:t>10</w:t>
+              <w:t>9</w:t>
             </w:r>
             <w:r>
               <w:rPr>
@@ -1433,12 +2275,13 @@
             <w:tabs>
               <w:tab w:val="right" w:leader="dot" w:pos="9016"/>
             </w:tabs>
+            <w:spacing w:line="240" w:lineRule="auto"/>
             <w:rPr>
               <w:rFonts w:asciiTheme="minorHAnsi" w:eastAsiaTheme="minorEastAsia" w:hAnsiTheme="minorHAnsi"/>
               <w:noProof/>
             </w:rPr>
           </w:pPr>
-          <w:hyperlink w:anchor="_Toc231210635" w:history="1">
+          <w:hyperlink w:anchor="_Toc232626494" w:history="1">
             <w:r>
               <w:rPr>
                 <w:rStyle w:val="Hyperlink"/>
@@ -1465,7 +2308,7 @@
                 <w:noProof/>
                 <w:webHidden/>
               </w:rPr>
-              <w:instrText xml:space="preserve"> PAGEREF _Toc231210635 \h </w:instrText>
+              <w:instrText xml:space="preserve"> PAGEREF _Toc232626494 \h </w:instrText>
             </w:r>
             <w:r>
               <w:rPr>
@@ -1485,7 +2328,7 @@
                 <w:noProof/>
                 <w:webHidden/>
               </w:rPr>
-              <w:t>10</w:t>
+              <w:t>9</w:t>
             </w:r>
             <w:r>
               <w:rPr>
@@ -1499,13 +2342,13 @@
         <w:p>
           <w:pPr>
             <w:pStyle w:val="TOC1"/>
-            <w:spacing w:before="0"/>
+            <w:spacing w:line="240" w:lineRule="auto"/>
             <w:rPr>
               <w:rFonts w:asciiTheme="minorHAnsi" w:eastAsiaTheme="minorEastAsia" w:hAnsiTheme="minorHAnsi"/>
               <w:noProof/>
             </w:rPr>
           </w:pPr>
-          <w:hyperlink w:anchor="_Toc231210636" w:history="1">
+          <w:hyperlink w:anchor="_Toc232626495" w:history="1">
             <w:r>
               <w:rPr>
                 <w:rStyle w:val="Hyperlink"/>
@@ -1532,7 +2375,7 @@
                 <w:noProof/>
                 <w:webHidden/>
               </w:rPr>
-              <w:instrText xml:space="preserve"> PAGEREF _Toc231210636 \h </w:instrText>
+              <w:instrText xml:space="preserve"> PAGEREF _Toc232626495 \h </w:instrText>
             </w:r>
             <w:r>
               <w:rPr>
@@ -1552,7 +2395,7 @@
                 <w:noProof/>
                 <w:webHidden/>
               </w:rPr>
-              <w:t>12</w:t>
+              <w:t>11</w:t>
             </w:r>
             <w:r>
               <w:rPr>
@@ -1569,12 +2412,13 @@
             <w:tabs>
               <w:tab w:val="right" w:leader="dot" w:pos="9016"/>
             </w:tabs>
+            <w:spacing w:line="240" w:lineRule="auto"/>
             <w:rPr>
               <w:rFonts w:asciiTheme="minorHAnsi" w:eastAsiaTheme="minorEastAsia" w:hAnsiTheme="minorHAnsi"/>
               <w:noProof/>
             </w:rPr>
           </w:pPr>
-          <w:hyperlink w:anchor="_Toc231210637" w:history="1">
+          <w:hyperlink w:anchor="_Toc232626496" w:history="1">
             <w:r>
               <w:rPr>
                 <w:rStyle w:val="Hyperlink"/>
@@ -1601,7 +2445,7 @@
                 <w:noProof/>
                 <w:webHidden/>
               </w:rPr>
-              <w:instrText xml:space="preserve"> PAGEREF _Toc231210637 \h </w:instrText>
+              <w:instrText xml:space="preserve"> PAGEREF _Toc232626496 \h </w:instrText>
             </w:r>
             <w:r>
               <w:rPr>
@@ -1621,7 +2465,7 @@
                 <w:noProof/>
                 <w:webHidden/>
               </w:rPr>
-              <w:t>12</w:t>
+              <w:t>11</w:t>
             </w:r>
             <w:r>
               <w:rPr>
@@ -1638,12 +2482,13 @@
             <w:tabs>
               <w:tab w:val="right" w:leader="dot" w:pos="9016"/>
             </w:tabs>
+            <w:spacing w:line="240" w:lineRule="auto"/>
             <w:rPr>
               <w:rFonts w:asciiTheme="minorHAnsi" w:eastAsiaTheme="minorEastAsia" w:hAnsiTheme="minorHAnsi"/>
               <w:noProof/>
             </w:rPr>
           </w:pPr>
-          <w:hyperlink w:anchor="_Toc231210638" w:history="1">
+          <w:hyperlink w:anchor="_Toc232626497" w:history="1">
             <w:r>
               <w:rPr>
                 <w:rStyle w:val="Hyperlink"/>
@@ -1670,7 +2515,7 @@
                 <w:noProof/>
                 <w:webHidden/>
               </w:rPr>
-              <w:instrText xml:space="preserve"> PAGEREF _Toc231210638 \h </w:instrText>
+              <w:instrText xml:space="preserve"> PAGEREF _Toc232626497 \h </w:instrText>
             </w:r>
             <w:r>
               <w:rPr>
@@ -1690,7 +2535,7 @@
                 <w:noProof/>
                 <w:webHidden/>
               </w:rPr>
-              <w:t>12</w:t>
+              <w:t>11</w:t>
             </w:r>
             <w:r>
               <w:rPr>
@@ -1707,12 +2552,13 @@
             <w:tabs>
               <w:tab w:val="right" w:leader="dot" w:pos="9016"/>
             </w:tabs>
+            <w:spacing w:line="240" w:lineRule="auto"/>
             <w:rPr>
               <w:rFonts w:asciiTheme="minorHAnsi" w:eastAsiaTheme="minorEastAsia" w:hAnsiTheme="minorHAnsi"/>
               <w:noProof/>
             </w:rPr>
           </w:pPr>
-          <w:hyperlink w:anchor="_Toc231210639" w:history="1">
+          <w:hyperlink w:anchor="_Toc232626498" w:history="1">
             <w:r>
               <w:rPr>
                 <w:rStyle w:val="Hyperlink"/>
@@ -1739,7 +2585,7 @@
                 <w:noProof/>
                 <w:webHidden/>
               </w:rPr>
-              <w:instrText xml:space="preserve"> PAGEREF _Toc231210639 \h </w:instrText>
+              <w:instrText xml:space="preserve"> PAGEREF _Toc232626498 \h </w:instrText>
             </w:r>
             <w:r>
               <w:rPr>
@@ -1759,7 +2605,7 @@
                 <w:noProof/>
                 <w:webHidden/>
               </w:rPr>
-              <w:t>12</w:t>
+              <w:t>11</w:t>
             </w:r>
             <w:r>
               <w:rPr>
@@ -1773,13 +2619,13 @@
         <w:p>
           <w:pPr>
             <w:pStyle w:val="TOC1"/>
-            <w:spacing w:before="0"/>
+            <w:spacing w:line="240" w:lineRule="auto"/>
             <w:rPr>
               <w:rFonts w:asciiTheme="minorHAnsi" w:eastAsiaTheme="minorEastAsia" w:hAnsiTheme="minorHAnsi"/>
               <w:noProof/>
             </w:rPr>
           </w:pPr>
-          <w:hyperlink w:anchor="_Toc231210640" w:history="1">
+          <w:hyperlink w:anchor="_Toc232626499" w:history="1">
             <w:r>
               <w:rPr>
                 <w:rStyle w:val="Hyperlink"/>
@@ -1806,7 +2652,7 @@
                 <w:noProof/>
                 <w:webHidden/>
               </w:rPr>
-              <w:instrText xml:space="preserve"> PAGEREF _Toc231210640 \h </w:instrText>
+              <w:instrText xml:space="preserve"> PAGEREF _Toc232626499 \h </w:instrText>
             </w:r>
             <w:r>
               <w:rPr>
@@ -1826,7 +2672,7 @@
                 <w:noProof/>
                 <w:webHidden/>
               </w:rPr>
-              <w:t>14</w:t>
+              <w:t>13</w:t>
             </w:r>
             <w:r>
               <w:rPr>
@@ -1843,12 +2689,13 @@
             <w:tabs>
               <w:tab w:val="right" w:leader="dot" w:pos="9016"/>
             </w:tabs>
+            <w:spacing w:line="240" w:lineRule="auto"/>
             <w:rPr>
               <w:rFonts w:asciiTheme="minorHAnsi" w:eastAsiaTheme="minorEastAsia" w:hAnsiTheme="minorHAnsi"/>
               <w:noProof/>
             </w:rPr>
           </w:pPr>
-          <w:hyperlink w:anchor="_Toc231210641" w:history="1">
+          <w:hyperlink w:anchor="_Toc232626500" w:history="1">
             <w:r>
               <w:rPr>
                 <w:rStyle w:val="Hyperlink"/>
@@ -1875,7 +2722,7 @@
                 <w:noProof/>
                 <w:webHidden/>
               </w:rPr>
-              <w:instrText xml:space="preserve"> PAGEREF _Toc231210641 \h </w:instrText>
+              <w:instrText xml:space="preserve"> PAGEREF _Toc232626500 \h </w:instrText>
             </w:r>
             <w:r>
               <w:rPr>
@@ -1895,7 +2742,7 @@
                 <w:noProof/>
                 <w:webHidden/>
               </w:rPr>
-              <w:t>14</w:t>
+              <w:t>13</w:t>
             </w:r>
             <w:r>
               <w:rPr>
@@ -1912,12 +2759,13 @@
             <w:tabs>
               <w:tab w:val="right" w:leader="dot" w:pos="9016"/>
             </w:tabs>
+            <w:spacing w:line="240" w:lineRule="auto"/>
             <w:rPr>
               <w:rFonts w:asciiTheme="minorHAnsi" w:eastAsiaTheme="minorEastAsia" w:hAnsiTheme="minorHAnsi"/>
               <w:noProof/>
             </w:rPr>
           </w:pPr>
-          <w:hyperlink w:anchor="_Toc231210642" w:history="1">
+          <w:hyperlink w:anchor="_Toc232626501" w:history="1">
             <w:r>
               <w:rPr>
                 <w:rStyle w:val="Hyperlink"/>
@@ -1944,7 +2792,7 @@
                 <w:noProof/>
                 <w:webHidden/>
               </w:rPr>
-              <w:instrText xml:space="preserve"> PAGEREF _Toc231210642 \h </w:instrText>
+              <w:instrText xml:space="preserve"> PAGEREF _Toc232626501 \h </w:instrText>
             </w:r>
             <w:r>
               <w:rPr>
@@ -1964,7 +2812,7 @@
                 <w:noProof/>
                 <w:webHidden/>
               </w:rPr>
-              <w:t>14</w:t>
+              <w:t>13</w:t>
             </w:r>
             <w:r>
               <w:rPr>
@@ -1981,12 +2829,13 @@
             <w:tabs>
               <w:tab w:val="right" w:leader="dot" w:pos="9016"/>
             </w:tabs>
+            <w:spacing w:line="240" w:lineRule="auto"/>
             <w:rPr>
               <w:rFonts w:asciiTheme="minorHAnsi" w:eastAsiaTheme="minorEastAsia" w:hAnsiTheme="minorHAnsi"/>
               <w:noProof/>
             </w:rPr>
           </w:pPr>
-          <w:hyperlink w:anchor="_Toc231210643" w:history="1">
+          <w:hyperlink w:anchor="_Toc232626502" w:history="1">
             <w:r>
               <w:rPr>
                 <w:rStyle w:val="Hyperlink"/>
@@ -2013,7 +2862,7 @@
                 <w:noProof/>
                 <w:webHidden/>
               </w:rPr>
-              <w:instrText xml:space="preserve"> PAGEREF _Toc231210643 \h </w:instrText>
+              <w:instrText xml:space="preserve"> PAGEREF _Toc232626502 \h </w:instrText>
             </w:r>
             <w:r>
               <w:rPr>
@@ -2033,7 +2882,7 @@
                 <w:noProof/>
                 <w:webHidden/>
               </w:rPr>
-              <w:t>14</w:t>
+              <w:t>13</w:t>
             </w:r>
             <w:r>
               <w:rPr>
@@ -2047,19 +2896,33 @@
         <w:p>
           <w:pPr>
             <w:pStyle w:val="TOC1"/>
-            <w:spacing w:before="0"/>
+            <w:spacing w:line="240" w:lineRule="auto"/>
             <w:rPr>
               <w:rFonts w:asciiTheme="minorHAnsi" w:eastAsiaTheme="minorEastAsia" w:hAnsiTheme="minorHAnsi"/>
               <w:noProof/>
             </w:rPr>
           </w:pPr>
-          <w:hyperlink w:anchor="_Toc231210644" w:history="1">
+          <w:hyperlink w:anchor="_Toc232626503" w:history="1">
             <w:r>
               <w:rPr>
                 <w:rStyle w:val="Hyperlink"/>
                 <w:noProof/>
               </w:rPr>
-              <w:t>7. Concluding Remarks</w:t>
+              <w:t>7. Concluding R</w:t>
+            </w:r>
+            <w:r>
+              <w:rPr>
+                <w:rStyle w:val="Hyperlink"/>
+                <w:noProof/>
+              </w:rPr>
+              <w:t>e</w:t>
+            </w:r>
+            <w:r>
+              <w:rPr>
+                <w:rStyle w:val="Hyperlink"/>
+                <w:noProof/>
+              </w:rPr>
+              <w:t>marks</w:t>
             </w:r>
             <w:r>
               <w:rPr>
@@ -2080,7 +2943,7 @@
                 <w:noProof/>
                 <w:webHidden/>
               </w:rPr>
-              <w:instrText xml:space="preserve"> PAGEREF _Toc231210644 \h </w:instrText>
+              <w:instrText xml:space="preserve"> PAGEREF _Toc232626503 \h </w:instrText>
             </w:r>
             <w:r>
               <w:rPr>
@@ -2100,7 +2963,7 @@
                 <w:noProof/>
                 <w:webHidden/>
               </w:rPr>
-              <w:t>16</w:t>
+              <w:t>14</w:t>
             </w:r>
             <w:r>
               <w:rPr>
@@ -2114,13 +2977,95 @@
         <w:p>
           <w:pPr>
             <w:pStyle w:val="TOC1"/>
+            <w:spacing w:line="240" w:lineRule="auto"/>
+            <w:rPr>
+              <w:rFonts w:asciiTheme="minorHAnsi" w:eastAsiaTheme="minorEastAsia" w:hAnsiTheme="minorHAnsi"/>
+              <w:noProof/>
+            </w:rPr>
           </w:pPr>
-          <w:hyperlink w:anchor="_Toc231210645" w:history="1">
+          <w:hyperlink w:anchor="_Toc232626504" w:history="1">
             <w:r>
               <w:rPr>
                 <w:rStyle w:val="Hyperlink"/>
                 <w:noProof/>
               </w:rPr>
+              <w:t>Acknowledgem</w:t>
+            </w:r>
+            <w:r>
+              <w:rPr>
+                <w:rStyle w:val="Hyperlink"/>
+                <w:noProof/>
+              </w:rPr>
+              <w:t>e</w:t>
+            </w:r>
+            <w:r>
+              <w:rPr>
+                <w:rStyle w:val="Hyperlink"/>
+                <w:noProof/>
+              </w:rPr>
+              <w:t>nt</w:t>
+            </w:r>
+            <w:r>
+              <w:rPr>
+                <w:noProof/>
+                <w:webHidden/>
+              </w:rPr>
+              <w:tab/>
+            </w:r>
+            <w:r>
+              <w:rPr>
+                <w:noProof/>
+                <w:webHidden/>
+              </w:rPr>
+              <w:fldChar w:fldCharType="begin"/>
+            </w:r>
+            <w:r>
+              <w:rPr>
+                <w:noProof/>
+                <w:webHidden/>
+              </w:rPr>
+              <w:instrText xml:space="preserve"> PAGEREF _Toc232626504 \h </w:instrText>
+            </w:r>
+            <w:r>
+              <w:rPr>
+                <w:noProof/>
+                <w:webHidden/>
+              </w:rPr>
+            </w:r>
+            <w:r>
+              <w:rPr>
+                <w:noProof/>
+                <w:webHidden/>
+              </w:rPr>
+              <w:fldChar w:fldCharType="separate"/>
+            </w:r>
+            <w:r>
+              <w:rPr>
+                <w:noProof/>
+                <w:webHidden/>
+              </w:rPr>
+              <w:t>15</w:t>
+            </w:r>
+            <w:r>
+              <w:rPr>
+                <w:noProof/>
+                <w:webHidden/>
+              </w:rPr>
+              <w:fldChar w:fldCharType="end"/>
+            </w:r>
+          </w:hyperlink>
+        </w:p>
+        <w:p>
+          <w:pPr>
+            <w:pStyle w:val="TOC1"/>
+            <w:spacing w:line="240" w:lineRule="auto"/>
+          </w:pPr>
+          <w:hyperlink w:anchor="_Toc232626505" w:history="1">
+            <w:r>
+              <w:rPr>
+                <w:rStyle w:val="Hyperlink"/>
+                <w:noProof/>
+              </w:rPr>
               <w:t>References</w:t>
             </w:r>
             <w:r>
@@ -2142,7 +3087,7 @@
                 <w:noProof/>
                 <w:webHidden/>
               </w:rPr>
-              <w:instrText xml:space="preserve"> PAGEREF _Toc231210645 \h </w:instrText>
+              <w:instrText xml:space="preserve"> PAGEREF _Toc232626505 \h </w:instrText>
             </w:r>
             <w:r>
               <w:rPr>
@@ -2162,7 +3107,7 @@
                 <w:noProof/>
                 <w:webHidden/>
               </w:rPr>
-              <w:t>17</w:t>
+              <w:t>16</w:t>
             </w:r>
             <w:r>
               <w:rPr>
@@ -2362,7 +3307,7 @@
             <w:noProof/>
             <w:webHidden/>
           </w:rPr>
-          <w:t>11</w:t>
+          <w:t>9</w:t>
         </w:r>
         <w:r>
           <w:rPr>
@@ -2391,7 +3336,21 @@
             <w:rStyle w:val="Hyperlink"/>
             <w:noProof/>
           </w:rPr>
-          <w:t>Table 3: Experimental Design Summary.</w:t>
+          <w:t>Table 3: Experimental D</w:t>
+        </w:r>
+        <w:r>
+          <w:rPr>
+            <w:rStyle w:val="Hyperlink"/>
+            <w:noProof/>
+          </w:rPr>
+          <w:t>e</w:t>
+        </w:r>
+        <w:r>
+          <w:rPr>
+            <w:rStyle w:val="Hyperlink"/>
+            <w:noProof/>
+          </w:rPr>
+          <w:t>sign Summary.</w:t>
         </w:r>
         <w:r>
           <w:rPr>
@@ -2432,7 +3391,7 @@
             <w:noProof/>
             <w:webHidden/>
           </w:rPr>
-          <w:t>12</w:t>
+          <w:t>11</w:t>
         </w:r>
         <w:r>
           <w:rPr>
@@ -2635,7 +3594,25 @@
         <w:rPr>
           <w:u w:val="dotted"/>
         </w:rPr>
-        <w:t>27 / May / 2026</w:t>
+        <w:t>1</w:t>
+      </w:r>
+      <w:r>
+        <w:rPr>
+          <w:u w:val="dotted"/>
+        </w:rPr>
+        <w:t xml:space="preserve">7 / </w:t>
+      </w:r>
+      <w:r>
+        <w:rPr>
+          <w:u w:val="dotted"/>
+        </w:rPr>
+        <w:t>June</w:t>
+      </w:r>
+      <w:r>
+        <w:rPr>
+          <w:u w:val="dotted"/>
+        </w:rPr>
+        <w:t xml:space="preserve"> / 2026</w:t>
       </w:r>
     </w:p>
     <w:p/>
@@ -2652,7 +3629,7 @@
       <w:pPr>
         <w:pStyle w:val="Heading1"/>
       </w:pPr>
-      <w:bookmarkStart w:id="0" w:name="_Toc231210622"/>
+      <w:bookmarkStart w:id="0" w:name="_Toc232626481"/>
       <w:r>
         <w:lastRenderedPageBreak/>
         <w:t>Executive Summary</w:t>
@@ -2664,7 +3641,21 @@
         <w:spacing w:before="240" w:line="360" w:lineRule="auto"/>
       </w:pPr>
       <w:r>
-        <w:t>This essay investigates AI-driven predictive maintenance (PdM) for smart manufacturing, focusing on sensor-based fault detection and Remaining Useful Life (RUL) estimation. Drawing on twelve peer-reviewed sources (2021–2025), it evaluates dominant methodologies, benchmark datasets, and key research gaps.</w:t>
+        <w:t>This essay investigates AI-driven predictive maintenance (</w:t>
+      </w:r>
+      <w:proofErr w:type="spellStart"/>
+      <w:r>
+        <w:t>PdM</w:t>
+      </w:r>
+      <w:proofErr w:type="spellEnd"/>
+      <w:r>
+        <w:t xml:space="preserve">) for smart manufacturing, focusing on sensor-based fault detection and Remaining Useful Life (RUL) estimation. </w:t>
+      </w:r>
+      <w:r>
+        <w:t>Drawing on twelve peer-reviewed sources (2021–2025), it evaluates methodologies, datasets, and key gaps</w:t>
+      </w:r>
+      <w:r>
+        <w:t>.</w:t>
       </w:r>
     </w:p>
     <w:p>
@@ -2688,7 +3679,7 @@
       <w:pPr>
         <w:pStyle w:val="Heading1"/>
       </w:pPr>
-      <w:bookmarkStart w:id="1" w:name="_Toc231210623"/>
+      <w:bookmarkStart w:id="1" w:name="_Toc232626482"/>
       <w:r>
         <w:lastRenderedPageBreak/>
         <w:t xml:space="preserve">1. </w:t>
@@ -2703,7 +3694,26 @@
         <w:spacing w:before="240" w:line="360" w:lineRule="auto"/>
       </w:pPr>
       <w:r>
-        <w:t>Unplanned equipment downtime imposes significant production and repair costs on industrial manufacturers. Reactive and preventive maintenance strategies are increasingly inadequate in Industry 4.0 environments, where interconnected sensor networks generate continuous streams of vibration, temperature, pressure, and acoustic data. Predictive maintenance (PdM) uses AI models to forecast failures before they occur, enabling proactive scheduling and cost reduction (Bampoula et al., 2024).</w:t>
+        <w:t>Unplanned downtime imposes major costs on manufacturers. Reactive and preventive strategies are increasingly inadequate in Industry 4.0, where sensor networks generate continuous vibration, temperature, pressure, and acoustic data</w:t>
+      </w:r>
+      <w:r>
+        <w:t>. Predictive maintenance (</w:t>
+      </w:r>
+      <w:proofErr w:type="spellStart"/>
+      <w:r>
+        <w:t>PdM</w:t>
+      </w:r>
+      <w:proofErr w:type="spellEnd"/>
+      <w:r>
+        <w:t>) uses AI models to forecast failures before they occur, enabling proactive scheduling and cost reduction (</w:t>
+      </w:r>
+      <w:proofErr w:type="spellStart"/>
+      <w:r>
+        <w:t>Bampoula</w:t>
+      </w:r>
+      <w:proofErr w:type="spellEnd"/>
+      <w:r>
+        <w:t xml:space="preserve"> et al., 2024).</w:t>
       </w:r>
     </w:p>
     <w:p>
@@ -2711,7 +3721,13 @@
         <w:spacing w:before="240" w:line="360" w:lineRule="auto"/>
       </w:pPr>
       <w:r>
-        <w:t>In the case study, a smart manufacturing company operates pumps, motors, and conveyor systems, each instrumented at high frequency. Management requires a solution to estimate the RUL of each component and flag anomalies ahead of breakdowns. This essay addresses all five brief tasks: literature review (Task 1), model selection (Task 2), data preprocessing (Task 3), experimental design (Task 4), and critical analysis of deployment considerations (Task 5).</w:t>
+        <w:t xml:space="preserve">In the case study, a smart manufacturing company operates pumps, motors, and conveyor systems, each instrumented at high frequency. Management requires a solution to estimate the RUL of each component and flag anomalies ahead of breakdowns. </w:t>
+      </w:r>
+      <w:r>
+        <w:t>This essay addresses all five brief tasks: literature review, model selection, preprocessing, experimental design, and critical analysis of deployment</w:t>
+      </w:r>
+      <w:r>
+        <w:t>.</w:t>
       </w:r>
     </w:p>
     <w:p/>
@@ -2725,7 +3741,7 @@
       <w:r>
         <w:br w:type="page"/>
       </w:r>
-      <w:bookmarkStart w:id="2" w:name="_Toc231210624"/>
+      <w:bookmarkStart w:id="2" w:name="_Toc232626483"/>
       <w:r>
         <w:rPr>
           <w:rFonts w:eastAsiaTheme="minorHAnsi"/>
@@ -2763,7 +3779,41 @@
         <w:rPr>
           <w:rFonts w:cs="Times New Roman"/>
         </w:rPr>
-        <w:t>AI-driven PdM research has grown substantially since 2021, fuelled by affordable sensors and maturing deep learning toolchains. This section critically synthesises twelve peer-reviewed sources across methodologies, datasets, and gaps.</w:t>
+        <w:t xml:space="preserve">AI-driven </w:t>
+      </w:r>
+      <w:proofErr w:type="spellStart"/>
+      <w:r>
+        <w:rPr>
+          <w:rFonts w:cs="Times New Roman"/>
+        </w:rPr>
+        <w:t>PdM</w:t>
+      </w:r>
+      <w:proofErr w:type="spellEnd"/>
+      <w:r>
+        <w:rPr>
+          <w:rFonts w:cs="Times New Roman"/>
+        </w:rPr>
+        <w:t xml:space="preserve"> research has grown substantially since 2021, </w:t>
+      </w:r>
+      <w:proofErr w:type="spellStart"/>
+      <w:r>
+        <w:rPr>
+          <w:rFonts w:cs="Times New Roman"/>
+        </w:rPr>
+        <w:t>fuelled</w:t>
+      </w:r>
+      <w:proofErr w:type="spellEnd"/>
+      <w:r>
+        <w:rPr>
+          <w:rFonts w:cs="Times New Roman"/>
+        </w:rPr>
+        <w:t xml:space="preserve"> by affordable sensors and maturing deep learning toolchains</w:t>
+      </w:r>
+      <w:r>
+        <w:rPr>
+          <w:rFonts w:cs="Times New Roman"/>
+        </w:rPr>
+        <w:t>.</w:t>
       </w:r>
     </w:p>
     <w:p>
@@ -2776,7 +3826,7 @@
         </w:rPr>
       </w:pPr>
       <w:bookmarkStart w:id="4" w:name="_Toc231156490"/>
-      <w:bookmarkStart w:id="5" w:name="_Toc231210625"/>
+      <w:bookmarkStart w:id="5" w:name="_Toc232626484"/>
       <w:r>
         <w:t xml:space="preserve">2.1 </w:t>
       </w:r>
@@ -2802,7 +3852,35 @@
         <w:rPr>
           <w:rFonts w:cs="Times New Roman"/>
         </w:rPr>
-        <w:t>Recurrent deep learning dominates recent PdM literature. Bampoula et al. (2024) compare LSTM autoencoders with Transformer encoders on manufacturing time-series data, finding that Transformers better capture long-range temporal dependencies under non-stationary conditions</w:t>
+        <w:t xml:space="preserve">Recurrent deep learning dominates recent </w:t>
+      </w:r>
+      <w:proofErr w:type="spellStart"/>
+      <w:r>
+        <w:rPr>
+          <w:rFonts w:cs="Times New Roman"/>
+        </w:rPr>
+        <w:t>PdM</w:t>
+      </w:r>
+      <w:proofErr w:type="spellEnd"/>
+      <w:r>
+        <w:rPr>
+          <w:rFonts w:cs="Times New Roman"/>
+        </w:rPr>
+        <w:t xml:space="preserve"> literature; </w:t>
+      </w:r>
+      <w:proofErr w:type="spellStart"/>
+      <w:r>
+        <w:rPr>
+          <w:rFonts w:cs="Times New Roman"/>
+        </w:rPr>
+        <w:t>Bampoula</w:t>
+      </w:r>
+      <w:proofErr w:type="spellEnd"/>
+      <w:r>
+        <w:rPr>
+          <w:rFonts w:cs="Times New Roman"/>
+        </w:rPr>
+        <w:t xml:space="preserve"> et al. (2024) find Transformer encoders capture long-range dependencies better than LSTM autoencoders</w:t>
       </w:r>
       <w:r>
         <w:rPr>
@@ -2822,7 +3900,55 @@
         <w:rPr>
           <w:rFonts w:cs="Times New Roman"/>
         </w:rPr>
-        <w:t>Temporal Convolutional Networks (TCNs) have gained substantial traction as an alternative. Fatahi et al. (2024) introduce a TCN–Autoencoder with Multi-Head Attention for gas turbine fault detection, outperforming LSTM-Autoencoder and GRU-Autoencoder baselines with MSE 1.447, RMSE 1.193, and MAE 0.712. TCNs use dilated causal convolutions enabling full parallelisation, a scalability advantage over sequential LSTM computation (Abdelhedi and Bouri, 2025).</w:t>
+        <w:t xml:space="preserve">TCNs have also gained traction. </w:t>
+      </w:r>
+      <w:r>
+        <w:rPr>
+          <w:rFonts w:cs="Times New Roman"/>
+        </w:rPr>
+        <w:t>Fahmi et al. (2024)</w:t>
+      </w:r>
+      <w:r>
+        <w:rPr>
+          <w:rFonts w:cs="Times New Roman"/>
+        </w:rPr>
+        <w:t xml:space="preserve"> introduce</w:t>
+      </w:r>
+      <w:r>
+        <w:rPr>
+          <w:rFonts w:cs="Times New Roman"/>
+        </w:rPr>
+        <w:t xml:space="preserve"> </w:t>
+      </w:r>
+      <w:r>
+        <w:rPr>
+          <w:rFonts w:cs="Times New Roman"/>
+        </w:rPr>
+        <w:t>a TCN–Autoencoder with Multi-Head Attention for gas turbine fault detection, outperforming LSTM- and GRU-Autoencoder baselines (MSE 1.447, RMSE 1.193, MAE 0.712)</w:t>
+      </w:r>
+      <w:r>
+        <w:rPr>
+          <w:rFonts w:cs="Times New Roman"/>
+        </w:rPr>
+        <w:t xml:space="preserve">. </w:t>
+      </w:r>
+      <w:r>
+        <w:rPr>
+          <w:rFonts w:cs="Times New Roman"/>
+        </w:rPr>
+        <w:t>TCNs use dilated causal convolutions enabling full parallelisation, a scalability advantage over LSTMs (</w:t>
+      </w:r>
+      <w:r>
+        <w:rPr>
+          <w:rFonts w:cs="Times New Roman"/>
+        </w:rPr>
+        <w:t>Mao et al., 2025</w:t>
+      </w:r>
+      <w:r>
+        <w:rPr>
+          <w:rFonts w:cs="Times New Roman"/>
+        </w:rPr>
+        <w:t>).</w:t>
       </w:r>
     </w:p>
     <w:p>
@@ -2836,19 +3962,19 @@
         <w:rPr>
           <w:rFonts w:cs="Times New Roman"/>
         </w:rPr>
-        <w:t>Elsherif et al. (2025) propose a CNN-LSTM hybrid achieving RMSE 14.44 on C-MAPSS FD001, while Rezk et al. (202</w:t>
-      </w:r>
-      <w:r>
-        <w:rPr>
-          <w:rFonts w:cs="Times New Roman"/>
-        </w:rPr>
-        <w:t>5</w:t>
-      </w:r>
-      <w:r>
-        <w:rPr>
-          <w:rFonts w:cs="Times New Roman"/>
-        </w:rPr>
-        <w:t>) show that hybrid ensembles reduce false-positive alerts in imbalanced IIoT datasets.</w:t>
+        <w:t xml:space="preserve">Elsherif et al. (2025) propose a CNN-LSTM hybrid achieving </w:t>
+      </w:r>
+      <w:r>
+        <w:rPr>
+          <w:rFonts w:cs="Times New Roman"/>
+        </w:rPr>
+        <w:t>MAE 10.49–10.68 and PHM score 264.47–282.38 on C-MAPSS FD001</w:t>
+      </w:r>
+      <w:r>
+        <w:rPr>
+          <w:rFonts w:cs="Times New Roman"/>
+        </w:rPr>
+        <w:t>.</w:t>
       </w:r>
     </w:p>
     <w:p>
@@ -2856,7 +3982,7 @@
         <w:pStyle w:val="Heading2"/>
       </w:pPr>
       <w:bookmarkStart w:id="6" w:name="_Toc231156491"/>
-      <w:bookmarkStart w:id="7" w:name="_Toc231210626"/>
+      <w:bookmarkStart w:id="7" w:name="_Toc232626485"/>
       <w:r>
         <w:t>2.2 Benchmark Datasets</w:t>
       </w:r>
@@ -2874,43 +4000,72 @@
         <w:rPr>
           <w:rFonts w:cs="Times New Roman"/>
         </w:rPr>
-        <w:t>The NASA C-MAPSS dataset remains the dominant RUL benchmark (Sharma, 202</w:t>
-      </w:r>
-      <w:r>
-        <w:rPr>
-          <w:rFonts w:cs="Times New Roman"/>
-        </w:rPr>
-        <w:t>5</w:t>
-      </w:r>
-      <w:r>
-        <w:rPr>
-          <w:rFonts w:cs="Times New Roman"/>
-        </w:rPr>
-        <w:t>), though its ubiquity risks overfitting to turbofan patterns that may not transfer to pumps or conveyors.</w:t>
-      </w:r>
-      <w:r>
-        <w:rPr>
-          <w:rFonts w:cs="Times New Roman"/>
-        </w:rPr>
-        <w:t xml:space="preserve"> The PRONOSTIA bearing dataset, from the IEEE PHM 2012 Challenge, provides run-to-failure data for rolling element bearings under three load conditions. Pandya et al. (2021) achieve over 90% accuracy on PRONOSTIA using an Autoencoder-LSTM, making it the more relevant primary benchmark for the present manufacturing context. Elkateb et al. (2024) caution that both datasets omit the sensor drift, noise, and irregular sampling typical of live production environments.</w:t>
-      </w:r>
-    </w:p>
-    <w:p>
-      <w:pPr>
-        <w:spacing w:before="240" w:line="360" w:lineRule="auto"/>
-        <w:rPr>
-          <w:rFonts w:cs="Times New Roman"/>
-        </w:rPr>
-      </w:pPr>
+        <w:t xml:space="preserve">The NASA C-MAPSS dataset remains the dominant RUL benchmark </w:t>
+      </w:r>
+      <w:r>
+        <w:rPr>
+          <w:rFonts w:cs="Times New Roman"/>
+        </w:rPr>
+        <w:t>(Sharma et al., 2025)</w:t>
+      </w:r>
+      <w:r>
+        <w:rPr>
+          <w:rFonts w:cs="Times New Roman"/>
+        </w:rPr>
+        <w:t>, though it risks overfitting to turbofan patterns. The PRONOSTIA bearing dataset, from the IEEE PHM 2012 Challenge, provides run-to-failure bearing data under three load conditions</w:t>
+      </w:r>
+      <w:r>
+        <w:rPr>
+          <w:rFonts w:cs="Times New Roman"/>
+        </w:rPr>
+        <w:t>.</w:t>
+      </w:r>
+      <w:r>
+        <w:rPr>
+          <w:rFonts w:cs="Times New Roman"/>
+        </w:rPr>
+        <w:t xml:space="preserve"> </w:t>
+      </w:r>
+      <w:r>
+        <w:rPr>
+          <w:rFonts w:cs="Times New Roman"/>
+        </w:rPr>
+        <w:t>Kamat et al. (2021) achieve over 90% accuracy on PRONOSTIA using an Autoencoder-LSTM</w:t>
+      </w:r>
+      <w:r>
+        <w:rPr>
+          <w:rFonts w:cs="Times New Roman"/>
+        </w:rPr>
+        <w:t>, making it the more relevant benchmark here</w:t>
+      </w:r>
+      <w:r>
+        <w:rPr>
+          <w:rFonts w:cs="Times New Roman"/>
+        </w:rPr>
+        <w:t xml:space="preserve">. </w:t>
+      </w:r>
+      <w:proofErr w:type="spellStart"/>
+      <w:r>
+        <w:rPr>
+          <w:rFonts w:cs="Times New Roman"/>
+        </w:rPr>
+        <w:t>Elkateb</w:t>
+      </w:r>
+      <w:proofErr w:type="spellEnd"/>
+      <w:r>
+        <w:rPr>
+          <w:rFonts w:cs="Times New Roman"/>
+        </w:rPr>
+        <w:t xml:space="preserve"> et al. (2024) caution that both datasets omit the sensor drift, noise, and irregular sampling typical of live production environments.</w:t>
+      </w:r>
     </w:p>
     <w:p>
       <w:pPr>
         <w:pStyle w:val="Heading2"/>
       </w:pPr>
       <w:bookmarkStart w:id="8" w:name="_Toc231156492"/>
-      <w:bookmarkStart w:id="9" w:name="_Toc231210627"/>
-      <w:r>
-        <w:lastRenderedPageBreak/>
+      <w:bookmarkStart w:id="9" w:name="_Toc232626486"/>
+      <w:r>
         <w:t>2.3 Research Gaps</w:t>
       </w:r>
       <w:bookmarkEnd w:id="8"/>
@@ -2927,40 +4082,98 @@
         <w:rPr>
           <w:rFonts w:cs="Times New Roman"/>
         </w:rPr>
-        <w:t>Three gaps are consistently acknowledged. First, labelled failure data are scarce: machines are engineered not to fail, so run-to-failure records are costly and rare, yielding severely imbalanced datasets (Rezk et al., 202</w:t>
-      </w:r>
-      <w:r>
-        <w:rPr>
-          <w:rFonts w:cs="Times New Roman"/>
-        </w:rPr>
-        <w:t>5</w:t>
-      </w:r>
-      <w:r>
-        <w:rPr>
-          <w:rFonts w:cs="Times New Roman"/>
-        </w:rPr>
-        <w:t>; Elkateb et al., 2024). Second, cross-machine generalisation is poor</w:t>
-      </w:r>
-      <w:r>
-        <w:rPr>
-          <w:rFonts w:cs="Times New Roman"/>
-        </w:rPr>
-        <w:t>. M</w:t>
-      </w:r>
-      <w:r>
-        <w:rPr>
-          <w:rFonts w:cs="Times New Roman"/>
-        </w:rPr>
-        <w:t>ost models are validated on a single equipment type, and domain transfer (e.g., turbofan-to-pump) remains largely unsolved (Bampoula et al., 2024). Third, real-time edge deployment is under-studied; deep learning models are computationally heavy for embedded micro-controllers (Alotaibi and Aly, 2025; Aboshosha et al., 2023). This essay addresses gaps one and three through model choice and the deployment analysis in Section 6.</w:t>
-      </w:r>
-    </w:p>
-    <w:p>
-      <w:pPr>
-        <w:spacing w:before="240" w:line="360" w:lineRule="auto"/>
-        <w:rPr>
-          <w:rFonts w:cs="Times New Roman"/>
-        </w:rPr>
-      </w:pPr>
+        <w:t xml:space="preserve">Three gaps are consistently acknowledged. </w:t>
+      </w:r>
+      <w:r>
+        <w:rPr>
+          <w:rFonts w:cs="Times New Roman"/>
+        </w:rPr>
+        <w:t>First, labelled failure data are scarce, since machines are engineered not to fail, yielding severely imbalanced datasets (</w:t>
+      </w:r>
+      <w:proofErr w:type="spellStart"/>
+      <w:r>
+        <w:rPr>
+          <w:rFonts w:cs="Times New Roman"/>
+        </w:rPr>
+        <w:t>Elkateb</w:t>
+      </w:r>
+      <w:proofErr w:type="spellEnd"/>
+      <w:r>
+        <w:rPr>
+          <w:rFonts w:cs="Times New Roman"/>
+        </w:rPr>
+        <w:t xml:space="preserve"> et al., 2024</w:t>
+      </w:r>
+      <w:r>
+        <w:rPr>
+          <w:rFonts w:cs="Times New Roman"/>
+        </w:rPr>
+        <w:t xml:space="preserve">). </w:t>
+      </w:r>
+      <w:r>
+        <w:rPr>
+          <w:rFonts w:cs="Times New Roman"/>
+        </w:rPr>
+        <w:t>Second, cross-machine generalisation is poor, as most models are validated on a single equipment type and domain transfer remains largely unsolved (</w:t>
+      </w:r>
+      <w:proofErr w:type="spellStart"/>
+      <w:r>
+        <w:rPr>
+          <w:rFonts w:cs="Times New Roman"/>
+        </w:rPr>
+        <w:t>Bampoula</w:t>
+      </w:r>
+      <w:proofErr w:type="spellEnd"/>
+      <w:r>
+        <w:rPr>
+          <w:rFonts w:cs="Times New Roman"/>
+        </w:rPr>
+        <w:t xml:space="preserve"> et al., 2024).</w:t>
+      </w:r>
+      <w:r>
+        <w:rPr>
+          <w:rFonts w:cs="Times New Roman"/>
+        </w:rPr>
+        <w:t xml:space="preserve"> </w:t>
+      </w:r>
+      <w:r>
+        <w:rPr>
+          <w:rFonts w:cs="Times New Roman"/>
+        </w:rPr>
+        <w:t>Third, real-time edge deployment is under-studied, as deep learning models are computationally heavy for embedded micro-controllers (</w:t>
+      </w:r>
+      <w:r>
+        <w:rPr>
+          <w:rFonts w:cs="Times New Roman"/>
+        </w:rPr>
+        <w:t>Aly and Alotaibi, 2025</w:t>
+      </w:r>
+      <w:r>
+        <w:rPr>
+          <w:rFonts w:cs="Times New Roman"/>
+        </w:rPr>
+        <w:t xml:space="preserve">; </w:t>
+      </w:r>
+      <w:proofErr w:type="spellStart"/>
+      <w:r>
+        <w:rPr>
+          <w:rFonts w:cs="Times New Roman"/>
+        </w:rPr>
+        <w:t>Aboshosha</w:t>
+      </w:r>
+      <w:proofErr w:type="spellEnd"/>
+      <w:r>
+        <w:rPr>
+          <w:rFonts w:cs="Times New Roman"/>
+        </w:rPr>
+        <w:t xml:space="preserve"> et al., 2023)</w:t>
+      </w:r>
+      <w:r>
+        <w:rPr>
+          <w:rFonts w:cs="Times New Roman"/>
+        </w:rPr>
+        <w:t>. This essay addresses gaps one and three through model choice and the deployment analysis in Section 6.</w:t>
+      </w:r>
       <w:r>
         <w:rPr>
           <w:rFonts w:cs="Times New Roman"/>
@@ -2973,7 +4186,7 @@
         <w:pStyle w:val="Heading1"/>
       </w:pPr>
       <w:bookmarkStart w:id="10" w:name="_Toc231156493"/>
-      <w:bookmarkStart w:id="11" w:name="_Toc231210628"/>
+      <w:bookmarkStart w:id="11" w:name="_Toc232626487"/>
       <w:r>
         <w:lastRenderedPageBreak/>
         <w:t>3. AI Model Selection and Justification</w:t>
@@ -2992,31 +4205,13 @@
         <w:rPr>
           <w:rFonts w:cs="Times New Roman"/>
         </w:rPr>
-        <w:t>LSTM networks and TCNs are selected on the basis of the sensor data characteristics</w:t>
-      </w:r>
-      <w:r>
-        <w:rPr>
-          <w:rFonts w:cs="Times New Roman"/>
-        </w:rPr>
-        <w:t xml:space="preserve"> </w:t>
-      </w:r>
-      <w:r>
-        <w:rPr>
-          <w:rFonts w:cs="Times New Roman"/>
-        </w:rPr>
-        <w:t>high-frequency, multivariate time series</w:t>
-      </w:r>
-      <w:r>
-        <w:rPr>
-          <w:rFonts w:cs="Times New Roman"/>
-        </w:rPr>
-        <w:t xml:space="preserve"> </w:t>
-      </w:r>
-      <w:r>
-        <w:rPr>
-          <w:rFonts w:cs="Times New Roman"/>
-        </w:rPr>
-        <w:t>and the dual task requirements of fault classification and RUL regression.</w:t>
+        <w:t>LSTM networks and TCNs are selected for the sensor data's high-frequency, multivariate nature and the dual tasks of fault classification and RUL regression</w:t>
+      </w:r>
+      <w:r>
+        <w:rPr>
+          <w:rFonts w:cs="Times New Roman"/>
+        </w:rPr>
+        <w:t>.</w:t>
       </w:r>
     </w:p>
     <w:p>
@@ -3024,7 +4219,7 @@
         <w:pStyle w:val="Heading2"/>
       </w:pPr>
       <w:bookmarkStart w:id="12" w:name="_Toc231156494"/>
-      <w:bookmarkStart w:id="13" w:name="_Toc231210629"/>
+      <w:bookmarkStart w:id="13" w:name="_Toc232626488"/>
       <w:r>
         <w:t>3.1 Long Short-Term Memory (LSTM) Networks</w:t>
       </w:r>
@@ -3042,13 +4237,47 @@
         <w:rPr>
           <w:rFonts w:cs="Times New Roman"/>
         </w:rPr>
-        <w:t>LSTMs overcome the vanishing gradient problem via gating mechanisms, making them well-suited to sequential sensor data where temporal ordering carries diagnostic value (Bampoula et al., 2021).</w:t>
-      </w:r>
-      <w:r>
-        <w:rPr>
-          <w:rFonts w:cs="Times New Roman"/>
-        </w:rPr>
-        <w:t xml:space="preserve"> Its key limitation is sequential computation: inference latency and training cost scale unfavourably with window length, and internal gating states offer no intuitive mapping to physical fault mechanisms.</w:t>
+        <w:t>LSTMs overcome the vanishing gradient problem via gating mechanisms, making them well-suited to sequential sensor data where temporal ordering carries diagnostic value (</w:t>
+      </w:r>
+      <w:proofErr w:type="spellStart"/>
+      <w:r>
+        <w:rPr>
+          <w:rFonts w:cs="Times New Roman"/>
+        </w:rPr>
+        <w:t>Bampoula</w:t>
+      </w:r>
+      <w:proofErr w:type="spellEnd"/>
+      <w:r>
+        <w:rPr>
+          <w:rFonts w:cs="Times New Roman"/>
+        </w:rPr>
+        <w:t xml:space="preserve"> et al., 2021).</w:t>
+      </w:r>
+      <w:r>
+        <w:rPr>
+          <w:rFonts w:cs="Times New Roman"/>
+        </w:rPr>
+        <w:t xml:space="preserve"> Its key limitation is sequential computation: inference latency and training cost scale </w:t>
+      </w:r>
+      <w:proofErr w:type="spellStart"/>
+      <w:r>
+        <w:rPr>
+          <w:rFonts w:cs="Times New Roman"/>
+        </w:rPr>
+        <w:t>unfavourably</w:t>
+      </w:r>
+      <w:proofErr w:type="spellEnd"/>
+      <w:r>
+        <w:rPr>
+          <w:rFonts w:cs="Times New Roman"/>
+        </w:rPr>
+        <w:t xml:space="preserve"> with window length</w:t>
+      </w:r>
+      <w:r>
+        <w:rPr>
+          <w:rFonts w:cs="Times New Roman"/>
+        </w:rPr>
+        <w:t>.</w:t>
       </w:r>
     </w:p>
     <w:p>
@@ -3056,7 +4285,7 @@
         <w:pStyle w:val="Heading2"/>
       </w:pPr>
       <w:bookmarkStart w:id="14" w:name="_Toc231156495"/>
-      <w:bookmarkStart w:id="15" w:name="_Toc231210630"/>
+      <w:bookmarkStart w:id="15" w:name="_Toc232626489"/>
       <w:r>
         <w:t>3.2 Temporal Convolutional Networks (TCNs)</w:t>
       </w:r>
@@ -3074,7 +4303,49 @@
         <w:rPr>
           <w:rFonts w:cs="Times New Roman"/>
         </w:rPr>
-        <w:t xml:space="preserve">TCNs replace recurrence with dilated causal convolutions at exponentially increasing dilation rates, capturing long-range dependencies while processing all time steps in parallel (Fatahi et al., 2024). Fatahi et al. (2024) and Abdelhedi and Bouri (2025) demonstrate superior or competitive accuracy versus LSTM variants, with the added benefits of faster training and CNN-native hardware acceleration on edge devices. </w:t>
+        <w:t>TCNs replace recurrence with dilated causal convolutions, capturing long-range dependencies while processing all time steps in parallel (Fahmi et al., 2024).</w:t>
+      </w:r>
+      <w:r>
+        <w:rPr>
+          <w:rFonts w:cs="Times New Roman"/>
+        </w:rPr>
+        <w:t xml:space="preserve"> </w:t>
+      </w:r>
+      <w:r>
+        <w:rPr>
+          <w:rFonts w:cs="Times New Roman"/>
+        </w:rPr>
+        <w:t>Fahmi et al. (2024)</w:t>
+      </w:r>
+      <w:r>
+        <w:rPr>
+          <w:rFonts w:cs="Times New Roman"/>
+        </w:rPr>
+        <w:t xml:space="preserve"> </w:t>
+      </w:r>
+      <w:r>
+        <w:rPr>
+          <w:rFonts w:cs="Times New Roman"/>
+        </w:rPr>
+        <w:t xml:space="preserve">and </w:t>
+      </w:r>
+      <w:r>
+        <w:rPr>
+          <w:rFonts w:cs="Times New Roman"/>
+        </w:rPr>
+        <w:t>Mao et al. (2025)</w:t>
+      </w:r>
+      <w:r>
+        <w:rPr>
+          <w:rFonts w:cs="Times New Roman"/>
+        </w:rPr>
+        <w:t xml:space="preserve"> demonstrate competitive or superior accuracy versus LSTM variants, with faster training and CNN-native edge acceleration</w:t>
+      </w:r>
+      <w:r>
+        <w:rPr>
+          <w:rFonts w:cs="Times New Roman"/>
+        </w:rPr>
+        <w:t>.</w:t>
       </w:r>
     </w:p>
     <w:p>
@@ -3085,14 +4356,27 @@
       <w:r>
         <w:t xml:space="preserve">Table </w:t>
       </w:r>
-      <w:fldSimple w:instr=" SEQ Table \* ARABIC ">
-        <w:r>
-          <w:rPr>
-            <w:noProof/>
-          </w:rPr>
-          <w:t>1</w:t>
-        </w:r>
-      </w:fldSimple>
+      <w:r>
+        <w:fldChar w:fldCharType="begin"/>
+      </w:r>
+      <w:r>
+        <w:instrText xml:space="preserve"> SEQ Table \* ARABIC </w:instrText>
+      </w:r>
+      <w:r>
+        <w:fldChar w:fldCharType="separate"/>
+      </w:r>
+      <w:r>
+        <w:rPr>
+          <w:noProof/>
+        </w:rPr>
+        <w:t>1</w:t>
+      </w:r>
+      <w:r>
+        <w:rPr>
+          <w:noProof/>
+        </w:rPr>
+        <w:fldChar w:fldCharType="end"/>
+      </w:r>
       <w:r>
         <w:t>: Comparative Summary of Selected AI Models</w:t>
       </w:r>
@@ -3103,7 +4387,7 @@
     </w:p>
     <w:tbl>
       <w:tblPr>
-        <w:tblW w:w="8905" w:type="dxa"/>
+        <w:tblW w:w="9091" w:type="dxa"/>
         <w:jc w:val="center"/>
         <w:tblBorders>
           <w:top w:val="single" w:sz="4" w:space="0" w:color="auto"/>
@@ -3120,18 +4404,19 @@
         <w:tblLook w:val="04A0" w:firstRow="1" w:lastRow="0" w:firstColumn="1" w:lastColumn="0" w:noHBand="0" w:noVBand="1"/>
       </w:tblPr>
       <w:tblGrid>
-        <w:gridCol w:w="2600"/>
-        <w:gridCol w:w="3335"/>
-        <w:gridCol w:w="2970"/>
+        <w:gridCol w:w="2654"/>
+        <w:gridCol w:w="3405"/>
+        <w:gridCol w:w="3032"/>
       </w:tblGrid>
       <w:tr>
         <w:trPr>
+          <w:trHeight w:val="698"/>
           <w:tblHeader/>
           <w:jc w:val="center"/>
         </w:trPr>
         <w:tc>
           <w:tcPr>
-            <w:tcW w:w="2600" w:type="dxa"/>
+            <w:tcW w:w="2654" w:type="dxa"/>
             <w:tcBorders>
               <w:top w:val="single" w:sz="4" w:space="0" w:color="999999"/>
               <w:left w:val="single" w:sz="4" w:space="0" w:color="999999"/>
@@ -3168,7 +4453,7 @@
         </w:tc>
         <w:tc>
           <w:tcPr>
-            <w:tcW w:w="3335" w:type="dxa"/>
+            <w:tcW w:w="3405" w:type="dxa"/>
             <w:tcBorders>
               <w:top w:val="single" w:sz="4" w:space="0" w:color="999999"/>
               <w:left w:val="single" w:sz="4" w:space="0" w:color="999999"/>
@@ -3205,7 +4490,7 @@
         </w:tc>
         <w:tc>
           <w:tcPr>
-            <w:tcW w:w="2970" w:type="dxa"/>
+            <w:tcW w:w="3032" w:type="dxa"/>
             <w:tcBorders>
               <w:top w:val="single" w:sz="4" w:space="0" w:color="999999"/>
               <w:left w:val="single" w:sz="4" w:space="0" w:color="999999"/>
@@ -3243,11 +4528,12 @@
       </w:tr>
       <w:tr>
         <w:trPr>
+          <w:trHeight w:val="883"/>
           <w:jc w:val="center"/>
         </w:trPr>
         <w:tc>
           <w:tcPr>
-            <w:tcW w:w="2600" w:type="dxa"/>
+            <w:tcW w:w="2654" w:type="dxa"/>
             <w:tcBorders>
               <w:top w:val="single" w:sz="4" w:space="0" w:color="999999"/>
               <w:left w:val="single" w:sz="4" w:space="0" w:color="999999"/>
@@ -3280,7 +4566,7 @@
         </w:tc>
         <w:tc>
           <w:tcPr>
-            <w:tcW w:w="3335" w:type="dxa"/>
+            <w:tcW w:w="3405" w:type="dxa"/>
             <w:tcBorders>
               <w:top w:val="single" w:sz="4" w:space="0" w:color="999999"/>
               <w:left w:val="single" w:sz="4" w:space="0" w:color="999999"/>
@@ -3313,7 +4599,7 @@
         </w:tc>
         <w:tc>
           <w:tcPr>
-            <w:tcW w:w="2970" w:type="dxa"/>
+            <w:tcW w:w="3032" w:type="dxa"/>
             <w:tcBorders>
               <w:top w:val="single" w:sz="4" w:space="0" w:color="999999"/>
               <w:left w:val="single" w:sz="4" w:space="0" w:color="999999"/>
@@ -3347,11 +4633,12 @@
       </w:tr>
       <w:tr>
         <w:trPr>
+          <w:trHeight w:val="441"/>
           <w:jc w:val="center"/>
         </w:trPr>
         <w:tc>
           <w:tcPr>
-            <w:tcW w:w="2600" w:type="dxa"/>
+            <w:tcW w:w="2654" w:type="dxa"/>
             <w:tcBorders>
               <w:top w:val="single" w:sz="4" w:space="0" w:color="999999"/>
               <w:left w:val="single" w:sz="4" w:space="0" w:color="999999"/>
@@ -3384,7 +4671,7 @@
         </w:tc>
         <w:tc>
           <w:tcPr>
-            <w:tcW w:w="3335" w:type="dxa"/>
+            <w:tcW w:w="3405" w:type="dxa"/>
             <w:tcBorders>
               <w:top w:val="single" w:sz="4" w:space="0" w:color="999999"/>
               <w:left w:val="single" w:sz="4" w:space="0" w:color="999999"/>
@@ -3417,7 +4704,7 @@
         </w:tc>
         <w:tc>
           <w:tcPr>
-            <w:tcW w:w="2970" w:type="dxa"/>
+            <w:tcW w:w="3032" w:type="dxa"/>
             <w:tcBorders>
               <w:top w:val="single" w:sz="4" w:space="0" w:color="999999"/>
               <w:left w:val="single" w:sz="4" w:space="0" w:color="999999"/>
@@ -3451,11 +4738,12 @@
       </w:tr>
       <w:tr>
         <w:trPr>
+          <w:trHeight w:val="441"/>
           <w:jc w:val="center"/>
         </w:trPr>
         <w:tc>
           <w:tcPr>
-            <w:tcW w:w="2600" w:type="dxa"/>
+            <w:tcW w:w="2654" w:type="dxa"/>
             <w:tcBorders>
               <w:top w:val="single" w:sz="4" w:space="0" w:color="999999"/>
               <w:left w:val="single" w:sz="4" w:space="0" w:color="999999"/>
@@ -3488,7 +4776,7 @@
         </w:tc>
         <w:tc>
           <w:tcPr>
-            <w:tcW w:w="3335" w:type="dxa"/>
+            <w:tcW w:w="3405" w:type="dxa"/>
             <w:tcBorders>
               <w:top w:val="single" w:sz="4" w:space="0" w:color="999999"/>
               <w:left w:val="single" w:sz="4" w:space="0" w:color="999999"/>
@@ -3521,7 +4809,7 @@
         </w:tc>
         <w:tc>
           <w:tcPr>
-            <w:tcW w:w="2970" w:type="dxa"/>
+            <w:tcW w:w="3032" w:type="dxa"/>
             <w:tcBorders>
               <w:top w:val="single" w:sz="4" w:space="0" w:color="999999"/>
               <w:left w:val="single" w:sz="4" w:space="0" w:color="999999"/>
@@ -3555,11 +4843,12 @@
       </w:tr>
       <w:tr>
         <w:trPr>
+          <w:trHeight w:val="441"/>
           <w:jc w:val="center"/>
         </w:trPr>
         <w:tc>
           <w:tcPr>
-            <w:tcW w:w="2600" w:type="dxa"/>
+            <w:tcW w:w="2654" w:type="dxa"/>
             <w:tcBorders>
               <w:top w:val="single" w:sz="4" w:space="0" w:color="999999"/>
               <w:left w:val="single" w:sz="4" w:space="0" w:color="999999"/>
@@ -3592,7 +4881,7 @@
         </w:tc>
         <w:tc>
           <w:tcPr>
-            <w:tcW w:w="3335" w:type="dxa"/>
+            <w:tcW w:w="3405" w:type="dxa"/>
             <w:tcBorders>
               <w:top w:val="single" w:sz="4" w:space="0" w:color="999999"/>
               <w:left w:val="single" w:sz="4" w:space="0" w:color="999999"/>
@@ -3625,7 +4914,7 @@
         </w:tc>
         <w:tc>
           <w:tcPr>
-            <w:tcW w:w="2970" w:type="dxa"/>
+            <w:tcW w:w="3032" w:type="dxa"/>
             <w:tcBorders>
               <w:top w:val="single" w:sz="4" w:space="0" w:color="999999"/>
               <w:left w:val="single" w:sz="4" w:space="0" w:color="999999"/>
@@ -3659,11 +4948,12 @@
       </w:tr>
       <w:tr>
         <w:trPr>
+          <w:trHeight w:val="901"/>
           <w:jc w:val="center"/>
         </w:trPr>
         <w:tc>
           <w:tcPr>
-            <w:tcW w:w="2600" w:type="dxa"/>
+            <w:tcW w:w="2654" w:type="dxa"/>
             <w:tcBorders>
               <w:top w:val="single" w:sz="4" w:space="0" w:color="999999"/>
               <w:left w:val="single" w:sz="4" w:space="0" w:color="999999"/>
@@ -3696,7 +4986,7 @@
         </w:tc>
         <w:tc>
           <w:tcPr>
-            <w:tcW w:w="3335" w:type="dxa"/>
+            <w:tcW w:w="3405" w:type="dxa"/>
             <w:tcBorders>
               <w:top w:val="single" w:sz="4" w:space="0" w:color="999999"/>
               <w:left w:val="single" w:sz="4" w:space="0" w:color="999999"/>
@@ -3723,13 +5013,13 @@
               <w:rPr>
                 <w:rFonts w:cs="Times New Roman"/>
               </w:rPr>
-              <w:t>RMSE 14.44, C-MAPSS FD001</w:t>
+              <w:t>MAE 10.49–10.68, C-MAPSS FD001</w:t>
             </w:r>
           </w:p>
         </w:tc>
         <w:tc>
           <w:tcPr>
-            <w:tcW w:w="2970" w:type="dxa"/>
+            <w:tcW w:w="3032" w:type="dxa"/>
             <w:tcBorders>
               <w:top w:val="single" w:sz="4" w:space="0" w:color="999999"/>
               <w:left w:val="single" w:sz="4" w:space="0" w:color="999999"/>
@@ -3763,11 +5053,12 @@
       </w:tr>
       <w:tr>
         <w:trPr>
+          <w:trHeight w:val="441"/>
           <w:jc w:val="center"/>
         </w:trPr>
         <w:tc>
           <w:tcPr>
-            <w:tcW w:w="2600" w:type="dxa"/>
+            <w:tcW w:w="2654" w:type="dxa"/>
             <w:tcBorders>
               <w:top w:val="single" w:sz="4" w:space="0" w:color="999999"/>
               <w:left w:val="single" w:sz="4" w:space="0" w:color="999999"/>
@@ -3800,7 +5091,7 @@
         </w:tc>
         <w:tc>
           <w:tcPr>
-            <w:tcW w:w="3335" w:type="dxa"/>
+            <w:tcW w:w="3405" w:type="dxa"/>
             <w:tcBorders>
               <w:top w:val="single" w:sz="4" w:space="0" w:color="999999"/>
               <w:left w:val="single" w:sz="4" w:space="0" w:color="999999"/>
@@ -3833,7 +5124,7 @@
         </w:tc>
         <w:tc>
           <w:tcPr>
-            <w:tcW w:w="2970" w:type="dxa"/>
+            <w:tcW w:w="3032" w:type="dxa"/>
             <w:tcBorders>
               <w:top w:val="single" w:sz="4" w:space="0" w:color="999999"/>
               <w:left w:val="single" w:sz="4" w:space="0" w:color="999999"/>
@@ -3871,7 +5162,7 @@
         <w:pStyle w:val="Heading1"/>
       </w:pPr>
       <w:bookmarkStart w:id="17" w:name="_Toc231156496"/>
-      <w:bookmarkStart w:id="18" w:name="_Toc231210631"/>
+      <w:bookmarkStart w:id="18" w:name="_Toc232626490"/>
       <w:r>
         <w:lastRenderedPageBreak/>
         <w:t>4. Data Requirements and Preprocessing</w:t>
@@ -3884,7 +5175,7 @@
         <w:pStyle w:val="Heading2"/>
       </w:pPr>
       <w:bookmarkStart w:id="19" w:name="_Toc231156497"/>
-      <w:bookmarkStart w:id="20" w:name="_Toc231210632"/>
+      <w:bookmarkStart w:id="20" w:name="_Toc232626491"/>
       <w:r>
         <w:t>4.1 Data Requirements</w:t>
       </w:r>
@@ -3902,7 +5193,33 @@
         <w:rPr>
           <w:rFonts w:cs="Times New Roman"/>
         </w:rPr>
-        <w:t xml:space="preserve">Each machine class requires multivariate sensor streams: vibration (vertical and horizontal accelerometers), temperature, pressure (piezoelectric), and acoustic emission. Vibration sampling must reach at least 10–25.6 kHz to resolve bearing fault frequencies (Elkateb et al., 2024). </w:t>
+        <w:t>Each machine class requires multivariate sensor streams: vibration, temperature, pressure, and acoustic emission.</w:t>
+      </w:r>
+      <w:r>
+        <w:rPr>
+          <w:rFonts w:cs="Times New Roman"/>
+        </w:rPr>
+        <w:t xml:space="preserve"> </w:t>
+      </w:r>
+      <w:r>
+        <w:rPr>
+          <w:rFonts w:cs="Times New Roman"/>
+        </w:rPr>
+        <w:t>Vibration sampling must reach at least 10–25.6 kHz to resolve bearing fault frequencies (</w:t>
+      </w:r>
+      <w:proofErr w:type="spellStart"/>
+      <w:r>
+        <w:rPr>
+          <w:rFonts w:cs="Times New Roman"/>
+        </w:rPr>
+        <w:t>Elkateb</w:t>
+      </w:r>
+      <w:proofErr w:type="spellEnd"/>
+      <w:r>
+        <w:rPr>
+          <w:rFonts w:cs="Times New Roman"/>
+        </w:rPr>
+        <w:t xml:space="preserve"> et al., 2024). </w:t>
       </w:r>
       <w:r>
         <w:rPr>
@@ -3922,7 +5239,7 @@
         <w:pStyle w:val="Heading2"/>
       </w:pPr>
       <w:bookmarkStart w:id="21" w:name="_Toc231156498"/>
-      <w:bookmarkStart w:id="22" w:name="_Toc231210633"/>
+      <w:bookmarkStart w:id="22" w:name="_Toc232626492"/>
       <w:r>
         <w:t>4.2 Handling Class Imbalance</w:t>
       </w:r>
@@ -3940,19 +5257,57 @@
         <w:rPr>
           <w:rFonts w:cs="Times New Roman"/>
         </w:rPr>
-        <w:t>Healthy observations vastly outnumber failure precursors in industrial streams, causing standard cross-entropy loss to default to the majority class. Elkateb et al. (2024) apply Borderline-SMOTE to synthesise minority-class samples in feature space. Cost-sensitive learning and Balanced Random Forests offer complementary strategies by penalising misclassification of the minority class or resampling mini-batches at training time (Rezk et al., 202</w:t>
-      </w:r>
-      <w:r>
-        <w:rPr>
-          <w:rFonts w:cs="Times New Roman"/>
-        </w:rPr>
-        <w:t>5</w:t>
-      </w:r>
-      <w:r>
-        <w:rPr>
-          <w:rFonts w:cs="Times New Roman"/>
-        </w:rPr>
-        <w:t>).</w:t>
+        <w:t>Healthy observations vastly outnumber failure precursors, causing standard cross-entropy loss to default to the majority class</w:t>
+      </w:r>
+      <w:r>
+        <w:rPr>
+          <w:rFonts w:cs="Times New Roman"/>
+        </w:rPr>
+        <w:t>.</w:t>
+      </w:r>
+      <w:r>
+        <w:rPr>
+          <w:rFonts w:cs="Times New Roman"/>
+        </w:rPr>
+        <w:t xml:space="preserve"> </w:t>
+      </w:r>
+      <w:proofErr w:type="spellStart"/>
+      <w:r>
+        <w:rPr>
+          <w:rFonts w:cs="Times New Roman"/>
+        </w:rPr>
+        <w:t>Elkateb</w:t>
+      </w:r>
+      <w:proofErr w:type="spellEnd"/>
+      <w:r>
+        <w:rPr>
+          <w:rFonts w:cs="Times New Roman"/>
+        </w:rPr>
+        <w:t xml:space="preserve"> et al. (2024) apply Borderline-SMOTE to synthesise minority-class samples in feature space. </w:t>
+      </w:r>
+      <w:r>
+        <w:rPr>
+          <w:rFonts w:cs="Times New Roman"/>
+        </w:rPr>
+        <w:t>Cost-sensitive learning and Balanced Random Forests offer complementary strategies (</w:t>
+      </w:r>
+      <w:r>
+        <w:rPr>
+          <w:rFonts w:cs="Times New Roman"/>
+        </w:rPr>
+        <w:t>Varalakshmi and Kumar, 2025</w:t>
+      </w:r>
+      <w:r>
+        <w:rPr>
+          <w:rFonts w:cs="Times New Roman"/>
+        </w:rPr>
+        <w:t>)</w:t>
+      </w:r>
+      <w:r>
+        <w:rPr>
+          <w:rFonts w:cs="Times New Roman"/>
+        </w:rPr>
+        <w:t>.</w:t>
       </w:r>
     </w:p>
     <w:p>
@@ -3960,7 +5315,7 @@
         <w:pStyle w:val="Heading2"/>
       </w:pPr>
       <w:bookmarkStart w:id="23" w:name="_Toc231156499"/>
-      <w:bookmarkStart w:id="24" w:name="_Toc231210634"/>
+      <w:bookmarkStart w:id="24" w:name="_Toc232626493"/>
       <w:r>
         <w:t>4.3 Feature Extraction</w:t>
       </w:r>
@@ -3978,13 +5333,25 @@
         <w:rPr>
           <w:rFonts w:cs="Times New Roman"/>
         </w:rPr>
-        <w:t>Features span three domains: time-domain statistics (RMS, kurtosis), FFT-derived fault frequencies, and wavelet/STFT time-frequency representations for variable-speed machinery</w:t>
-      </w:r>
-      <w:r>
-        <w:rPr>
-          <w:rFonts w:cs="Times New Roman"/>
-        </w:rPr>
-        <w:t xml:space="preserve">. For sequence models, a 30-step sliding window with 50% overlap generates training samples; the window length is tuned as a hyperparameter. </w:t>
+        <w:t>Features span three domains: time-domain statistics, FFT-derived fault frequencies, and wavelet/STFT representations</w:t>
+      </w:r>
+      <w:r>
+        <w:rPr>
+          <w:rFonts w:cs="Times New Roman"/>
+        </w:rPr>
+        <w:t>.</w:t>
+      </w:r>
+      <w:r>
+        <w:rPr>
+          <w:rFonts w:cs="Times New Roman"/>
+        </w:rPr>
+        <w:t xml:space="preserve"> For sequence models, a 30-step sliding window with 50% overlap generates training sample</w:t>
+      </w:r>
+      <w:r>
+        <w:rPr>
+          <w:rFonts w:cs="Times New Roman"/>
+        </w:rPr>
+        <w:t>s.</w:t>
       </w:r>
     </w:p>
     <w:p>
@@ -3992,7 +5359,7 @@
         <w:pStyle w:val="Heading2"/>
       </w:pPr>
       <w:bookmarkStart w:id="25" w:name="_Toc231156500"/>
-      <w:bookmarkStart w:id="26" w:name="_Toc231210635"/>
+      <w:bookmarkStart w:id="26" w:name="_Toc232626494"/>
       <w:r>
         <w:t>4.4 Data Splitting</w:t>
       </w:r>
@@ -4010,56 +5377,14 @@
         <w:rPr>
           <w:rFonts w:cs="Times New Roman"/>
         </w:rPr>
-        <w:t>Data are split 70/15/15% (train/validation/test), strictly respecting temporal order to prevent data leakage. Where multiple machines exist, a machine-stratified split</w:t>
-      </w:r>
-      <w:r>
-        <w:rPr>
-          <w:rFonts w:cs="Times New Roman"/>
-        </w:rPr>
-        <w:t xml:space="preserve"> </w:t>
-      </w:r>
-      <w:r>
-        <w:rPr>
-          <w:rFonts w:cs="Times New Roman"/>
-        </w:rPr>
-        <w:t>holding out entire machines for testing</w:t>
-      </w:r>
-      <w:r>
-        <w:rPr>
-          <w:rFonts w:cs="Times New Roman"/>
-        </w:rPr>
-        <w:t xml:space="preserve"> </w:t>
-      </w:r>
-      <w:r>
-        <w:rPr>
-          <w:rFonts w:cs="Times New Roman"/>
-        </w:rPr>
-        <w:t>better represents deployment on unseen equipment than random splitting.</w:t>
-      </w:r>
-    </w:p>
-    <w:p>
-      <w:pPr>
-        <w:spacing w:before="240" w:line="360" w:lineRule="auto"/>
-        <w:rPr>
-          <w:rFonts w:cs="Times New Roman"/>
-        </w:rPr>
-      </w:pPr>
-    </w:p>
-    <w:p>
-      <w:pPr>
-        <w:spacing w:before="240" w:line="360" w:lineRule="auto"/>
-        <w:rPr>
-          <w:rFonts w:cs="Times New Roman"/>
-        </w:rPr>
-      </w:pPr>
-    </w:p>
-    <w:p>
-      <w:pPr>
-        <w:spacing w:before="240" w:line="360" w:lineRule="auto"/>
-        <w:rPr>
-          <w:rFonts w:cs="Times New Roman"/>
-        </w:rPr>
-      </w:pPr>
+        <w:t xml:space="preserve">Data are split 70/15/15% (train/validation/test), strictly respecting temporal order to prevent data leakage. </w:t>
+      </w:r>
+      <w:r>
+        <w:rPr>
+          <w:rFonts w:cs="Times New Roman"/>
+        </w:rPr>
+        <w:t>A machine-stratified split, holding out entire machines for testing, better represents deployment on unseen equipment than random splitting.</w:t>
+      </w:r>
     </w:p>
     <w:p>
       <w:pPr>
@@ -4067,14 +5392,23 @@
       </w:pPr>
       <w:bookmarkStart w:id="27" w:name="_Toc231240520"/>
       <w:r>
-        <w:lastRenderedPageBreak/>
         <w:t xml:space="preserve">Table </w:t>
       </w:r>
-      <w:fldSimple w:instr=" SEQ Table \* ARABIC ">
-        <w:r>
-          <w:t>2</w:t>
-        </w:r>
-      </w:fldSimple>
+      <w:r>
+        <w:fldChar w:fldCharType="begin"/>
+      </w:r>
+      <w:r>
+        <w:instrText xml:space="preserve"> SEQ Table \* ARABIC </w:instrText>
+      </w:r>
+      <w:r>
+        <w:fldChar w:fldCharType="separate"/>
+      </w:r>
+      <w:r>
+        <w:t>2</w:t>
+      </w:r>
+      <w:r>
+        <w:fldChar w:fldCharType="end"/>
+      </w:r>
       <w:r>
         <w:t>: Recommended Preprocessing Pipeline</w:t>
       </w:r>
@@ -4464,6 +5798,7 @@
               <w:rPr>
                 <w:rFonts w:cs="Times New Roman"/>
               </w:rPr>
+              <w:lastRenderedPageBreak/>
               <w:t>3. Normalisation</w:t>
             </w:r>
           </w:p>
@@ -4979,7 +6314,7 @@
         <w:pStyle w:val="Heading1"/>
       </w:pPr>
       <w:bookmarkStart w:id="28" w:name="_Toc231156501"/>
-      <w:bookmarkStart w:id="29" w:name="_Toc231210636"/>
+      <w:bookmarkStart w:id="29" w:name="_Toc232626495"/>
       <w:r>
         <w:lastRenderedPageBreak/>
         <w:t>5. Experimental Design</w:t>
@@ -5006,7 +6341,7 @@
         <w:pStyle w:val="Heading2"/>
       </w:pPr>
       <w:bookmarkStart w:id="30" w:name="_Toc231156502"/>
-      <w:bookmarkStart w:id="31" w:name="_Toc231210637"/>
+      <w:bookmarkStart w:id="31" w:name="_Toc232626496"/>
       <w:r>
         <w:t>5.1 Evaluation Metrics</w:t>
       </w:r>
@@ -5024,7 +6359,13 @@
         <w:rPr>
           <w:rFonts w:cs="Times New Roman"/>
         </w:rPr>
-        <w:t>Classification performance is measured by precision, recall, F1 score, and AUC-ROC. Recall is prioritised for the failure-precursor class to minimise missed alarms. RUL regression uses RMSE, MAE, and the NASA PHM Prognostics Scoring Function</w:t>
+        <w:t>Classification is measured by precision, recall, F1 score, and AUC-ROC, with recall prioritised to minimise missed alarms</w:t>
+      </w:r>
+      <w:r>
+        <w:rPr>
+          <w:rFonts w:cs="Times New Roman"/>
+        </w:rPr>
+        <w:t>. RUL regression uses RMSE, MAE, and the NASA PHM Prognostics Scoring Function</w:t>
       </w:r>
       <w:r>
         <w:rPr>
@@ -5068,7 +6409,7 @@
         <w:pStyle w:val="Heading2"/>
       </w:pPr>
       <w:bookmarkStart w:id="32" w:name="_Toc231156503"/>
-      <w:bookmarkStart w:id="33" w:name="_Toc231210638"/>
+      <w:bookmarkStart w:id="33" w:name="_Toc232626497"/>
       <w:r>
         <w:t>5.2 Cross-Validation Strategy</w:t>
       </w:r>
@@ -5086,7 +6427,13 @@
         <w:rPr>
           <w:rFonts w:cs="Times New Roman"/>
         </w:rPr>
-        <w:t>Standard k-fold cross-validation is unsuitable for time-series as it violates temporal ordering. A walk-forward scheme is used: five chronological folds are trained sequentially on all prior folds. Leave-one-machine-out (LOMO) evaluation additionally tests generalisation to unseen machines</w:t>
+        <w:t>Standard k-fold cross-validation is unsuitable for time series, so a walk-forward scheme of five chronological folds is used</w:t>
+      </w:r>
+      <w:r>
+        <w:rPr>
+          <w:rFonts w:cs="Times New Roman"/>
+        </w:rPr>
+        <w:t>. Leave-one-machine-out (LOMO) evaluation additionally tests generalisation to unseen machines</w:t>
       </w:r>
       <w:r>
         <w:rPr>
@@ -5100,7 +6447,7 @@
         <w:pStyle w:val="Heading2"/>
       </w:pPr>
       <w:bookmarkStart w:id="34" w:name="_Toc231156504"/>
-      <w:bookmarkStart w:id="35" w:name="_Toc231210639"/>
+      <w:bookmarkStart w:id="35" w:name="_Toc232626498"/>
       <w:r>
         <w:t>5.3 Comparison Criteria</w:t>
       </w:r>
@@ -5118,7 +6465,19 @@
         <w:rPr>
           <w:rFonts w:cs="Times New Roman"/>
         </w:rPr>
-        <w:t xml:space="preserve">Both models share identical preprocessing pipelines and data splits. Hyperparameters are tuned independently via Bayesian optimisation (50 trials) on the validation fold, using the Adam optimiser with early stopping (max 200 epochs). </w:t>
+        <w:t xml:space="preserve">Both models share identical preprocessing pipelines and data splits. </w:t>
+      </w:r>
+      <w:r>
+        <w:rPr>
+          <w:rFonts w:cs="Times New Roman"/>
+        </w:rPr>
+        <w:t>Hyperparameters are tuned via Bayesian optimisation (50 trials) using the Adam optimiser with early stopping (max 200 epochs).</w:t>
+      </w:r>
+      <w:r>
+        <w:rPr>
+          <w:rFonts w:cs="Times New Roman"/>
+        </w:rPr>
+        <w:t xml:space="preserve"> </w:t>
       </w:r>
       <w:r>
         <w:rPr>
@@ -5135,11 +6494,21 @@
       <w:r>
         <w:t xml:space="preserve">Table </w:t>
       </w:r>
-      <w:fldSimple w:instr=" SEQ Table \* ARABIC ">
-        <w:r>
-          <w:t>3</w:t>
-        </w:r>
-      </w:fldSimple>
+      <w:r>
+        <w:fldChar w:fldCharType="begin"/>
+      </w:r>
+      <w:r>
+        <w:instrText xml:space="preserve"> SEQ Table \* ARABIC </w:instrText>
+      </w:r>
+      <w:r>
+        <w:fldChar w:fldCharType="separate"/>
+      </w:r>
+      <w:r>
+        <w:t>3</w:t>
+      </w:r>
+      <w:r>
+        <w:fldChar w:fldCharType="end"/>
+      </w:r>
       <w:r>
         <w:t>: Experimental Design Summary</w:t>
       </w:r>
@@ -5619,7 +6988,6 @@
               <w:rPr>
                 <w:rFonts w:cs="Times New Roman"/>
               </w:rPr>
-              <w:lastRenderedPageBreak/>
               <w:t>Metrics</w:t>
             </w:r>
           </w:p>
@@ -5721,6 +7089,7 @@
               <w:rPr>
                 <w:rFonts w:cs="Times New Roman"/>
               </w:rPr>
+              <w:lastRenderedPageBreak/>
               <w:t>Hyperparameter search</w:t>
             </w:r>
           </w:p>
@@ -6022,7 +7391,7 @@
         <w:pStyle w:val="Heading1"/>
       </w:pPr>
       <w:bookmarkStart w:id="37" w:name="_Toc231156505"/>
-      <w:bookmarkStart w:id="38" w:name="_Toc231210640"/>
+      <w:bookmarkStart w:id="38" w:name="_Toc232626499"/>
       <w:r>
         <w:lastRenderedPageBreak/>
         <w:t>6. Critical Analysis: Interpretability, Scalability, and Deployment</w:t>
@@ -6035,7 +7404,7 @@
         <w:pStyle w:val="Heading2"/>
       </w:pPr>
       <w:bookmarkStart w:id="39" w:name="_Toc231156506"/>
-      <w:bookmarkStart w:id="40" w:name="_Toc231210641"/>
+      <w:bookmarkStart w:id="40" w:name="_Toc232626500"/>
       <w:r>
         <w:t>6.1 Interpretability</w:t>
       </w:r>
@@ -6053,43 +7422,43 @@
         <w:rPr>
           <w:rFonts w:cs="Times New Roman"/>
         </w:rPr>
-        <w:t>Interpretability is critical in safety-sensitive manufacturing, where engineers must act on model outputs with confidence. Tree-based ensembles (Random Forest, Gradient Boosting) offer inherent transparency through feature importance scores mappable to engineering variables such as bearing temperature or vibration RMS (Rezk et al., 202</w:t>
-      </w:r>
-      <w:r>
-        <w:rPr>
-          <w:rFonts w:cs="Times New Roman"/>
-        </w:rPr>
-        <w:t>5</w:t>
-      </w:r>
-      <w:r>
-        <w:rPr>
-          <w:rFonts w:cs="Times New Roman"/>
-        </w:rPr>
-        <w:t>). LSTM and TCN internal representations</w:t>
-      </w:r>
-      <w:r>
-        <w:rPr>
-          <w:rFonts w:cs="Times New Roman"/>
-        </w:rPr>
-        <w:t xml:space="preserve"> </w:t>
-      </w:r>
-      <w:r>
-        <w:rPr>
-          <w:rFonts w:cs="Times New Roman"/>
-        </w:rPr>
-        <w:t>hidden states, convolutional filters</w:t>
-      </w:r>
-      <w:r>
-        <w:rPr>
-          <w:rFonts w:cs="Times New Roman"/>
-        </w:rPr>
-        <w:t xml:space="preserve"> </w:t>
-      </w:r>
-      <w:r>
-        <w:rPr>
-          <w:rFonts w:cs="Times New Roman"/>
-        </w:rPr>
-        <w:t>have no direct physical interpretation, embodying the classical deep learning black-box problem.</w:t>
+        <w:t xml:space="preserve">Interpretability is critical in safety-sensitive manufacturing, where engineers must act on model outputs with confidence. </w:t>
+      </w:r>
+      <w:r>
+        <w:rPr>
+          <w:rFonts w:cs="Times New Roman"/>
+        </w:rPr>
+        <w:t>Tree-based ensembles offer inherent transparency through feature importance scores mappable to engineering variables such as bearing temperature (</w:t>
+      </w:r>
+      <w:r>
+        <w:rPr>
+          <w:rFonts w:cs="Times New Roman"/>
+        </w:rPr>
+        <w:t>Varalakshmi and Kumar, 2025</w:t>
+      </w:r>
+      <w:r>
+        <w:rPr>
+          <w:rFonts w:cs="Times New Roman"/>
+        </w:rPr>
+        <w:t>)</w:t>
+      </w:r>
+      <w:r>
+        <w:rPr>
+          <w:rFonts w:cs="Times New Roman"/>
+        </w:rPr>
+        <w:t xml:space="preserve">. </w:t>
+      </w:r>
+      <w:r>
+        <w:rPr>
+          <w:rFonts w:cs="Times New Roman"/>
+        </w:rPr>
+        <w:t>LSTM and TCN internal representations have no direct physical interpretation, embodying the classical deep learning black-box problem</w:t>
+      </w:r>
+      <w:r>
+        <w:rPr>
+          <w:rFonts w:cs="Times New Roman"/>
+        </w:rPr>
+        <w:t>.</w:t>
       </w:r>
     </w:p>
     <w:p>
@@ -6097,7 +7466,7 @@
         <w:pStyle w:val="Heading2"/>
       </w:pPr>
       <w:bookmarkStart w:id="41" w:name="_Toc231156507"/>
-      <w:bookmarkStart w:id="42" w:name="_Toc231210642"/>
+      <w:bookmarkStart w:id="42" w:name="_Toc232626501"/>
       <w:r>
         <w:t>6.2 Scalability</w:t>
       </w:r>
@@ -6115,7 +7484,19 @@
         <w:rPr>
           <w:rFonts w:cs="Times New Roman"/>
         </w:rPr>
-        <w:t>LSTM’s sequential computation scales poorly with fleet size: training time grows super-linearly as more machines are instrumented, demanding dedicated GPU infrastructure for periodic retraining. TCNs benefit from full parallelisation; their fixed receptive field also means memory does not grow with sequence length as LSTM hidden states do</w:t>
+        <w:t>LSTM's sequential computation scales poorly with fleet size, as training time grows super-linearly, demanding dedicated GPU infrastructure for periodic retraining</w:t>
+      </w:r>
+      <w:r>
+        <w:rPr>
+          <w:rFonts w:cs="Times New Roman"/>
+        </w:rPr>
+        <w:t>.</w:t>
+      </w:r>
+      <w:r>
+        <w:rPr>
+          <w:rFonts w:cs="Times New Roman"/>
+        </w:rPr>
+        <w:t xml:space="preserve"> TCNs benefit from full parallelisation; their fixed receptive field also means memory does not grow with sequence length as LSTM hidden states do</w:t>
       </w:r>
       <w:r>
         <w:rPr>
@@ -6127,7 +7508,19 @@
         <w:rPr>
           <w:rFonts w:cs="Times New Roman"/>
         </w:rPr>
-        <w:t>Both architectures support federated learning across edge devices, essential for multi-site deployments with bandwidth or privacy constraints (Alotaibi and Aly, 2025)</w:t>
+        <w:t>Both support federated learning across edge devices, essential for multi-site deployments with bandwidth or privacy constraints (</w:t>
+      </w:r>
+      <w:r>
+        <w:rPr>
+          <w:rFonts w:cs="Times New Roman"/>
+        </w:rPr>
+        <w:t>Aly and Alotaibi, 2025</w:t>
+      </w:r>
+      <w:r>
+        <w:rPr>
+          <w:rFonts w:cs="Times New Roman"/>
+        </w:rPr>
+        <w:t>)</w:t>
       </w:r>
       <w:r>
         <w:rPr>
@@ -6139,7 +7532,27 @@
         <w:rPr>
           <w:rFonts w:cs="Times New Roman"/>
         </w:rPr>
-        <w:t>Model versioning pipelines must include distribution-drift monitoring to detect silent degradation as operating conditions evolve (Sai and Madhavi, 2024).</w:t>
+        <w:t>Model versioning pipelines must include distribution-drift monitoring to detect silent degradation as operating conditions evolve (</w:t>
+      </w:r>
+      <w:proofErr w:type="spellStart"/>
+      <w:r>
+        <w:rPr>
+          <w:rFonts w:cs="Times New Roman"/>
+        </w:rPr>
+        <w:t>Elkateb</w:t>
+      </w:r>
+      <w:proofErr w:type="spellEnd"/>
+      <w:r>
+        <w:rPr>
+          <w:rFonts w:cs="Times New Roman"/>
+        </w:rPr>
+        <w:t xml:space="preserve"> et al., 2024</w:t>
+      </w:r>
+      <w:r>
+        <w:rPr>
+          <w:rFonts w:cs="Times New Roman"/>
+        </w:rPr>
+        <w:t>).</w:t>
       </w:r>
     </w:p>
     <w:p>
@@ -6147,7 +7560,7 @@
         <w:pStyle w:val="Heading2"/>
       </w:pPr>
       <w:bookmarkStart w:id="43" w:name="_Toc231156508"/>
-      <w:bookmarkStart w:id="44" w:name="_Toc231210643"/>
+      <w:bookmarkStart w:id="44" w:name="_Toc232626502"/>
       <w:r>
         <w:t>6.3 Deployment</w:t>
       </w:r>
@@ -6165,7 +7578,31 @@
         <w:rPr>
           <w:rFonts w:cs="Times New Roman"/>
         </w:rPr>
-        <w:t xml:space="preserve">Live deployment requires sub-100ms inference latency for real-time pump and motor anomaly detection. TCN models export cleanly to ONNX and run efficiently on edge accelerators (NVIDIA Jetson, Intel Movidius), whereas LSTM’s stateful computation complicates on-device execution and typically requires INT8 quantisation at the cost of minor accuracy loss (Sai and Madhavi, 2024). </w:t>
+        <w:t xml:space="preserve">Live deployment requires sub-100ms inference latency for real-time pump and motor anomaly detection. </w:t>
+      </w:r>
+      <w:r>
+        <w:rPr>
+          <w:rFonts w:cs="Times New Roman"/>
+        </w:rPr>
+        <w:t>TCN models export cleanly to ONNX and run efficiently on edge accelerators, whereas LSTM's stateful computation complicates on-device execution and typically requires INT8 quantisation (</w:t>
+      </w:r>
+      <w:r>
+        <w:rPr>
+          <w:rFonts w:cs="Times New Roman"/>
+        </w:rPr>
+        <w:t>Aly and Alotaibi, 2025</w:t>
+      </w:r>
+      <w:r>
+        <w:rPr>
+          <w:rFonts w:cs="Times New Roman"/>
+        </w:rPr>
+        <w:t>).</w:t>
+      </w:r>
+      <w:r>
+        <w:rPr>
+          <w:rFonts w:cs="Times New Roman"/>
+        </w:rPr>
+        <w:t xml:space="preserve"> </w:t>
       </w:r>
       <w:r>
         <w:rPr>
@@ -6177,21 +7614,67 @@
         <w:rPr>
           <w:rFonts w:cs="Times New Roman"/>
         </w:rPr>
-        <w:t xml:space="preserve"> Model drift, arising from sensor calibration changes, machine refurbishments, or load shifts, demands a ground-truth feedback loop logging actual failures against predictions. Kullback–Leibler </w:t>
-      </w:r>
-      <w:r>
-        <w:rPr>
-          <w:rFonts w:cs="Times New Roman"/>
-        </w:rPr>
-        <w:t>divergence drift detection with incremental fine-tuning mitigates catastrophic forgetting (Sai and Madhavi, 2024).</w:t>
-      </w:r>
+        <w:t xml:space="preserve"> </w:t>
+      </w:r>
+      <w:r>
+        <w:rPr>
+          <w:rFonts w:cs="Times New Roman"/>
+        </w:rPr>
+        <w:t>Model drift, arising from sensor calibration changes or load shifts, demands a ground-truth feedback loop logging actual failures against predictions</w:t>
+      </w:r>
+      <w:r>
+        <w:rPr>
+          <w:rFonts w:cs="Times New Roman"/>
+        </w:rPr>
+        <w:t xml:space="preserve">. </w:t>
+      </w:r>
+      <w:proofErr w:type="spellStart"/>
+      <w:r>
+        <w:rPr>
+          <w:rFonts w:cs="Times New Roman"/>
+        </w:rPr>
+        <w:t>Kullback</w:t>
+      </w:r>
+      <w:proofErr w:type="spellEnd"/>
+      <w:r>
+        <w:rPr>
+          <w:rFonts w:cs="Times New Roman"/>
+        </w:rPr>
+        <w:t xml:space="preserve">–Leibler </w:t>
+      </w:r>
+      <w:r>
+        <w:rPr>
+          <w:rFonts w:cs="Times New Roman"/>
+        </w:rPr>
+        <w:t>divergence drift detection with incremental fine-tuning mitigates catastrophic forgetting (</w:t>
+      </w:r>
+      <w:r>
+        <w:rPr>
+          <w:rFonts w:cs="Times New Roman"/>
+        </w:rPr>
+        <w:t>Varalakshmi and Kumar, 2025</w:t>
+      </w:r>
+      <w:r>
+        <w:rPr>
+          <w:rFonts w:cs="Times New Roman"/>
+        </w:rPr>
+        <w:t>).</w:t>
+      </w:r>
+    </w:p>
+    <w:p>
+      <w:pPr>
+        <w:spacing w:before="240" w:line="360" w:lineRule="auto"/>
+        <w:rPr>
+          <w:rFonts w:cs="Times New Roman"/>
+        </w:rPr>
+      </w:pPr>
     </w:p>
     <w:p>
       <w:pPr>
         <w:pStyle w:val="Heading1"/>
       </w:pPr>
       <w:bookmarkStart w:id="45" w:name="_Toc231156509"/>
-      <w:bookmarkStart w:id="46" w:name="_Toc231210644"/>
+      <w:bookmarkStart w:id="46" w:name="_Toc232626503"/>
       <w:r>
         <w:lastRenderedPageBreak/>
         <w:t>7. Concluding Remarks</w:t>
@@ -6210,31 +7693,33 @@
         <w:rPr>
           <w:rFonts w:cs="Times New Roman"/>
         </w:rPr>
-        <w:t>This essay has critically examined AI-based PdM for smart manufacturing, synthesising twelve sources from 2021–2025. Deep learning</w:t>
-      </w:r>
-      <w:r>
-        <w:rPr>
-          <w:rFonts w:cs="Times New Roman"/>
-        </w:rPr>
-        <w:t xml:space="preserve"> </w:t>
-      </w:r>
-      <w:r>
-        <w:rPr>
-          <w:rFonts w:cs="Times New Roman"/>
-        </w:rPr>
-        <w:t>particularly LSTM, TCN, and hybrid architectures</w:t>
-      </w:r>
-      <w:r>
-        <w:rPr>
-          <w:rFonts w:cs="Times New Roman"/>
-        </w:rPr>
-        <w:t xml:space="preserve"> </w:t>
-      </w:r>
-      <w:r>
-        <w:rPr>
-          <w:rFonts w:cs="Times New Roman"/>
-        </w:rPr>
-        <w:t>dominates the field, with C-MAPSS and PRONOSTIA as principal benchmarks. Key gaps remain: scarce labelled failure data, poor cross-machine generalisation, and under-addressed edge deployment challenges.</w:t>
+        <w:t xml:space="preserve">This essay has critically examined AI-based </w:t>
+      </w:r>
+      <w:proofErr w:type="spellStart"/>
+      <w:r>
+        <w:rPr>
+          <w:rFonts w:cs="Times New Roman"/>
+        </w:rPr>
+        <w:t>PdM</w:t>
+      </w:r>
+      <w:proofErr w:type="spellEnd"/>
+      <w:r>
+        <w:rPr>
+          <w:rFonts w:cs="Times New Roman"/>
+        </w:rPr>
+        <w:t xml:space="preserve"> for smart manufacturing, synthesising twelve sources from 2021–2025. Deep learning dominates the field, with C-MAPSS and PRONOSTIA as principal benchmarks</w:t>
+      </w:r>
+      <w:r>
+        <w:rPr>
+          <w:rFonts w:cs="Times New Roman"/>
+        </w:rPr>
+        <w:t xml:space="preserve">. </w:t>
+      </w:r>
+      <w:r>
+        <w:rPr>
+          <w:rFonts w:cs="Times New Roman"/>
+        </w:rPr>
+        <w:t>Key gaps remain: scarce labelled failure data, poor cross-machine generalisation, and under-addressed edge deployment challenges.</w:t>
       </w:r>
     </w:p>
     <w:p>
@@ -6248,13 +7733,13 @@
         <w:rPr>
           <w:rFonts w:cs="Times New Roman"/>
         </w:rPr>
-        <w:t>LSTM provides a well-validated baseline; TCN offers parallelism and edge-friendliness. Scalability favours TCNs; interpretability is a shared limitation addressed through SHAP and LIME; deployment demands drift monitoring and SCADA integration.</w:t>
-      </w:r>
-      <w:r>
-        <w:rPr>
-          <w:rFonts w:cs="Times New Roman"/>
-        </w:rPr>
-        <w:t xml:space="preserve"> </w:t>
+        <w:t>LSTM provides a well-validated baseline; TCN offers parallelism and edge-friendliness. Scalability favours TCNs, interpretability remains a shared limitation, and deployment demands drift monitoring and SCADA integration</w:t>
+      </w:r>
+      <w:r>
+        <w:rPr>
+          <w:rFonts w:cs="Times New Roman"/>
+        </w:rPr>
+        <w:t xml:space="preserve">. </w:t>
       </w:r>
       <w:r>
         <w:rPr>
@@ -6281,14 +7766,64 @@
       <w:pPr>
         <w:pStyle w:val="Heading1"/>
       </w:pPr>
-      <w:bookmarkStart w:id="47" w:name="_Toc231156510"/>
-      <w:bookmarkStart w:id="48" w:name="_Toc231210645"/>
+      <w:bookmarkStart w:id="47" w:name="_Toc232402496"/>
+      <w:bookmarkStart w:id="48" w:name="_Toc232626504"/>
+      <w:r>
+        <w:lastRenderedPageBreak/>
+        <w:t>Acknowledgement</w:t>
+      </w:r>
+      <w:bookmarkEnd w:id="47"/>
+      <w:bookmarkEnd w:id="48"/>
+    </w:p>
+    <w:p>
+      <w:pPr>
+        <w:spacing w:before="240" w:line="360" w:lineRule="auto"/>
+      </w:pPr>
+      <w:r>
+        <w:t>Perplexity AI was used in the preparation of this report to support literature searching, identify potentially relevant academic sources, and assist with grammar correction and word-limit reduction during editing. All sources included in the reference list were checked by the author and cited as the original academic works rather than citing Perplexity AI as a source. The analysis, interpretation, discussion, and final written content submitted in this report are the author’s own work and responsibility.</w:t>
+      </w:r>
+    </w:p>
+    <w:p>
+      <w:pPr>
+        <w:spacing w:before="240" w:line="360" w:lineRule="auto"/>
+        <w:rPr>
+          <w:rFonts w:cs="Times New Roman"/>
+        </w:rPr>
+      </w:pPr>
+    </w:p>
+    <w:p>
+      <w:pPr>
+        <w:spacing w:after="160"/>
+        <w:jc w:val="left"/>
+        <w:rPr>
+          <w:rFonts w:cs="Times New Roman"/>
+        </w:rPr>
+      </w:pPr>
+      <w:r>
+        <w:rPr>
+          <w:rFonts w:cs="Times New Roman"/>
+        </w:rPr>
+        <w:br w:type="page"/>
+      </w:r>
+    </w:p>
+    <w:p>
+      <w:pPr>
+        <w:pStyle w:val="Heading1"/>
+        <w:tabs>
+          <w:tab w:val="left" w:pos="7875"/>
+        </w:tabs>
+      </w:pPr>
+      <w:bookmarkStart w:id="49" w:name="_Toc231156510"/>
+      <w:bookmarkStart w:id="50" w:name="_Toc232626505"/>
       <w:r>
         <w:lastRenderedPageBreak/>
         <w:t>References</w:t>
       </w:r>
-      <w:bookmarkEnd w:id="47"/>
-      <w:bookmarkEnd w:id="48"/>
+      <w:bookmarkEnd w:id="49"/>
+      <w:bookmarkEnd w:id="50"/>
+      <w:r>
+        <w:tab/>
+      </w:r>
     </w:p>
     <w:p>
       <w:pPr>
@@ -6297,11 +7832,19 @@
           <w:rFonts w:cs="Times New Roman"/>
         </w:rPr>
       </w:pPr>
-      <w:r>
-        <w:rPr>
-          <w:rFonts w:cs="Times New Roman"/>
-        </w:rPr>
-        <w:t xml:space="preserve">Aboshosha, A., Haggag, A., George, N., Alotaibi, F., Amin, M. and Hamed, A. (2023) IoT-based data-driven predictive maintenance relying on fuzzy system and artificial neural networks. Scientific Reports, 13, 12186. Available at: </w:t>
+      <w:proofErr w:type="spellStart"/>
+      <w:r>
+        <w:rPr>
+          <w:rFonts w:cs="Times New Roman"/>
+        </w:rPr>
+        <w:t>Aboshosha</w:t>
+      </w:r>
+      <w:proofErr w:type="spellEnd"/>
+      <w:r>
+        <w:rPr>
+          <w:rFonts w:cs="Times New Roman"/>
+        </w:rPr>
+        <w:t xml:space="preserve">, A., Haggag, A., George, N. and Hamad, H.A. (2023) IoT-based data-driven predictive maintenance relying on fuzzy system and artificial neural networks. Scientific Reports, 13, 12186. Available at: </w:t>
       </w:r>
       <w:hyperlink r:id="rId11" w:history="1">
         <w:r>
@@ -6322,7 +7865,7 @@
         <w:rPr>
           <w:rFonts w:cs="Times New Roman"/>
         </w:rPr>
-        <w:t>[Accessed 31 May 2026].</w:t>
+        <w:t>[Accessed 17 June 2026].</w:t>
       </w:r>
     </w:p>
     <w:p>
@@ -6336,7 +7879,7 @@
         <w:rPr>
           <w:rFonts w:cs="Times New Roman"/>
         </w:rPr>
-        <w:t xml:space="preserve">Abdelhedi, K. and Bouri, A. (2025) A TCN-attention fusion model for fault prediction and remaining useful life estimation of large-scale mining equipment. Scientific Reports. Available at: </w:t>
+        <w:t xml:space="preserve">Mao, J., Xu, W., Li, D., Zhu, H. and Yang, F. (2025) A TCN-attention fusion model for fault prediction and remaining useful life estimation of large-scale mining equipment. Scientific Reports. Available at: </w:t>
       </w:r>
       <w:hyperlink r:id="rId12" w:history="1">
         <w:r>
@@ -6357,7 +7900,7 @@
         <w:rPr>
           <w:rFonts w:cs="Times New Roman"/>
         </w:rPr>
-        <w:t>[Accessed 31 May 2026].</w:t>
+        <w:t>[Accessed 17 June 2026].</w:t>
       </w:r>
     </w:p>
     <w:p>
@@ -6371,7 +7914,21 @@
         <w:rPr>
           <w:rFonts w:cs="Times New Roman"/>
         </w:rPr>
-        <w:t xml:space="preserve">Alotaibi, N.M. and Aly, M. (2025) SHAP enhanced transformer GWO boosting model for transparent and robust anomaly detection in IIoT environments. Scientific Reports. Available at: </w:t>
+        <w:t xml:space="preserve">Aly, M. and Alotaibi, N.M. (2025) SHAP enhanced transformer GWO boosting model for transparent and robust anomaly detection in </w:t>
+      </w:r>
+      <w:proofErr w:type="spellStart"/>
+      <w:r>
+        <w:rPr>
+          <w:rFonts w:cs="Times New Roman"/>
+        </w:rPr>
+        <w:t>IIoT</w:t>
+      </w:r>
+      <w:proofErr w:type="spellEnd"/>
+      <w:r>
+        <w:rPr>
+          <w:rFonts w:cs="Times New Roman"/>
+        </w:rPr>
+        <w:t xml:space="preserve"> environments. Scientific Reports, 15, 41037. Available at: </w:t>
       </w:r>
       <w:hyperlink r:id="rId13" w:history="1">
         <w:r>
@@ -6379,7 +7936,21 @@
             <w:rStyle w:val="Hyperlink"/>
             <w:rFonts w:cs="Times New Roman"/>
           </w:rPr>
-          <w:t>https://doi.org/10.1038/s41598-025-25033-0</w:t>
+          <w:t>https://doi.org/10.1038/s41598-025-25033</w:t>
+        </w:r>
+        <w:r>
+          <w:rPr>
+            <w:rStyle w:val="Hyperlink"/>
+            <w:rFonts w:cs="Times New Roman"/>
+          </w:rPr>
+          <w:t>-</w:t>
+        </w:r>
+        <w:r>
+          <w:rPr>
+            <w:rStyle w:val="Hyperlink"/>
+            <w:rFonts w:cs="Times New Roman"/>
+          </w:rPr>
+          <w:t>0</w:t>
         </w:r>
       </w:hyperlink>
       <w:r>
@@ -6392,7 +7963,7 @@
         <w:rPr>
           <w:rFonts w:cs="Times New Roman"/>
         </w:rPr>
-        <w:t>[Accessed 31 May 2026].</w:t>
+        <w:t>[Accessed 17 June 2026].</w:t>
       </w:r>
     </w:p>
     <w:p>
@@ -6402,11 +7973,19 @@
           <w:rFonts w:cs="Times New Roman"/>
         </w:rPr>
       </w:pPr>
-      <w:r>
-        <w:rPr>
-          <w:rFonts w:cs="Times New Roman"/>
-        </w:rPr>
-        <w:t xml:space="preserve">Bampoula, X., Nikolakis, N. and Alexopoulos, K. (2024) Condition monitoring and predictive maintenance of assets in manufacturing using LSTM-autoencoders and transformer encoders. Sensors, 24(10), 3215. Available at: </w:t>
+      <w:proofErr w:type="spellStart"/>
+      <w:r>
+        <w:rPr>
+          <w:rFonts w:cs="Times New Roman"/>
+        </w:rPr>
+        <w:t>Bampoula</w:t>
+      </w:r>
+      <w:proofErr w:type="spellEnd"/>
+      <w:r>
+        <w:rPr>
+          <w:rFonts w:cs="Times New Roman"/>
+        </w:rPr>
+        <w:t xml:space="preserve">, X., Nikolakis, N. and Alexopoulos, K. (2024) Condition monitoring and predictive maintenance of assets in manufacturing using LSTM-autoencoders and transformer encoders. Sensors, 24(10), 3215. Available at: </w:t>
       </w:r>
       <w:hyperlink r:id="rId14" w:history="1">
         <w:r>
@@ -6427,7 +8006,19 @@
         <w:rPr>
           <w:rFonts w:cs="Times New Roman"/>
         </w:rPr>
-        <w:t>[Accessed 31 May 2026].</w:t>
+        <w:t xml:space="preserve">[Accessed </w:t>
+      </w:r>
+      <w:r>
+        <w:rPr>
+          <w:rFonts w:cs="Times New Roman"/>
+        </w:rPr>
+        <w:t>17 June 2026</w:t>
+      </w:r>
+      <w:r>
+        <w:rPr>
+          <w:rFonts w:cs="Times New Roman"/>
+        </w:rPr>
+        <w:t>].</w:t>
       </w:r>
     </w:p>
     <w:p>
@@ -6437,11 +8028,19 @@
           <w:rFonts w:cs="Times New Roman"/>
         </w:rPr>
       </w:pPr>
-      <w:r>
-        <w:rPr>
-          <w:rFonts w:cs="Times New Roman"/>
-        </w:rPr>
-        <w:t xml:space="preserve">Bampoula, X., Siaterlis, G., Nikolakis, N. and Alexopoulos, K. (2021) A deep learning model for predictive maintenance in cyber-physical production systems using LSTM autoencoders. Sensors, 21(3), 972. Available at: </w:t>
+      <w:proofErr w:type="spellStart"/>
+      <w:r>
+        <w:rPr>
+          <w:rFonts w:cs="Times New Roman"/>
+        </w:rPr>
+        <w:t>Bampoula</w:t>
+      </w:r>
+      <w:proofErr w:type="spellEnd"/>
+      <w:r>
+        <w:rPr>
+          <w:rFonts w:cs="Times New Roman"/>
+        </w:rPr>
+        <w:t xml:space="preserve">, X., Siaterlis, G., Nikolakis, N. and Alexopoulos, K. (2021) A deep learning model for predictive maintenance in cyber-physical production systems using LSTM autoencoders. Sensors, 21(3), 972. Available at: </w:t>
       </w:r>
       <w:hyperlink r:id="rId15" w:history="1">
         <w:r>
@@ -6462,7 +8061,19 @@
         <w:rPr>
           <w:rFonts w:cs="Times New Roman"/>
         </w:rPr>
-        <w:t>[Accessed 31 May 2026].</w:t>
+        <w:t xml:space="preserve">[Accessed </w:t>
+      </w:r>
+      <w:r>
+        <w:rPr>
+          <w:rFonts w:cs="Times New Roman"/>
+        </w:rPr>
+        <w:t>17 June 2026</w:t>
+      </w:r>
+      <w:r>
+        <w:rPr>
+          <w:rFonts w:cs="Times New Roman"/>
+        </w:rPr>
+        <w:t>].</w:t>
       </w:r>
     </w:p>
     <w:p>
@@ -6472,11 +8083,47 @@
           <w:rFonts w:cs="Times New Roman"/>
         </w:rPr>
       </w:pPr>
-      <w:r>
-        <w:rPr>
-          <w:rFonts w:cs="Times New Roman"/>
-        </w:rPr>
-        <w:t xml:space="preserve">Elkateb, S., Métwalli, A., Shendy, A. and Abu-Elanien, A.E.B. (2024) Machine learning and IoT-based predictive maintenance approach for industrial applications. Alexandria Engineering Journal, 88, pp.298–309. Available at: </w:t>
+      <w:proofErr w:type="spellStart"/>
+      <w:r>
+        <w:rPr>
+          <w:rFonts w:cs="Times New Roman"/>
+        </w:rPr>
+        <w:t>Elkateb</w:t>
+      </w:r>
+      <w:proofErr w:type="spellEnd"/>
+      <w:r>
+        <w:rPr>
+          <w:rFonts w:cs="Times New Roman"/>
+        </w:rPr>
+        <w:t xml:space="preserve">, S., </w:t>
+      </w:r>
+      <w:proofErr w:type="spellStart"/>
+      <w:r>
+        <w:rPr>
+          <w:rFonts w:cs="Times New Roman"/>
+        </w:rPr>
+        <w:t>Métwalli</w:t>
+      </w:r>
+      <w:proofErr w:type="spellEnd"/>
+      <w:r>
+        <w:rPr>
+          <w:rFonts w:cs="Times New Roman"/>
+        </w:rPr>
+        <w:t xml:space="preserve">, A., </w:t>
+      </w:r>
+      <w:proofErr w:type="spellStart"/>
+      <w:r>
+        <w:rPr>
+          <w:rFonts w:cs="Times New Roman"/>
+        </w:rPr>
+        <w:t>Shendy</w:t>
+      </w:r>
+      <w:proofErr w:type="spellEnd"/>
+      <w:r>
+        <w:rPr>
+          <w:rFonts w:cs="Times New Roman"/>
+        </w:rPr>
+        <w:t xml:space="preserve">, A. and Abu-Elanien, A.E.B. (2024) Machine learning and IoT-based predictive maintenance approach for industrial applications. Alexandria Engineering Journal, 88, pp.298–309. Available at: </w:t>
       </w:r>
       <w:hyperlink r:id="rId16" w:history="1">
         <w:r>
@@ -6484,7 +8131,21 @@
             <w:rStyle w:val="Hyperlink"/>
             <w:rFonts w:cs="Times New Roman"/>
           </w:rPr>
-          <w:t>https://doi.org/10.1016/j.aej.2023.12.065</w:t>
+          <w:t>https://doi.org/10.1016/</w:t>
+        </w:r>
+        <w:r>
+          <w:rPr>
+            <w:rStyle w:val="Hyperlink"/>
+            <w:rFonts w:cs="Times New Roman"/>
+          </w:rPr>
+          <w:t>j</w:t>
+        </w:r>
+        <w:r>
+          <w:rPr>
+            <w:rStyle w:val="Hyperlink"/>
+            <w:rFonts w:cs="Times New Roman"/>
+          </w:rPr>
+          <w:t>.aej.2023.12.065</w:t>
         </w:r>
       </w:hyperlink>
       <w:r>
@@ -6497,7 +8158,19 @@
         <w:rPr>
           <w:rFonts w:cs="Times New Roman"/>
         </w:rPr>
-        <w:t>[Accessed 31 May 2026].</w:t>
+        <w:t xml:space="preserve">[Accessed </w:t>
+      </w:r>
+      <w:r>
+        <w:rPr>
+          <w:rFonts w:cs="Times New Roman"/>
+        </w:rPr>
+        <w:t>17 June 2026</w:t>
+      </w:r>
+      <w:r>
+        <w:rPr>
+          <w:rFonts w:cs="Times New Roman"/>
+        </w:rPr>
+        <w:t>].</w:t>
       </w:r>
     </w:p>
     <w:p>
@@ -6511,7 +8184,7 @@
         <w:rPr>
           <w:rFonts w:cs="Times New Roman"/>
         </w:rPr>
-        <w:t xml:space="preserve">Elsherif, S.M., Hafiz, B., Makhlouf, M.A. and Farouk, O. (2025) A deep learning-based prognostic approach for predicting turbofan engine degradation and remaining useful life. Scientific Reports. Available at: </w:t>
+        <w:t xml:space="preserve">Elsherif, S.M., Hafiz, B., Makhlouf, M.A. and Farouk, O. (2025) A deep learning-based prognostic approach for predicting turbofan engine degradation and remaining useful life. Scientific Reports, 15, 26251. Available at: </w:t>
       </w:r>
       <w:hyperlink r:id="rId17" w:history="1">
         <w:r>
@@ -6532,7 +8205,7 @@
         <w:rPr>
           <w:rFonts w:cs="Times New Roman"/>
         </w:rPr>
-        <w:t>[Accessed 31 May 2026].</w:t>
+        <w:t>[Accessed 17 June 2026].</w:t>
       </w:r>
     </w:p>
     <w:p>
@@ -6546,20 +8219,28 @@
         <w:rPr>
           <w:rFonts w:cs="Times New Roman"/>
         </w:rPr>
-        <w:t>Fatahi, A.T.W.K., Kashyzadeh, K.R. and Ghorbani, S. (2024) Advancements in gas turbine fault detection: a machine learning approach based on the temporal convolutional network–</w:t>
+        <w:t xml:space="preserve">Fahmi, A.-T.W.K., </w:t>
+      </w:r>
+      <w:proofErr w:type="spellStart"/>
+      <w:r>
+        <w:rPr>
+          <w:rFonts w:cs="Times New Roman"/>
+        </w:rPr>
+        <w:t>Kashyzadeh</w:t>
+      </w:r>
+      <w:proofErr w:type="spellEnd"/>
+      <w:r>
+        <w:rPr>
+          <w:rFonts w:cs="Times New Roman"/>
+        </w:rPr>
+        <w:t>, K.R. and Ghorbani, S. (2024) Advancements in gas turbine fault detection: a machine learning approach based on the temporal convolutional network–</w:t>
       </w:r>
       <w:r>
         <w:rPr>
           <w:rFonts w:cs="Times New Roman"/>
         </w:rPr>
         <w:lastRenderedPageBreak/>
-        <w:t>autoencoder model. Applied Sciences, 14(11), 4551. Available at:</w:t>
-      </w:r>
-      <w:r>
-        <w:rPr>
-          <w:rFonts w:cs="Times New Roman"/>
-        </w:rPr>
-        <w:t xml:space="preserve"> </w:t>
+        <w:t xml:space="preserve">autoencoder model. Applied Sciences, 14(11), 4551. Available at: </w:t>
       </w:r>
       <w:hyperlink r:id="rId18" w:history="1">
         <w:r>
@@ -6580,7 +8261,7 @@
         <w:rPr>
           <w:rFonts w:cs="Times New Roman"/>
         </w:rPr>
-        <w:t>[Accessed 31 May 2026].</w:t>
+        <w:t>[Accessed 17 June 2026].</w:t>
       </w:r>
     </w:p>
     <w:p>
@@ -6594,28 +8275,36 @@
         <w:rPr>
           <w:rFonts w:cs="Times New Roman"/>
         </w:rPr>
-        <w:t xml:space="preserve">Pandya, D., Upadhyay, S.H. and Harsha, S.P. (2021) Deep learning-based anomaly-onset aware remaining useful life estimation of bearings. PeerJ Computer Science, 7, e782. Available at: </w:t>
-      </w:r>
-      <w:hyperlink r:id="rId19" w:history="1">
+        <w:t xml:space="preserve">Kamat, P.V., Sugandhi, R. and Kumar, S. (2021) Deep learning-based anomaly-onset aware remaining useful life estimation of bearings. </w:t>
+      </w:r>
+      <w:proofErr w:type="spellStart"/>
+      <w:r>
+        <w:rPr>
+          <w:rFonts w:cs="Times New Roman"/>
+        </w:rPr>
+        <w:t>PeerJ</w:t>
+      </w:r>
+      <w:proofErr w:type="spellEnd"/>
+      <w:r>
+        <w:rPr>
+          <w:rFonts w:cs="Times New Roman"/>
+        </w:rPr>
+        <w:t xml:space="preserve"> Computer Science, 7, e795. Available at: </w:t>
+      </w:r>
+      <w:hyperlink r:id="rId19" w:tgtFrame="_blank" w:history="1">
         <w:r>
           <w:rPr>
             <w:rStyle w:val="Hyperlink"/>
             <w:rFonts w:cs="Times New Roman"/>
           </w:rPr>
-          <w:t>https://doi.org/10.7717/peerj-cs.782</w:t>
+          <w:t>https://doi.org/10.7717/peerj-cs.795</w:t>
         </w:r>
       </w:hyperlink>
       <w:r>
         <w:rPr>
           <w:rFonts w:cs="Times New Roman"/>
         </w:rPr>
-        <w:t xml:space="preserve"> </w:t>
-      </w:r>
-      <w:r>
-        <w:rPr>
-          <w:rFonts w:cs="Times New Roman"/>
-        </w:rPr>
-        <w:t>[Accessed 31 May 2026].</w:t>
+        <w:t> [Accessed 17 June 2026].</w:t>
       </w:r>
     </w:p>
     <w:p>
@@ -6629,7 +8318,7 @@
         <w:rPr>
           <w:rFonts w:cs="Times New Roman"/>
         </w:rPr>
-        <w:t>Rezk, H., Osheba, I.H.M. and Abdelkader, M. (202</w:t>
+        <w:t>Sharma, K. (202</w:t>
       </w:r>
       <w:r>
         <w:rPr>
@@ -6641,97 +8330,23 @@
         <w:rPr>
           <w:rFonts w:cs="Times New Roman"/>
         </w:rPr>
-        <w:t xml:space="preserve">) Optimised predictive maintenance for streaming data in industrial IoT networks using deep reinforcement learning and ensemble techniques. Scientific Reports, 14, 17492. Available at: </w:t>
+        <w:t xml:space="preserve">) Uncertainty-aware deep learning framework for remaining useful life prediction in turbofan engines with learned aleatoric uncertainty. </w:t>
+      </w:r>
+      <w:proofErr w:type="spellStart"/>
+      <w:r>
+        <w:rPr>
+          <w:rFonts w:cs="Times New Roman"/>
+        </w:rPr>
+        <w:t>arXiv</w:t>
+      </w:r>
+      <w:proofErr w:type="spellEnd"/>
+      <w:r>
+        <w:rPr>
+          <w:rFonts w:cs="Times New Roman"/>
+        </w:rPr>
+        <w:t xml:space="preserve"> preprint arXiv:2511.19124. Available at: </w:t>
       </w:r>
       <w:hyperlink r:id="rId20" w:history="1">
-        <w:r>
-          <w:rPr>
-            <w:rStyle w:val="Hyperlink"/>
-            <w:rFonts w:cs="Times New Roman"/>
-          </w:rPr>
-          <w:t>https://doi.org/10.1038/s41598-025-10268-8</w:t>
-        </w:r>
-      </w:hyperlink>
-      <w:r>
-        <w:rPr>
-          <w:rFonts w:cs="Times New Roman"/>
-        </w:rPr>
-        <w:t xml:space="preserve"> </w:t>
-      </w:r>
-      <w:r>
-        <w:rPr>
-          <w:rFonts w:cs="Times New Roman"/>
-        </w:rPr>
-        <w:t>[Accessed 31 May 2026].</w:t>
-      </w:r>
-    </w:p>
-    <w:p>
-      <w:pPr>
-        <w:spacing w:before="240"/>
-        <w:rPr>
-          <w:rFonts w:cs="Times New Roman"/>
-        </w:rPr>
-      </w:pPr>
-      <w:r>
-        <w:rPr>
-          <w:rFonts w:cs="Times New Roman"/>
-        </w:rPr>
-        <w:t>Sai, N.L.R. and Madhavi, K.R. (2024) Edge-cloud synergy for AI-enhanced sensor network data: a real-time predictive maintenance framework. Applied Sciences, 14(24), 11866. Available at:</w:t>
-      </w:r>
-      <w:r>
-        <w:rPr>
-          <w:rFonts w:cs="Times New Roman"/>
-        </w:rPr>
-        <w:t xml:space="preserve"> </w:t>
-      </w:r>
-      <w:hyperlink r:id="rId21" w:history="1">
-        <w:r>
-          <w:rPr>
-            <w:rStyle w:val="Hyperlink"/>
-            <w:rFonts w:cs="Times New Roman"/>
-          </w:rPr>
-          <w:t>https://doi.org/10.3390/app142411866</w:t>
-        </w:r>
-      </w:hyperlink>
-      <w:r>
-        <w:rPr>
-          <w:rFonts w:cs="Times New Roman"/>
-        </w:rPr>
-        <w:t xml:space="preserve"> </w:t>
-      </w:r>
-      <w:r>
-        <w:rPr>
-          <w:rFonts w:cs="Times New Roman"/>
-        </w:rPr>
-        <w:t>[Accessed 31 May 2026].</w:t>
-      </w:r>
-    </w:p>
-    <w:p>
-      <w:pPr>
-        <w:spacing w:before="240"/>
-        <w:rPr>
-          <w:rFonts w:cs="Times New Roman"/>
-        </w:rPr>
-      </w:pPr>
-      <w:r>
-        <w:rPr>
-          <w:rFonts w:cs="Times New Roman"/>
-        </w:rPr>
-        <w:t>Sharma, K. (202</w:t>
-      </w:r>
-      <w:r>
-        <w:rPr>
-          <w:rFonts w:cs="Times New Roman"/>
-        </w:rPr>
-        <w:t>5</w:t>
-      </w:r>
-      <w:r>
-        <w:rPr>
-          <w:rFonts w:cs="Times New Roman"/>
-        </w:rPr>
-        <w:t xml:space="preserve">) Uncertainty-aware deep learning framework for remaining useful life prediction in turbofan engines with learned aleatoric uncertainty. arXiv preprint arXiv:2511.19124. Available at: </w:t>
-      </w:r>
-      <w:hyperlink r:id="rId22" w:history="1">
         <w:r>
           <w:rPr>
             <w:rStyle w:val="Hyperlink"/>
@@ -6750,7 +8365,68 @@
         <w:rPr>
           <w:rFonts w:cs="Times New Roman"/>
         </w:rPr>
-        <w:t>[Accessed 31 May 2026].</w:t>
+        <w:t xml:space="preserve">[Accessed </w:t>
+      </w:r>
+      <w:r>
+        <w:rPr>
+          <w:rFonts w:cs="Times New Roman"/>
+        </w:rPr>
+        <w:t>17 June 2026</w:t>
+      </w:r>
+      <w:r>
+        <w:rPr>
+          <w:rFonts w:cs="Times New Roman"/>
+        </w:rPr>
+        <w:t>].</w:t>
+      </w:r>
+    </w:p>
+    <w:p>
+      <w:pPr>
+        <w:spacing w:before="240" w:line="360" w:lineRule="auto"/>
+        <w:rPr>
+          <w:rFonts w:cs="Times New Roman"/>
+        </w:rPr>
+      </w:pPr>
+      <w:r>
+        <w:rPr>
+          <w:rFonts w:cs="Times New Roman"/>
+        </w:rPr>
+        <w:t xml:space="preserve">Varalakshmi, K. and Kumar, J. (2025) Optimized predictive maintenance for streaming data in industrial IoT networks using deep reinforcement learning and ensemble techniques. Scientific Reports, 15, 27201. Available at: </w:t>
+      </w:r>
+      <w:hyperlink r:id="rId21" w:history="1">
+        <w:r>
+          <w:rPr>
+            <w:rStyle w:val="Hyperlink"/>
+            <w:rFonts w:cs="Times New Roman"/>
+          </w:rPr>
+          <w:t>https://doi.org/10.1038/s41598-0</w:t>
+        </w:r>
+        <w:r>
+          <w:rPr>
+            <w:rStyle w:val="Hyperlink"/>
+            <w:rFonts w:cs="Times New Roman"/>
+          </w:rPr>
+          <w:t>2</w:t>
+        </w:r>
+        <w:r>
+          <w:rPr>
+            <w:rStyle w:val="Hyperlink"/>
+            <w:rFonts w:cs="Times New Roman"/>
+          </w:rPr>
+          <w:t>5-10268-8</w:t>
+        </w:r>
+      </w:hyperlink>
+      <w:r>
+        <w:rPr>
+          <w:rFonts w:cs="Times New Roman"/>
+        </w:rPr>
+        <w:t xml:space="preserve"> </w:t>
+      </w:r>
+      <w:r>
+        <w:rPr>
+          <w:rFonts w:cs="Times New Roman"/>
+        </w:rPr>
+        <w:t>[Accessed 17 June 2026].</w:t>
       </w:r>
     </w:p>
     <w:p>
@@ -6762,7 +8438,7 @@
       </w:pPr>
     </w:p>
     <w:sectPr>
-      <w:footerReference w:type="default" r:id="rId23"/>
+      <w:footerReference w:type="default" r:id="rId22"/>
       <w:type w:val="continuous"/>
       <w:pgSz w:w="11906" w:h="16838" w:code="9"/>
       <w:pgMar w:top="1440" w:right="1440" w:bottom="1440" w:left="1440" w:header="720" w:footer="720" w:gutter="0"/>

</xml_diff>